<commit_message>
Revisado e corrigido os erros dos casos de uso 19, 20, 21
</commit_message>
<xml_diff>
--- a/Requisitos/CSU19 - Validar Restaurante.docx
+++ b/Requisitos/CSU19 - Validar Restaurante.docx
@@ -1,6 +1,6 @@
 
 <file path=word/document.xml><?xml version="1.0" encoding="utf-8"?>
-<w:document xmlns:wpc="http://schemas.microsoft.com/office/word/2010/wordprocessingCanvas" xmlns:cx="http://schemas.microsoft.com/office/drawing/2014/chartex" xmlns:cx1="http://schemas.microsoft.com/office/drawing/2015/9/8/chartex" xmlns:cx2="http://schemas.microsoft.com/office/drawing/2015/10/21/chartex" xmlns:cx3="http://schemas.microsoft.com/office/drawing/2016/5/9/chartex" xmlns:cx4="http://schemas.microsoft.com/office/drawing/2016/5/10/chartex" xmlns:cx5="http://schemas.microsoft.com/office/drawing/2016/5/11/chartex" xmlns:cx6="http://schemas.microsoft.com/office/drawing/2016/5/12/chartex" xmlns:cx7="http://schemas.microsoft.com/office/drawing/2016/5/13/chartex" xmlns:cx8="http://schemas.microsoft.com/office/drawing/2016/5/14/chartex" xmlns:mc="http://schemas.openxmlformats.org/markup-compatibility/2006" xmlns:aink="http://schemas.microsoft.com/office/drawing/2016/ink" xmlns:am3d="http://schemas.microsoft.com/office/drawing/2017/model3d" xmlns:o="urn:schemas-microsoft-com:office:office" xmlns:r="http://schemas.openxmlformats.org/officeDocument/2006/relationships" xmlns:m="http://schemas.openxmlformats.org/officeDocument/2006/math" xmlns:v="urn:schemas-microsoft-com:vml" xmlns:wp14="http://schemas.microsoft.com/office/word/2010/wordprocessingDrawing" xmlns:wp="http://schemas.openxmlformats.org/drawingml/2006/wordprocessingDrawing" xmlns:w10="urn:schemas-microsoft-com:office:word" xmlns:w="http://schemas.openxmlformats.org/wordprocessingml/2006/main" xmlns:w14="http://schemas.microsoft.com/office/word/2010/wordml" xmlns:w15="http://schemas.microsoft.com/office/word/2012/wordml" xmlns:w16cex="http://schemas.microsoft.com/office/word/2018/wordml/cex" xmlns:w16cid="http://schemas.microsoft.com/office/word/2016/wordml/cid" xmlns:w16="http://schemas.microsoft.com/office/word/2018/wordml" xmlns:w16se="http://schemas.microsoft.com/office/word/2015/wordml/symex" xmlns:wpg="http://schemas.microsoft.com/office/word/2010/wordprocessingGroup" xmlns:wpi="http://schemas.microsoft.com/office/word/2010/wordprocessingInk" xmlns:wne="http://schemas.microsoft.com/office/word/2006/wordml" xmlns:wps="http://schemas.microsoft.com/office/word/2010/wordprocessingShape" mc:Ignorable="w14 w15 w16se w16cid w16 w16cex wp14">
+<w:document xmlns:wpc="http://schemas.microsoft.com/office/word/2010/wordprocessingCanvas" xmlns:mc="http://schemas.openxmlformats.org/markup-compatibility/2006" xmlns:o="urn:schemas-microsoft-com:office:office" xmlns:r="http://schemas.openxmlformats.org/officeDocument/2006/relationships" xmlns:m="http://schemas.openxmlformats.org/officeDocument/2006/math" xmlns:v="urn:schemas-microsoft-com:vml" xmlns:wp14="http://schemas.microsoft.com/office/word/2010/wordprocessingDrawing" xmlns:wp="http://schemas.openxmlformats.org/drawingml/2006/wordprocessingDrawing" xmlns:w="http://schemas.openxmlformats.org/wordprocessingml/2006/main" xmlns:w14="http://schemas.microsoft.com/office/word/2010/wordml" xmlns:w10="urn:schemas-microsoft-com:office:word" xmlns:w15="http://schemas.microsoft.com/office/word/2012/wordml" xmlns:wpg="http://schemas.microsoft.com/office/word/2010/wordprocessingGroup" xmlns:wpi="http://schemas.microsoft.com/office/word/2010/wordprocessingInk" xmlns:wne="http://schemas.microsoft.com/office/word/2006/wordml" xmlns:wps="http://schemas.microsoft.com/office/word/2010/wordprocessingShape" xmlns:wpsCustomData="http://www.wps.cn/officeDocument/2013/wpsCustomData" mc:Ignorable="w14 w15 wp14">
   <w:body>
     <w:p>
       <w:pPr>
@@ -18,25 +18,7 @@
           <w:sz w:val="36"/>
           <w:szCs w:val="36"/>
         </w:rPr>
-        <w:t>CSU</w:t>
-      </w:r>
-      <w:r>
-        <w:rPr>
-          <w:b/>
-          <w:color w:val="FF0000"/>
-          <w:sz w:val="36"/>
-          <w:szCs w:val="36"/>
-        </w:rPr>
-        <w:t>19</w:t>
-      </w:r>
-      <w:r>
-        <w:rPr>
-          <w:b/>
-          <w:color w:val="FF0000"/>
-          <w:sz w:val="36"/>
-          <w:szCs w:val="36"/>
-        </w:rPr>
-        <w:t xml:space="preserve">: </w:t>
+        <w:t xml:space="preserve">CSU19: </w:t>
       </w:r>
       <w:r>
         <w:rPr>
@@ -58,7 +40,7 @@
     </w:p>
     <w:p>
       <w:pPr>
-        <w:pStyle w:val="Ttulo1"/>
+        <w:pStyle w:val="2"/>
         <w:numPr>
           <w:ilvl w:val="0"/>
           <w:numId w:val="1"/>
@@ -76,25 +58,38 @@
     </w:p>
     <w:tbl>
       <w:tblPr>
-        <w:tblStyle w:val="ad"/>
+        <w:tblStyle w:val="39"/>
         <w:tblW w:w="10330" w:type="dxa"/>
         <w:tblInd w:w="-70" w:type="dxa"/>
         <w:tblLayout w:type="fixed"/>
-        <w:tblLook w:val="0000" w:firstRow="0" w:lastRow="0" w:firstColumn="0" w:lastColumn="0" w:noHBand="0" w:noVBand="0"/>
+        <w:tblCellMar>
+          <w:top w:w="0" w:type="dxa"/>
+          <w:left w:w="70" w:type="dxa"/>
+          <w:bottom w:w="0" w:type="dxa"/>
+          <w:right w:w="70" w:type="dxa"/>
+        </w:tblCellMar>
       </w:tblPr>
       <w:tblGrid>
         <w:gridCol w:w="2905"/>
         <w:gridCol w:w="7425"/>
       </w:tblGrid>
       <w:tr>
+        <w:tblPrEx>
+          <w:tblCellMar>
+            <w:top w:w="0" w:type="dxa"/>
+            <w:left w:w="70" w:type="dxa"/>
+            <w:bottom w:w="0" w:type="dxa"/>
+            <w:right w:w="70" w:type="dxa"/>
+          </w:tblCellMar>
+        </w:tblPrEx>
         <w:tc>
           <w:tcPr>
             <w:tcW w:w="2905" w:type="dxa"/>
             <w:tcBorders>
-              <w:top w:val="single" w:sz="4" w:space="0" w:color="000000"/>
-              <w:left w:val="single" w:sz="4" w:space="0" w:color="000000"/>
-              <w:bottom w:val="single" w:sz="4" w:space="0" w:color="000000"/>
-              <w:right w:val="single" w:sz="4" w:space="0" w:color="000000"/>
+              <w:top w:val="single" w:color="000000" w:sz="4" w:space="0"/>
+              <w:left w:val="single" w:color="000000" w:sz="4" w:space="0"/>
+              <w:bottom w:val="single" w:color="000000" w:sz="4" w:space="0"/>
+              <w:right w:val="single" w:color="000000" w:sz="4" w:space="0"/>
             </w:tcBorders>
             <w:shd w:val="clear" w:color="auto" w:fill="auto"/>
           </w:tcPr>
@@ -113,16 +108,16 @@
           <w:tcPr>
             <w:tcW w:w="7425" w:type="dxa"/>
             <w:tcBorders>
-              <w:top w:val="single" w:sz="4" w:space="0" w:color="000000"/>
-              <w:left w:val="single" w:sz="4" w:space="0" w:color="000000"/>
-              <w:bottom w:val="single" w:sz="4" w:space="0" w:color="000000"/>
-              <w:right w:val="single" w:sz="4" w:space="0" w:color="000000"/>
-            </w:tcBorders>
-            <w:shd w:val="clear" w:color="auto" w:fill="auto"/>
-          </w:tcPr>
-          <w:p>
-            <w:pPr>
-              <w:pStyle w:val="Ttulo1"/>
+              <w:top w:val="single" w:color="000000" w:sz="4" w:space="0"/>
+              <w:left w:val="single" w:color="000000" w:sz="4" w:space="0"/>
+              <w:bottom w:val="single" w:color="000000" w:sz="4" w:space="0"/>
+              <w:right w:val="single" w:color="000000" w:sz="4" w:space="0"/>
+            </w:tcBorders>
+            <w:shd w:val="clear" w:color="auto" w:fill="auto"/>
+          </w:tcPr>
+          <w:p>
+            <w:pPr>
+              <w:pStyle w:val="2"/>
               <w:numPr>
                 <w:ilvl w:val="0"/>
                 <w:numId w:val="1"/>
@@ -132,35 +127,31 @@
               <w:rPr>
                 <w:b w:val="0"/>
               </w:rPr>
-              <w:t>90</w:t>
-            </w:r>
-            <w:r>
-              <w:rPr>
-                <w:b w:val="0"/>
-              </w:rPr>
-              <w:t>(</w:t>
-            </w:r>
-            <w:r>
-              <w:t xml:space="preserve">Risco Baixo e Prioridade </w:t>
-            </w:r>
-            <w:r>
-              <w:t>Alta</w:t>
-            </w:r>
-            <w:r>
-              <w:t>)</w:t>
+              <w:t>90(</w:t>
+            </w:r>
+            <w:r>
+              <w:t>Risco Baixo e Prioridade Alta)</w:t>
             </w:r>
           </w:p>
         </w:tc>
       </w:tr>
       <w:tr>
+        <w:tblPrEx>
+          <w:tblCellMar>
+            <w:top w:w="0" w:type="dxa"/>
+            <w:left w:w="70" w:type="dxa"/>
+            <w:bottom w:w="0" w:type="dxa"/>
+            <w:right w:w="70" w:type="dxa"/>
+          </w:tblCellMar>
+        </w:tblPrEx>
         <w:tc>
           <w:tcPr>
             <w:tcW w:w="2905" w:type="dxa"/>
             <w:tcBorders>
-              <w:top w:val="single" w:sz="4" w:space="0" w:color="000000"/>
-              <w:left w:val="single" w:sz="4" w:space="0" w:color="000000"/>
-              <w:bottom w:val="single" w:sz="4" w:space="0" w:color="000000"/>
-              <w:right w:val="single" w:sz="4" w:space="0" w:color="000000"/>
+              <w:top w:val="single" w:color="000000" w:sz="4" w:space="0"/>
+              <w:left w:val="single" w:color="000000" w:sz="4" w:space="0"/>
+              <w:bottom w:val="single" w:color="000000" w:sz="4" w:space="0"/>
+              <w:right w:val="single" w:color="000000" w:sz="4" w:space="0"/>
             </w:tcBorders>
             <w:shd w:val="clear" w:color="auto" w:fill="auto"/>
           </w:tcPr>
@@ -179,40 +170,41 @@
           <w:tcPr>
             <w:tcW w:w="7425" w:type="dxa"/>
             <w:tcBorders>
-              <w:top w:val="single" w:sz="4" w:space="0" w:color="000000"/>
-              <w:left w:val="single" w:sz="4" w:space="0" w:color="000000"/>
-              <w:bottom w:val="single" w:sz="4" w:space="0" w:color="000000"/>
-              <w:right w:val="single" w:sz="4" w:space="0" w:color="000000"/>
-            </w:tcBorders>
-            <w:shd w:val="clear" w:color="auto" w:fill="auto"/>
-          </w:tcPr>
-          <w:p>
-            <w:r>
-              <w:rPr>
-                <w:sz w:val="28"/>
-                <w:szCs w:val="28"/>
-              </w:rPr>
-              <w:t xml:space="preserve">O </w:t>
-            </w:r>
-            <w:r>
-              <w:rPr>
-                <w:sz w:val="28"/>
-                <w:szCs w:val="28"/>
-              </w:rPr>
-              <w:t>Administrador pode aceitar ou recusar as solicitações de adesão dos restaurantes</w:t>
+              <w:top w:val="single" w:color="000000" w:sz="4" w:space="0"/>
+              <w:left w:val="single" w:color="000000" w:sz="4" w:space="0"/>
+              <w:bottom w:val="single" w:color="000000" w:sz="4" w:space="0"/>
+              <w:right w:val="single" w:color="000000" w:sz="4" w:space="0"/>
+            </w:tcBorders>
+            <w:shd w:val="clear" w:color="auto" w:fill="auto"/>
+          </w:tcPr>
+          <w:p>
+            <w:r>
+              <w:rPr>
+                <w:sz w:val="28"/>
+                <w:szCs w:val="28"/>
+              </w:rPr>
+              <w:t>O Administrador pode aceitar ou recusar as solicitações de adesão dos restaurantes</w:t>
             </w:r>
           </w:p>
         </w:tc>
       </w:tr>
       <w:tr>
+        <w:tblPrEx>
+          <w:tblCellMar>
+            <w:top w:w="0" w:type="dxa"/>
+            <w:left w:w="70" w:type="dxa"/>
+            <w:bottom w:w="0" w:type="dxa"/>
+            <w:right w:w="70" w:type="dxa"/>
+          </w:tblCellMar>
+        </w:tblPrEx>
         <w:tc>
           <w:tcPr>
             <w:tcW w:w="2905" w:type="dxa"/>
             <w:tcBorders>
-              <w:top w:val="single" w:sz="4" w:space="0" w:color="000000"/>
-              <w:left w:val="single" w:sz="4" w:space="0" w:color="000000"/>
-              <w:bottom w:val="single" w:sz="4" w:space="0" w:color="000000"/>
-              <w:right w:val="single" w:sz="4" w:space="0" w:color="000000"/>
+              <w:top w:val="single" w:color="000000" w:sz="4" w:space="0"/>
+              <w:left w:val="single" w:color="000000" w:sz="4" w:space="0"/>
+              <w:bottom w:val="single" w:color="000000" w:sz="4" w:space="0"/>
+              <w:right w:val="single" w:color="000000" w:sz="4" w:space="0"/>
             </w:tcBorders>
             <w:shd w:val="clear" w:color="auto" w:fill="auto"/>
           </w:tcPr>
@@ -231,10 +223,10 @@
           <w:tcPr>
             <w:tcW w:w="7425" w:type="dxa"/>
             <w:tcBorders>
-              <w:top w:val="single" w:sz="4" w:space="0" w:color="000000"/>
-              <w:left w:val="single" w:sz="4" w:space="0" w:color="000000"/>
-              <w:bottom w:val="single" w:sz="4" w:space="0" w:color="000000"/>
-              <w:right w:val="single" w:sz="4" w:space="0" w:color="000000"/>
+              <w:top w:val="single" w:color="000000" w:sz="4" w:space="0"/>
+              <w:left w:val="single" w:color="000000" w:sz="4" w:space="0"/>
+              <w:bottom w:val="single" w:color="000000" w:sz="4" w:space="0"/>
+              <w:right w:val="single" w:color="000000" w:sz="4" w:space="0"/>
             </w:tcBorders>
             <w:shd w:val="clear" w:color="auto" w:fill="auto"/>
           </w:tcPr>
@@ -250,14 +242,22 @@
         </w:tc>
       </w:tr>
       <w:tr>
+        <w:tblPrEx>
+          <w:tblCellMar>
+            <w:top w:w="0" w:type="dxa"/>
+            <w:left w:w="70" w:type="dxa"/>
+            <w:bottom w:w="0" w:type="dxa"/>
+            <w:right w:w="70" w:type="dxa"/>
+          </w:tblCellMar>
+        </w:tblPrEx>
         <w:tc>
           <w:tcPr>
             <w:tcW w:w="2905" w:type="dxa"/>
             <w:tcBorders>
-              <w:top w:val="single" w:sz="4" w:space="0" w:color="000000"/>
-              <w:left w:val="single" w:sz="4" w:space="0" w:color="000000"/>
-              <w:bottom w:val="single" w:sz="4" w:space="0" w:color="000000"/>
-              <w:right w:val="single" w:sz="4" w:space="0" w:color="000000"/>
+              <w:top w:val="single" w:color="000000" w:sz="4" w:space="0"/>
+              <w:left w:val="single" w:color="000000" w:sz="4" w:space="0"/>
+              <w:bottom w:val="single" w:color="000000" w:sz="4" w:space="0"/>
+              <w:right w:val="single" w:color="000000" w:sz="4" w:space="0"/>
             </w:tcBorders>
             <w:shd w:val="clear" w:color="auto" w:fill="auto"/>
           </w:tcPr>
@@ -276,10 +276,10 @@
           <w:tcPr>
             <w:tcW w:w="7425" w:type="dxa"/>
             <w:tcBorders>
-              <w:top w:val="single" w:sz="4" w:space="0" w:color="000000"/>
-              <w:left w:val="single" w:sz="4" w:space="0" w:color="000000"/>
-              <w:bottom w:val="single" w:sz="4" w:space="0" w:color="000000"/>
-              <w:right w:val="single" w:sz="4" w:space="0" w:color="000000"/>
+              <w:top w:val="single" w:color="000000" w:sz="4" w:space="0"/>
+              <w:left w:val="single" w:color="000000" w:sz="4" w:space="0"/>
+              <w:bottom w:val="single" w:color="000000" w:sz="4" w:space="0"/>
+              <w:right w:val="single" w:color="000000" w:sz="4" w:space="0"/>
             </w:tcBorders>
             <w:shd w:val="clear" w:color="auto" w:fill="auto"/>
           </w:tcPr>
@@ -295,14 +295,22 @@
         </w:tc>
       </w:tr>
       <w:tr>
+        <w:tblPrEx>
+          <w:tblCellMar>
+            <w:top w:w="0" w:type="dxa"/>
+            <w:left w:w="70" w:type="dxa"/>
+            <w:bottom w:w="0" w:type="dxa"/>
+            <w:right w:w="70" w:type="dxa"/>
+          </w:tblCellMar>
+        </w:tblPrEx>
         <w:tc>
           <w:tcPr>
             <w:tcW w:w="2905" w:type="dxa"/>
             <w:tcBorders>
-              <w:top w:val="single" w:sz="4" w:space="0" w:color="000000"/>
-              <w:left w:val="single" w:sz="4" w:space="0" w:color="000000"/>
-              <w:bottom w:val="single" w:sz="4" w:space="0" w:color="000000"/>
-              <w:right w:val="single" w:sz="4" w:space="0" w:color="000000"/>
+              <w:top w:val="single" w:color="000000" w:sz="4" w:space="0"/>
+              <w:left w:val="single" w:color="000000" w:sz="4" w:space="0"/>
+              <w:bottom w:val="single" w:color="000000" w:sz="4" w:space="0"/>
+              <w:right w:val="single" w:color="000000" w:sz="4" w:space="0"/>
             </w:tcBorders>
             <w:shd w:val="clear" w:color="auto" w:fill="auto"/>
           </w:tcPr>
@@ -321,10 +329,10 @@
           <w:tcPr>
             <w:tcW w:w="7425" w:type="dxa"/>
             <w:tcBorders>
-              <w:top w:val="single" w:sz="4" w:space="0" w:color="000000"/>
-              <w:left w:val="single" w:sz="4" w:space="0" w:color="000000"/>
-              <w:bottom w:val="single" w:sz="4" w:space="0" w:color="000000"/>
-              <w:right w:val="single" w:sz="4" w:space="0" w:color="000000"/>
+              <w:top w:val="single" w:color="000000" w:sz="4" w:space="0"/>
+              <w:left w:val="single" w:color="000000" w:sz="4" w:space="0"/>
+              <w:bottom w:val="single" w:color="000000" w:sz="4" w:space="0"/>
+              <w:right w:val="single" w:color="000000" w:sz="4" w:space="0"/>
             </w:tcBorders>
             <w:shd w:val="clear" w:color="auto" w:fill="auto"/>
           </w:tcPr>
@@ -358,8 +366,7 @@
                 <w:sz w:val="28"/>
                 <w:szCs w:val="28"/>
               </w:rPr>
-              <w:br/>
-              <w:t>CSU0</w:t>
+              <w:br w:type="textWrapping"/>
             </w:r>
             <w:r>
               <w:rPr>
@@ -367,39 +374,7 @@
                 <w:sz w:val="28"/>
                 <w:szCs w:val="28"/>
               </w:rPr>
-              <w:t>2</w:t>
-            </w:r>
-            <w:r>
-              <w:rPr>
-                <w:color w:val="FF0000"/>
-                <w:sz w:val="28"/>
-                <w:szCs w:val="28"/>
-              </w:rPr>
-              <w:t>-</w:t>
-            </w:r>
-            <w:r>
-              <w:rPr>
-                <w:color w:val="FF0000"/>
-                <w:sz w:val="28"/>
-                <w:szCs w:val="28"/>
-              </w:rPr>
-              <w:t>Autenticar</w:t>
-            </w:r>
-            <w:r>
-              <w:rPr>
-                <w:color w:val="FF0000"/>
-                <w:sz w:val="28"/>
-                <w:szCs w:val="28"/>
-              </w:rPr>
-              <w:t xml:space="preserve"> </w:t>
-            </w:r>
-            <w:r>
-              <w:rPr>
-                <w:color w:val="FF0000"/>
-                <w:sz w:val="28"/>
-                <w:szCs w:val="28"/>
-              </w:rPr>
-              <w:t>Usuário</w:t>
+              <w:t>CSU02-Autenticar Usuário</w:t>
             </w:r>
             <w:r>
               <w:rPr>
@@ -412,14 +387,22 @@
         </w:tc>
       </w:tr>
       <w:tr>
+        <w:tblPrEx>
+          <w:tblCellMar>
+            <w:top w:w="0" w:type="dxa"/>
+            <w:left w:w="70" w:type="dxa"/>
+            <w:bottom w:w="0" w:type="dxa"/>
+            <w:right w:w="70" w:type="dxa"/>
+          </w:tblCellMar>
+        </w:tblPrEx>
         <w:tc>
           <w:tcPr>
             <w:tcW w:w="2905" w:type="dxa"/>
             <w:tcBorders>
-              <w:top w:val="single" w:sz="4" w:space="0" w:color="000000"/>
-              <w:left w:val="single" w:sz="4" w:space="0" w:color="000000"/>
-              <w:bottom w:val="single" w:sz="4" w:space="0" w:color="000000"/>
-              <w:right w:val="single" w:sz="4" w:space="0" w:color="000000"/>
+              <w:top w:val="single" w:color="000000" w:sz="4" w:space="0"/>
+              <w:left w:val="single" w:color="000000" w:sz="4" w:space="0"/>
+              <w:bottom w:val="single" w:color="000000" w:sz="4" w:space="0"/>
+              <w:right w:val="single" w:color="000000" w:sz="4" w:space="0"/>
             </w:tcBorders>
             <w:shd w:val="clear" w:color="auto" w:fill="auto"/>
           </w:tcPr>
@@ -438,10 +421,10 @@
           <w:tcPr>
             <w:tcW w:w="7425" w:type="dxa"/>
             <w:tcBorders>
-              <w:top w:val="single" w:sz="4" w:space="0" w:color="000000"/>
-              <w:left w:val="single" w:sz="4" w:space="0" w:color="000000"/>
-              <w:bottom w:val="single" w:sz="4" w:space="0" w:color="000000"/>
-              <w:right w:val="single" w:sz="4" w:space="0" w:color="000000"/>
+              <w:top w:val="single" w:color="000000" w:sz="4" w:space="0"/>
+              <w:left w:val="single" w:color="000000" w:sz="4" w:space="0"/>
+              <w:bottom w:val="single" w:color="000000" w:sz="4" w:space="0"/>
+              <w:right w:val="single" w:color="000000" w:sz="4" w:space="0"/>
             </w:tcBorders>
             <w:shd w:val="clear" w:color="auto" w:fill="auto"/>
           </w:tcPr>
@@ -457,25 +440,33 @@
         </w:tc>
       </w:tr>
       <w:tr>
+        <w:tblPrEx>
+          <w:tblCellMar>
+            <w:top w:w="0" w:type="dxa"/>
+            <w:left w:w="70" w:type="dxa"/>
+            <w:bottom w:w="0" w:type="dxa"/>
+            <w:right w:w="70" w:type="dxa"/>
+          </w:tblCellMar>
+        </w:tblPrEx>
         <w:trPr>
           <w:cantSplit/>
-          <w:trHeight w:val="422"/>
+          <w:trHeight w:val="422" w:hRule="atLeast"/>
         </w:trPr>
         <w:tc>
           <w:tcPr>
             <w:tcW w:w="10330" w:type="dxa"/>
             <w:gridSpan w:val="2"/>
             <w:tcBorders>
-              <w:top w:val="single" w:sz="4" w:space="0" w:color="000000"/>
-              <w:left w:val="single" w:sz="4" w:space="0" w:color="000000"/>
-              <w:bottom w:val="single" w:sz="4" w:space="0" w:color="000000"/>
-              <w:right w:val="single" w:sz="4" w:space="0" w:color="000000"/>
-            </w:tcBorders>
-            <w:shd w:val="clear" w:color="auto" w:fill="auto"/>
-          </w:tcPr>
-          <w:p>
-            <w:pPr>
-              <w:pStyle w:val="Ttulo2"/>
+              <w:top w:val="single" w:color="000000" w:sz="4" w:space="0"/>
+              <w:left w:val="single" w:color="000000" w:sz="4" w:space="0"/>
+              <w:bottom w:val="single" w:color="000000" w:sz="4" w:space="0"/>
+              <w:right w:val="single" w:color="000000" w:sz="4" w:space="0"/>
+            </w:tcBorders>
+            <w:shd w:val="clear" w:color="auto" w:fill="auto"/>
+          </w:tcPr>
+          <w:p>
+            <w:pPr>
+              <w:pStyle w:val="3"/>
               <w:numPr>
                 <w:ilvl w:val="1"/>
                 <w:numId w:val="1"/>
@@ -491,40 +482,41 @@
         </w:tc>
       </w:tr>
       <w:tr>
+        <w:tblPrEx>
+          <w:tblCellMar>
+            <w:top w:w="0" w:type="dxa"/>
+            <w:left w:w="70" w:type="dxa"/>
+            <w:bottom w:w="0" w:type="dxa"/>
+            <w:right w:w="70" w:type="dxa"/>
+          </w:tblCellMar>
+        </w:tblPrEx>
         <w:trPr>
-          <w:trHeight w:val="780"/>
+          <w:trHeight w:val="780" w:hRule="atLeast"/>
         </w:trPr>
         <w:tc>
           <w:tcPr>
             <w:tcW w:w="10330" w:type="dxa"/>
             <w:gridSpan w:val="2"/>
             <w:tcBorders>
-              <w:top w:val="single" w:sz="4" w:space="0" w:color="000000"/>
-              <w:left w:val="single" w:sz="4" w:space="0" w:color="000000"/>
-              <w:right w:val="single" w:sz="4" w:space="0" w:color="000000"/>
-            </w:tcBorders>
-            <w:shd w:val="clear" w:color="auto" w:fill="auto"/>
-          </w:tcPr>
-          <w:p>
-            <w:pPr>
-              <w:rPr>
-                <w:sz w:val="28"/>
-                <w:szCs w:val="28"/>
-              </w:rPr>
-            </w:pPr>
-            <w:r>
-              <w:rPr>
-                <w:sz w:val="28"/>
-                <w:szCs w:val="28"/>
-              </w:rPr>
-              <w:t xml:space="preserve">1. Ator seleciona a opção de “Solicitações de Adesão” na tela inicial do </w:t>
-            </w:r>
-            <w:r>
-              <w:rPr>
-                <w:sz w:val="28"/>
-                <w:szCs w:val="28"/>
-              </w:rPr>
-              <w:t>sistema (</w:t>
+              <w:top w:val="single" w:color="000000" w:sz="4" w:space="0"/>
+              <w:left w:val="single" w:color="000000" w:sz="4" w:space="0"/>
+              <w:right w:val="single" w:color="000000" w:sz="4" w:space="0"/>
+            </w:tcBorders>
+            <w:shd w:val="clear" w:color="auto" w:fill="auto"/>
+          </w:tcPr>
+          <w:p>
+            <w:pPr>
+              <w:rPr>
+                <w:sz w:val="28"/>
+                <w:szCs w:val="28"/>
+              </w:rPr>
+            </w:pPr>
+            <w:r>
+              <w:rPr>
+                <w:sz w:val="28"/>
+                <w:szCs w:val="28"/>
+              </w:rPr>
+              <w:t>1. Ator seleciona a opção de “Solicitações de Adesão” na tela inicial do sistema (</w:t>
             </w:r>
             <w:r>
               <w:rPr>
@@ -532,7 +524,29 @@
                 <w:sz w:val="28"/>
                 <w:szCs w:val="28"/>
               </w:rPr>
-              <w:t>Tela_</w:t>
+              <w:t>Tela_W17</w:t>
+            </w:r>
+            <w:r>
+              <w:rPr>
+                <w:sz w:val="28"/>
+                <w:szCs w:val="28"/>
+              </w:rPr>
+              <w:t>).</w:t>
+            </w:r>
+          </w:p>
+          <w:p>
+            <w:pPr>
+              <w:rPr>
+                <w:sz w:val="28"/>
+                <w:szCs w:val="28"/>
+              </w:rPr>
+            </w:pPr>
+            <w:r>
+              <w:rPr>
+                <w:sz w:val="28"/>
+                <w:szCs w:val="28"/>
+              </w:rPr>
+              <w:t>2. Sistema exibe tela listando todas as solicitações enviadas pelos restaurantes (</w:t>
             </w:r>
             <w:r>
               <w:rPr>
@@ -540,36 +554,44 @@
                 <w:sz w:val="28"/>
                 <w:szCs w:val="28"/>
               </w:rPr>
-              <w:t>W17</w:t>
-            </w:r>
-            <w:r>
-              <w:rPr>
-                <w:sz w:val="28"/>
-                <w:szCs w:val="28"/>
-              </w:rPr>
-              <w:t>).</w:t>
-            </w:r>
-          </w:p>
-          <w:p>
-            <w:pPr>
-              <w:rPr>
-                <w:sz w:val="28"/>
-                <w:szCs w:val="28"/>
-              </w:rPr>
-            </w:pPr>
-            <w:r>
-              <w:rPr>
-                <w:sz w:val="28"/>
-                <w:szCs w:val="28"/>
-              </w:rPr>
-              <w:t xml:space="preserve">2. Sistema exibe tela listando todas as solicitações enviadas pelos </w:t>
-            </w:r>
-            <w:r>
-              <w:rPr>
-                <w:sz w:val="28"/>
-                <w:szCs w:val="28"/>
-              </w:rPr>
-              <w:t>restaurantes (</w:t>
+              <w:t>Tela_W19</w:t>
+            </w:r>
+            <w:r>
+              <w:rPr>
+                <w:sz w:val="28"/>
+                <w:szCs w:val="28"/>
+              </w:rPr>
+              <w:t>)</w:t>
+            </w:r>
+          </w:p>
+          <w:p>
+            <w:pPr>
+              <w:rPr>
+                <w:sz w:val="28"/>
+                <w:szCs w:val="28"/>
+              </w:rPr>
+            </w:pPr>
+            <w:r>
+              <w:rPr>
+                <w:sz w:val="28"/>
+                <w:szCs w:val="28"/>
+              </w:rPr>
+              <w:t>3. Ator seleciona opção visualizar para o restaurante desejado.</w:t>
+            </w:r>
+          </w:p>
+          <w:p>
+            <w:pPr>
+              <w:rPr>
+                <w:sz w:val="28"/>
+                <w:szCs w:val="28"/>
+              </w:rPr>
+            </w:pPr>
+            <w:r>
+              <w:rPr>
+                <w:sz w:val="28"/>
+                <w:szCs w:val="28"/>
+              </w:rPr>
+              <w:t>4. Sistema exibe a tela de visualização de solicitação do restaurante (</w:t>
             </w:r>
             <w:r>
               <w:rPr>
@@ -577,15 +599,7 @@
                 <w:sz w:val="28"/>
                 <w:szCs w:val="28"/>
               </w:rPr>
-              <w:t>Tela_</w:t>
-            </w:r>
-            <w:r>
-              <w:rPr>
-                <w:color w:val="FF0000"/>
-                <w:sz w:val="28"/>
-                <w:szCs w:val="28"/>
-              </w:rPr>
-              <w:t>W19</w:t>
+              <w:t>Tela_W22</w:t>
             </w:r>
             <w:r>
               <w:rPr>
@@ -607,51 +621,6 @@
                 <w:sz w:val="28"/>
                 <w:szCs w:val="28"/>
               </w:rPr>
-              <w:t>3. Ator seleciona opção visualizar para o restaurante desejado.</w:t>
-            </w:r>
-          </w:p>
-          <w:p>
-            <w:pPr>
-              <w:rPr>
-                <w:sz w:val="28"/>
-                <w:szCs w:val="28"/>
-              </w:rPr>
-            </w:pPr>
-            <w:r>
-              <w:rPr>
-                <w:sz w:val="28"/>
-                <w:szCs w:val="28"/>
-              </w:rPr>
-              <w:t>4. Sistema exibe a tela de visualização de solicitação do restaurante (</w:t>
-            </w:r>
-            <w:r>
-              <w:rPr>
-                <w:color w:val="FF0000"/>
-                <w:sz w:val="28"/>
-                <w:szCs w:val="28"/>
-              </w:rPr>
-              <w:t>Tela_W22</w:t>
-            </w:r>
-            <w:r>
-              <w:rPr>
-                <w:sz w:val="28"/>
-                <w:szCs w:val="28"/>
-              </w:rPr>
-              <w:t>)</w:t>
-            </w:r>
-          </w:p>
-          <w:p>
-            <w:pPr>
-              <w:rPr>
-                <w:sz w:val="28"/>
-                <w:szCs w:val="28"/>
-              </w:rPr>
-            </w:pPr>
-            <w:r>
-              <w:rPr>
-                <w:sz w:val="28"/>
-                <w:szCs w:val="28"/>
-              </w:rPr>
               <w:t>5. Ator seleciona uma das 2 opções disponibilizadas pelo sistema.</w:t>
             </w:r>
           </w:p>
@@ -672,10 +641,10 @@
           </w:p>
           <w:p>
             <w:pPr>
-              <w:pStyle w:val="PargrafodaLista"/>
+              <w:pStyle w:val="46"/>
               <w:numPr>
                 <w:ilvl w:val="0"/>
-                <w:numId w:val="6"/>
+                <w:numId w:val="2"/>
               </w:numPr>
               <w:rPr>
                 <w:sz w:val="28"/>
@@ -687,14 +656,7 @@
                 <w:sz w:val="28"/>
                 <w:szCs w:val="28"/>
               </w:rPr>
-              <w:t>Aprovar</w:t>
-            </w:r>
-            <w:r>
-              <w:rPr>
-                <w:sz w:val="28"/>
-                <w:szCs w:val="28"/>
-              </w:rPr>
-              <w:t xml:space="preserve">: Ver </w:t>
+              <w:t xml:space="preserve">Aprovar: Ver </w:t>
             </w:r>
             <w:r>
               <w:rPr>
@@ -707,10 +669,10 @@
           </w:p>
           <w:p>
             <w:pPr>
-              <w:pStyle w:val="PargrafodaLista"/>
+              <w:pStyle w:val="46"/>
               <w:numPr>
                 <w:ilvl w:val="0"/>
-                <w:numId w:val="6"/>
+                <w:numId w:val="2"/>
               </w:numPr>
               <w:rPr>
                 <w:sz w:val="28"/>
@@ -743,23 +705,31 @@
         </w:tc>
       </w:tr>
       <w:tr>
+        <w:tblPrEx>
+          <w:tblCellMar>
+            <w:top w:w="0" w:type="dxa"/>
+            <w:left w:w="70" w:type="dxa"/>
+            <w:bottom w:w="0" w:type="dxa"/>
+            <w:right w:w="70" w:type="dxa"/>
+          </w:tblCellMar>
+        </w:tblPrEx>
         <w:trPr>
-          <w:trHeight w:val="405"/>
+          <w:trHeight w:val="405" w:hRule="atLeast"/>
         </w:trPr>
         <w:tc>
           <w:tcPr>
             <w:tcW w:w="10330" w:type="dxa"/>
             <w:gridSpan w:val="2"/>
             <w:tcBorders>
-              <w:left w:val="single" w:sz="4" w:space="0" w:color="000000"/>
-              <w:bottom w:val="single" w:sz="4" w:space="0" w:color="000000"/>
-              <w:right w:val="single" w:sz="4" w:space="0" w:color="000000"/>
-            </w:tcBorders>
-            <w:shd w:val="clear" w:color="auto" w:fill="auto"/>
-          </w:tcPr>
-          <w:p>
-            <w:pPr>
-              <w:pStyle w:val="Ttulo2"/>
+              <w:left w:val="single" w:color="000000" w:sz="4" w:space="0"/>
+              <w:bottom w:val="single" w:color="000000" w:sz="4" w:space="0"/>
+              <w:right w:val="single" w:color="000000" w:sz="4" w:space="0"/>
+            </w:tcBorders>
+            <w:shd w:val="clear" w:color="auto" w:fill="auto"/>
+          </w:tcPr>
+          <w:p>
+            <w:pPr>
+              <w:pStyle w:val="3"/>
               <w:jc w:val="left"/>
             </w:pPr>
             <w:bookmarkStart w:id="0" w:name="_heading=h.5pvsygsayg8" w:colFirst="0" w:colLast="0"/>
@@ -768,23 +738,31 @@
         </w:tc>
       </w:tr>
       <w:tr>
+        <w:tblPrEx>
+          <w:tblCellMar>
+            <w:top w:w="0" w:type="dxa"/>
+            <w:left w:w="70" w:type="dxa"/>
+            <w:bottom w:w="0" w:type="dxa"/>
+            <w:right w:w="70" w:type="dxa"/>
+          </w:tblCellMar>
+        </w:tblPrEx>
         <w:trPr>
-          <w:trHeight w:val="405"/>
+          <w:trHeight w:val="405" w:hRule="atLeast"/>
         </w:trPr>
         <w:tc>
           <w:tcPr>
             <w:tcW w:w="10330" w:type="dxa"/>
             <w:gridSpan w:val="2"/>
             <w:tcBorders>
-              <w:left w:val="single" w:sz="4" w:space="0" w:color="000000"/>
-              <w:bottom w:val="single" w:sz="4" w:space="0" w:color="000000"/>
-              <w:right w:val="single" w:sz="4" w:space="0" w:color="000000"/>
-            </w:tcBorders>
-            <w:shd w:val="clear" w:color="auto" w:fill="auto"/>
-          </w:tcPr>
-          <w:p>
-            <w:pPr>
-              <w:pStyle w:val="Ttulo2"/>
+              <w:left w:val="single" w:color="000000" w:sz="4" w:space="0"/>
+              <w:bottom w:val="single" w:color="000000" w:sz="4" w:space="0"/>
+              <w:right w:val="single" w:color="000000" w:sz="4" w:space="0"/>
+            </w:tcBorders>
+            <w:shd w:val="clear" w:color="auto" w:fill="auto"/>
+          </w:tcPr>
+          <w:p>
+            <w:pPr>
+              <w:pStyle w:val="3"/>
               <w:numPr>
                 <w:ilvl w:val="1"/>
                 <w:numId w:val="1"/>
@@ -804,18 +782,26 @@
         </w:tc>
       </w:tr>
       <w:tr>
+        <w:tblPrEx>
+          <w:tblCellMar>
+            <w:top w:w="0" w:type="dxa"/>
+            <w:left w:w="70" w:type="dxa"/>
+            <w:bottom w:w="0" w:type="dxa"/>
+            <w:right w:w="70" w:type="dxa"/>
+          </w:tblCellMar>
+        </w:tblPrEx>
         <w:trPr>
-          <w:trHeight w:val="465"/>
+          <w:trHeight w:val="465" w:hRule="atLeast"/>
         </w:trPr>
         <w:tc>
           <w:tcPr>
             <w:tcW w:w="10330" w:type="dxa"/>
             <w:gridSpan w:val="2"/>
             <w:tcBorders>
-              <w:top w:val="single" w:sz="4" w:space="0" w:color="000000"/>
-              <w:left w:val="single" w:sz="4" w:space="0" w:color="000000"/>
-              <w:bottom w:val="single" w:sz="4" w:space="0" w:color="000000"/>
-              <w:right w:val="single" w:sz="4" w:space="0" w:color="000000"/>
+              <w:top w:val="single" w:color="000000" w:sz="4" w:space="0"/>
+              <w:left w:val="single" w:color="000000" w:sz="4" w:space="0"/>
+              <w:bottom w:val="single" w:color="000000" w:sz="4" w:space="0"/>
+              <w:right w:val="single" w:color="000000" w:sz="4" w:space="0"/>
             </w:tcBorders>
             <w:shd w:val="clear" w:color="auto" w:fill="auto"/>
           </w:tcPr>
@@ -852,7 +838,17 @@
                 <w:sz w:val="28"/>
                 <w:szCs w:val="28"/>
               </w:rPr>
-              <w:t>Tela_W17</w:t>
+              <w:t>Tela_W1</w:t>
+            </w:r>
+            <w:r>
+              <w:rPr>
+                <w:rFonts w:hint="default"/>
+                <w:color w:val="FF0000"/>
+                <w:sz w:val="28"/>
+                <w:szCs w:val="28"/>
+                <w:lang w:val="pt-BR"/>
+              </w:rPr>
+              <w:t>9</w:t>
             </w:r>
             <w:r>
               <w:rPr>
@@ -865,18 +861,26 @@
         </w:tc>
       </w:tr>
       <w:tr>
+        <w:tblPrEx>
+          <w:tblCellMar>
+            <w:top w:w="0" w:type="dxa"/>
+            <w:left w:w="70" w:type="dxa"/>
+            <w:bottom w:w="0" w:type="dxa"/>
+            <w:right w:w="70" w:type="dxa"/>
+          </w:tblCellMar>
+        </w:tblPrEx>
         <w:trPr>
-          <w:trHeight w:val="465"/>
+          <w:trHeight w:val="465" w:hRule="atLeast"/>
         </w:trPr>
         <w:tc>
           <w:tcPr>
             <w:tcW w:w="10330" w:type="dxa"/>
             <w:gridSpan w:val="2"/>
             <w:tcBorders>
-              <w:top w:val="single" w:sz="4" w:space="0" w:color="000000"/>
-              <w:left w:val="single" w:sz="4" w:space="0" w:color="000000"/>
-              <w:bottom w:val="single" w:sz="4" w:space="0" w:color="000000"/>
-              <w:right w:val="single" w:sz="4" w:space="0" w:color="000000"/>
+              <w:top w:val="single" w:color="000000" w:sz="4" w:space="0"/>
+              <w:left w:val="single" w:color="000000" w:sz="4" w:space="0"/>
+              <w:bottom w:val="single" w:color="000000" w:sz="4" w:space="0"/>
+              <w:right w:val="single" w:color="000000" w:sz="4" w:space="0"/>
             </w:tcBorders>
             <w:shd w:val="clear" w:color="auto" w:fill="auto"/>
           </w:tcPr>
@@ -904,18 +908,26 @@
         </w:tc>
       </w:tr>
       <w:tr>
+        <w:tblPrEx>
+          <w:tblCellMar>
+            <w:top w:w="0" w:type="dxa"/>
+            <w:left w:w="70" w:type="dxa"/>
+            <w:bottom w:w="0" w:type="dxa"/>
+            <w:right w:w="70" w:type="dxa"/>
+          </w:tblCellMar>
+        </w:tblPrEx>
         <w:trPr>
-          <w:trHeight w:val="465"/>
+          <w:trHeight w:val="465" w:hRule="atLeast"/>
         </w:trPr>
         <w:tc>
           <w:tcPr>
             <w:tcW w:w="10330" w:type="dxa"/>
             <w:gridSpan w:val="2"/>
             <w:tcBorders>
-              <w:top w:val="single" w:sz="4" w:space="0" w:color="000000"/>
-              <w:left w:val="single" w:sz="4" w:space="0" w:color="000000"/>
-              <w:bottom w:val="single" w:sz="4" w:space="0" w:color="000000"/>
-              <w:right w:val="single" w:sz="4" w:space="0" w:color="000000"/>
+              <w:top w:val="single" w:color="000000" w:sz="4" w:space="0"/>
+              <w:left w:val="single" w:color="000000" w:sz="4" w:space="0"/>
+              <w:bottom w:val="single" w:color="000000" w:sz="4" w:space="0"/>
+              <w:right w:val="single" w:color="000000" w:sz="4" w:space="0"/>
             </w:tcBorders>
             <w:shd w:val="clear" w:color="auto" w:fill="auto"/>
           </w:tcPr>
@@ -945,23 +957,7 @@
                 <w:sz w:val="28"/>
                 <w:szCs w:val="28"/>
               </w:rPr>
-              <w:t xml:space="preserve"> </w:t>
-            </w:r>
-            <w:r>
-              <w:rPr>
-                <w:bCs/>
-                <w:sz w:val="28"/>
-                <w:szCs w:val="28"/>
-              </w:rPr>
-              <w:t xml:space="preserve">Não há </w:t>
-            </w:r>
-            <w:r>
-              <w:rPr>
-                <w:bCs/>
-                <w:sz w:val="28"/>
-                <w:szCs w:val="28"/>
-              </w:rPr>
-              <w:t>solicitações de adesão pendentes para exibir na tela (</w:t>
+              <w:t xml:space="preserve"> Não há solicitações de adesão pendentes para exibir na tela (</w:t>
             </w:r>
             <w:r>
               <w:rPr>
@@ -980,8 +976,6 @@
               </w:rPr>
               <w:t>) e exibe a mensagem “Não há solicitações de adesão pendentes!”.</w:t>
             </w:r>
-            <w:bookmarkStart w:id="1" w:name="_GoBack"/>
-            <w:bookmarkEnd w:id="1"/>
           </w:p>
         </w:tc>
       </w:tr>
@@ -1003,14 +997,14 @@
     </w:p>
     <w:p>
       <w:pPr>
-        <w:pStyle w:val="Ttulo1"/>
+        <w:pStyle w:val="2"/>
         <w:numPr>
           <w:ilvl w:val="0"/>
-          <w:numId w:val="5"/>
+          <w:numId w:val="3"/>
         </w:numPr>
       </w:pPr>
-      <w:bookmarkStart w:id="2" w:name="_heading=h.ajjd61sliw3n" w:colFirst="0" w:colLast="0"/>
-      <w:bookmarkEnd w:id="2"/>
+      <w:bookmarkStart w:id="1" w:name="_heading=h.ajjd61sliw3n" w:colFirst="0" w:colLast="0"/>
+      <w:bookmarkEnd w:id="1"/>
       <w:r>
         <w:t xml:space="preserve">Seção: </w:t>
       </w:r>
@@ -1018,36 +1012,43 @@
         <w:rPr>
           <w:b w:val="0"/>
         </w:rPr>
-        <w:t>Aprovar</w:t>
-      </w:r>
-      <w:r>
-        <w:rPr>
-          <w:b w:val="0"/>
-        </w:rPr>
-        <w:t xml:space="preserve"> Restaurante</w:t>
+        <w:t>Aprovar Restaurante</w:t>
       </w:r>
     </w:p>
     <w:tbl>
       <w:tblPr>
-        <w:tblStyle w:val="ae"/>
+        <w:tblStyle w:val="40"/>
         <w:tblW w:w="10330" w:type="dxa"/>
         <w:tblInd w:w="-70" w:type="dxa"/>
         <w:tblLayout w:type="fixed"/>
-        <w:tblLook w:val="0000" w:firstRow="0" w:lastRow="0" w:firstColumn="0" w:lastColumn="0" w:noHBand="0" w:noVBand="0"/>
+        <w:tblCellMar>
+          <w:top w:w="0" w:type="dxa"/>
+          <w:left w:w="70" w:type="dxa"/>
+          <w:bottom w:w="0" w:type="dxa"/>
+          <w:right w:w="70" w:type="dxa"/>
+        </w:tblCellMar>
       </w:tblPr>
       <w:tblGrid>
         <w:gridCol w:w="2905"/>
         <w:gridCol w:w="7425"/>
       </w:tblGrid>
       <w:tr>
+        <w:tblPrEx>
+          <w:tblCellMar>
+            <w:top w:w="0" w:type="dxa"/>
+            <w:left w:w="70" w:type="dxa"/>
+            <w:bottom w:w="0" w:type="dxa"/>
+            <w:right w:w="70" w:type="dxa"/>
+          </w:tblCellMar>
+        </w:tblPrEx>
         <w:tc>
           <w:tcPr>
             <w:tcW w:w="2905" w:type="dxa"/>
             <w:tcBorders>
-              <w:top w:val="single" w:sz="4" w:space="0" w:color="000000"/>
-              <w:left w:val="single" w:sz="4" w:space="0" w:color="000000"/>
-              <w:bottom w:val="single" w:sz="4" w:space="0" w:color="000000"/>
-              <w:right w:val="single" w:sz="4" w:space="0" w:color="000000"/>
+              <w:top w:val="single" w:color="000000" w:sz="4" w:space="0"/>
+              <w:left w:val="single" w:color="000000" w:sz="4" w:space="0"/>
+              <w:bottom w:val="single" w:color="000000" w:sz="4" w:space="0"/>
+              <w:right w:val="single" w:color="000000" w:sz="4" w:space="0"/>
             </w:tcBorders>
             <w:shd w:val="clear" w:color="auto" w:fill="auto"/>
           </w:tcPr>
@@ -1066,10 +1067,10 @@
           <w:tcPr>
             <w:tcW w:w="7425" w:type="dxa"/>
             <w:tcBorders>
-              <w:top w:val="single" w:sz="4" w:space="0" w:color="000000"/>
-              <w:left w:val="single" w:sz="4" w:space="0" w:color="000000"/>
-              <w:bottom w:val="single" w:sz="4" w:space="0" w:color="000000"/>
-              <w:right w:val="single" w:sz="4" w:space="0" w:color="000000"/>
+              <w:top w:val="single" w:color="000000" w:sz="4" w:space="0"/>
+              <w:left w:val="single" w:color="000000" w:sz="4" w:space="0"/>
+              <w:bottom w:val="single" w:color="000000" w:sz="4" w:space="0"/>
+              <w:right w:val="single" w:color="000000" w:sz="4" w:space="0"/>
             </w:tcBorders>
             <w:shd w:val="clear" w:color="auto" w:fill="auto"/>
           </w:tcPr>
@@ -1085,6 +1086,14 @@
         </w:tc>
       </w:tr>
       <w:tr>
+        <w:tblPrEx>
+          <w:tblCellMar>
+            <w:top w:w="0" w:type="dxa"/>
+            <w:left w:w="70" w:type="dxa"/>
+            <w:bottom w:w="0" w:type="dxa"/>
+            <w:right w:w="70" w:type="dxa"/>
+          </w:tblCellMar>
+        </w:tblPrEx>
         <w:trPr>
           <w:cantSplit/>
         </w:trPr>
@@ -1093,23 +1102,23 @@
             <w:tcW w:w="10330" w:type="dxa"/>
             <w:gridSpan w:val="2"/>
             <w:tcBorders>
-              <w:top w:val="single" w:sz="4" w:space="0" w:color="000000"/>
-              <w:left w:val="single" w:sz="4" w:space="0" w:color="000000"/>
-              <w:bottom w:val="single" w:sz="4" w:space="0" w:color="000000"/>
-              <w:right w:val="single" w:sz="4" w:space="0" w:color="000000"/>
-            </w:tcBorders>
-            <w:shd w:val="clear" w:color="auto" w:fill="auto"/>
-          </w:tcPr>
-          <w:p>
-            <w:pPr>
-              <w:pStyle w:val="Ttulo2"/>
+              <w:top w:val="single" w:color="000000" w:sz="4" w:space="0"/>
+              <w:left w:val="single" w:color="000000" w:sz="4" w:space="0"/>
+              <w:bottom w:val="single" w:color="000000" w:sz="4" w:space="0"/>
+              <w:right w:val="single" w:color="000000" w:sz="4" w:space="0"/>
+            </w:tcBorders>
+            <w:shd w:val="clear" w:color="auto" w:fill="auto"/>
+          </w:tcPr>
+          <w:p>
+            <w:pPr>
+              <w:pStyle w:val="3"/>
               <w:numPr>
                 <w:ilvl w:val="1"/>
-                <w:numId w:val="5"/>
+                <w:numId w:val="3"/>
               </w:numPr>
             </w:pPr>
-            <w:bookmarkStart w:id="3" w:name="_heading=h.dehkox1iveim" w:colFirst="0" w:colLast="0"/>
-            <w:bookmarkEnd w:id="3"/>
+            <w:bookmarkStart w:id="2" w:name="_heading=h.dehkox1iveim" w:colFirst="0" w:colLast="0"/>
+            <w:bookmarkEnd w:id="2"/>
             <w:r>
               <w:rPr>
                 <w:b/>
@@ -1120,18 +1129,26 @@
         </w:tc>
       </w:tr>
       <w:tr>
+        <w:tblPrEx>
+          <w:tblCellMar>
+            <w:top w:w="0" w:type="dxa"/>
+            <w:left w:w="70" w:type="dxa"/>
+            <w:bottom w:w="0" w:type="dxa"/>
+            <w:right w:w="70" w:type="dxa"/>
+          </w:tblCellMar>
+        </w:tblPrEx>
         <w:trPr>
-          <w:trHeight w:val="555"/>
+          <w:trHeight w:val="555" w:hRule="atLeast"/>
         </w:trPr>
         <w:tc>
           <w:tcPr>
             <w:tcW w:w="10330" w:type="dxa"/>
             <w:gridSpan w:val="2"/>
             <w:tcBorders>
-              <w:top w:val="single" w:sz="4" w:space="0" w:color="000000"/>
-              <w:left w:val="single" w:sz="4" w:space="0" w:color="000000"/>
-              <w:bottom w:val="single" w:sz="4" w:space="0" w:color="000000"/>
-              <w:right w:val="single" w:sz="4" w:space="0" w:color="000000"/>
+              <w:top w:val="single" w:color="000000" w:sz="4" w:space="0"/>
+              <w:left w:val="single" w:color="000000" w:sz="4" w:space="0"/>
+              <w:bottom w:val="single" w:color="000000" w:sz="4" w:space="0"/>
+              <w:right w:val="single" w:color="000000" w:sz="4" w:space="0"/>
             </w:tcBorders>
             <w:shd w:val="clear" w:color="auto" w:fill="auto"/>
           </w:tcPr>
@@ -1154,7 +1171,23 @@
                 <w:sz w:val="28"/>
                 <w:szCs w:val="28"/>
               </w:rPr>
-              <w:t>Ator pressiona o botão “Aceitar”.</w:t>
+              <w:t>Ator pressiona o botão “</w:t>
+            </w:r>
+            <w:r>
+              <w:rPr>
+                <w:rFonts w:hint="default"/>
+                <w:sz w:val="28"/>
+                <w:szCs w:val="28"/>
+                <w:lang w:val="pt-BR"/>
+              </w:rPr>
+              <w:t>Aprovar</w:t>
+            </w:r>
+            <w:r>
+              <w:rPr>
+                <w:sz w:val="28"/>
+                <w:szCs w:val="28"/>
+              </w:rPr>
+              <w:t>”.</w:t>
             </w:r>
           </w:p>
           <w:p>
@@ -1185,15 +1218,7 @@
                 <w:sz w:val="28"/>
                 <w:szCs w:val="28"/>
               </w:rPr>
-              <w:t>Tela_</w:t>
-            </w:r>
-            <w:r>
-              <w:rPr>
-                <w:color w:val="FF0000"/>
-                <w:sz w:val="28"/>
-                <w:szCs w:val="28"/>
-              </w:rPr>
-              <w:t>W14</w:t>
+              <w:t>Tela_W14</w:t>
             </w:r>
             <w:r>
               <w:rPr>
@@ -1246,10 +1271,7 @@
                 <w:tag w:val="goog_rdk_0"/>
                 <w:id w:val="-1806055631"/>
               </w:sdtPr>
-              <w:sdtEndPr/>
-              <w:sdtContent>
-                <w:commentRangeStart w:id="4"/>
-              </w:sdtContent>
+              <w:sdtContent/>
             </w:sdt>
             <w:r>
               <w:rPr>
@@ -1257,27 +1279,31 @@
                 <w:szCs w:val="28"/>
               </w:rPr>
               <w:t>Sistema adiciona o restaurante ao aplicativo em meio persistente.</w:t>
-            </w:r>
-            <w:commentRangeEnd w:id="4"/>
-            <w:r>
-              <w:commentReference w:id="4"/>
             </w:r>
           </w:p>
         </w:tc>
       </w:tr>
       <w:tr>
+        <w:tblPrEx>
+          <w:tblCellMar>
+            <w:top w:w="0" w:type="dxa"/>
+            <w:left w:w="70" w:type="dxa"/>
+            <w:bottom w:w="0" w:type="dxa"/>
+            <w:right w:w="70" w:type="dxa"/>
+          </w:tblCellMar>
+        </w:tblPrEx>
         <w:trPr>
-          <w:trHeight w:val="390"/>
+          <w:trHeight w:val="390" w:hRule="atLeast"/>
         </w:trPr>
         <w:tc>
           <w:tcPr>
             <w:tcW w:w="10330" w:type="dxa"/>
             <w:gridSpan w:val="2"/>
             <w:tcBorders>
-              <w:top w:val="single" w:sz="4" w:space="0" w:color="000000"/>
-              <w:left w:val="single" w:sz="4" w:space="0" w:color="000000"/>
-              <w:bottom w:val="single" w:sz="4" w:space="0" w:color="000000"/>
-              <w:right w:val="single" w:sz="4" w:space="0" w:color="000000"/>
+              <w:top w:val="single" w:color="000000" w:sz="4" w:space="0"/>
+              <w:left w:val="single" w:color="000000" w:sz="4" w:space="0"/>
+              <w:bottom w:val="single" w:color="000000" w:sz="4" w:space="0"/>
+              <w:right w:val="single" w:color="000000" w:sz="4" w:space="0"/>
             </w:tcBorders>
             <w:shd w:val="clear" w:color="auto" w:fill="auto"/>
           </w:tcPr>
@@ -1304,18 +1330,26 @@
         </w:tc>
       </w:tr>
       <w:tr>
+        <w:tblPrEx>
+          <w:tblCellMar>
+            <w:top w:w="0" w:type="dxa"/>
+            <w:left w:w="70" w:type="dxa"/>
+            <w:bottom w:w="0" w:type="dxa"/>
+            <w:right w:w="70" w:type="dxa"/>
+          </w:tblCellMar>
+        </w:tblPrEx>
         <w:trPr>
-          <w:trHeight w:val="450"/>
+          <w:trHeight w:val="450" w:hRule="atLeast"/>
         </w:trPr>
         <w:tc>
           <w:tcPr>
             <w:tcW w:w="10330" w:type="dxa"/>
             <w:gridSpan w:val="2"/>
             <w:tcBorders>
-              <w:top w:val="single" w:sz="4" w:space="0" w:color="000000"/>
-              <w:left w:val="single" w:sz="4" w:space="0" w:color="000000"/>
-              <w:bottom w:val="single" w:sz="4" w:space="0" w:color="000000"/>
-              <w:right w:val="single" w:sz="4" w:space="0" w:color="000000"/>
+              <w:top w:val="single" w:color="000000" w:sz="4" w:space="0"/>
+              <w:left w:val="single" w:color="000000" w:sz="4" w:space="0"/>
+              <w:bottom w:val="single" w:color="000000" w:sz="4" w:space="0"/>
+              <w:right w:val="single" w:color="000000" w:sz="4" w:space="0"/>
             </w:tcBorders>
             <w:shd w:val="clear" w:color="auto" w:fill="auto"/>
           </w:tcPr>
@@ -1343,14 +1377,23 @@
                 <w:sz w:val="28"/>
                 <w:szCs w:val="28"/>
               </w:rPr>
-              <w:t xml:space="preserve">Ator pressiona botão “Voltar”. Sistema retorna à tela inicial do </w:t>
-            </w:r>
-            <w:r>
-              <w:rPr>
-                <w:sz w:val="28"/>
-                <w:szCs w:val="28"/>
-              </w:rPr>
-              <w:t>sistema. (</w:t>
+              <w:t xml:space="preserve">Ator pressiona botão “Voltar”. Sistema retorna à tela </w:t>
+            </w:r>
+            <w:r>
+              <w:rPr>
+                <w:rFonts w:hint="default"/>
+                <w:sz w:val="28"/>
+                <w:szCs w:val="28"/>
+                <w:lang w:val="pt-BR"/>
+              </w:rPr>
+              <w:t>de aprovação</w:t>
+            </w:r>
+            <w:r>
+              <w:rPr>
+                <w:sz w:val="28"/>
+                <w:szCs w:val="28"/>
+              </w:rPr>
+              <w:t>. (</w:t>
             </w:r>
             <w:r>
               <w:rPr>
@@ -1358,23 +1401,17 @@
                 <w:sz w:val="28"/>
                 <w:szCs w:val="28"/>
               </w:rPr>
-              <w:t>Tela_</w:t>
-            </w:r>
-            <w:r>
-              <w:rPr>
+              <w:t>Tela_W1</w:t>
+            </w:r>
+            <w:r>
+              <w:rPr>
+                <w:rFonts w:hint="default"/>
                 <w:color w:val="FF0000"/>
                 <w:sz w:val="28"/>
                 <w:szCs w:val="28"/>
-              </w:rPr>
-              <w:t>W1</w:t>
-            </w:r>
-            <w:r>
-              <w:rPr>
-                <w:color w:val="FF0000"/>
-                <w:sz w:val="28"/>
-                <w:szCs w:val="28"/>
-              </w:rPr>
-              <w:t>7</w:t>
+                <w:lang w:val="pt-BR"/>
+              </w:rPr>
+              <w:t>9</w:t>
             </w:r>
             <w:r>
               <w:rPr>
@@ -1419,14 +1456,14 @@
     </w:p>
     <w:p>
       <w:pPr>
-        <w:pStyle w:val="Ttulo1"/>
+        <w:pStyle w:val="2"/>
         <w:numPr>
           <w:ilvl w:val="0"/>
-          <w:numId w:val="3"/>
+          <w:numId w:val="5"/>
         </w:numPr>
       </w:pPr>
-      <w:bookmarkStart w:id="5" w:name="_heading=h.6mqc9y67i02" w:colFirst="0" w:colLast="0"/>
-      <w:bookmarkEnd w:id="5"/>
+      <w:bookmarkStart w:id="3" w:name="_heading=h.6mqc9y67i02" w:colFirst="0" w:colLast="0"/>
+      <w:bookmarkEnd w:id="3"/>
       <w:r>
         <w:t xml:space="preserve">Seção: </w:t>
       </w:r>
@@ -1434,36 +1471,43 @@
         <w:rPr>
           <w:b w:val="0"/>
         </w:rPr>
-        <w:t>Negar</w:t>
-      </w:r>
-      <w:r>
-        <w:rPr>
-          <w:b w:val="0"/>
-        </w:rPr>
-        <w:t xml:space="preserve"> Restaurante</w:t>
+        <w:t>Negar Restaurante</w:t>
       </w:r>
     </w:p>
     <w:tbl>
       <w:tblPr>
-        <w:tblStyle w:val="af"/>
+        <w:tblStyle w:val="41"/>
         <w:tblW w:w="10330" w:type="dxa"/>
         <w:tblInd w:w="-70" w:type="dxa"/>
         <w:tblLayout w:type="fixed"/>
-        <w:tblLook w:val="0000" w:firstRow="0" w:lastRow="0" w:firstColumn="0" w:lastColumn="0" w:noHBand="0" w:noVBand="0"/>
+        <w:tblCellMar>
+          <w:top w:w="0" w:type="dxa"/>
+          <w:left w:w="70" w:type="dxa"/>
+          <w:bottom w:w="0" w:type="dxa"/>
+          <w:right w:w="70" w:type="dxa"/>
+        </w:tblCellMar>
       </w:tblPr>
       <w:tblGrid>
         <w:gridCol w:w="2905"/>
         <w:gridCol w:w="7425"/>
       </w:tblGrid>
       <w:tr>
+        <w:tblPrEx>
+          <w:tblCellMar>
+            <w:top w:w="0" w:type="dxa"/>
+            <w:left w:w="70" w:type="dxa"/>
+            <w:bottom w:w="0" w:type="dxa"/>
+            <w:right w:w="70" w:type="dxa"/>
+          </w:tblCellMar>
+        </w:tblPrEx>
         <w:tc>
           <w:tcPr>
             <w:tcW w:w="2905" w:type="dxa"/>
             <w:tcBorders>
-              <w:top w:val="single" w:sz="4" w:space="0" w:color="000000"/>
-              <w:left w:val="single" w:sz="4" w:space="0" w:color="000000"/>
-              <w:bottom w:val="single" w:sz="4" w:space="0" w:color="000000"/>
-              <w:right w:val="single" w:sz="4" w:space="0" w:color="000000"/>
+              <w:top w:val="single" w:color="000000" w:sz="4" w:space="0"/>
+              <w:left w:val="single" w:color="000000" w:sz="4" w:space="0"/>
+              <w:bottom w:val="single" w:color="000000" w:sz="4" w:space="0"/>
+              <w:right w:val="single" w:color="000000" w:sz="4" w:space="0"/>
             </w:tcBorders>
             <w:shd w:val="clear" w:color="auto" w:fill="auto"/>
           </w:tcPr>
@@ -1482,10 +1526,10 @@
           <w:tcPr>
             <w:tcW w:w="7425" w:type="dxa"/>
             <w:tcBorders>
-              <w:top w:val="single" w:sz="4" w:space="0" w:color="000000"/>
-              <w:left w:val="single" w:sz="4" w:space="0" w:color="000000"/>
-              <w:bottom w:val="single" w:sz="4" w:space="0" w:color="000000"/>
-              <w:right w:val="single" w:sz="4" w:space="0" w:color="000000"/>
+              <w:top w:val="single" w:color="000000" w:sz="4" w:space="0"/>
+              <w:left w:val="single" w:color="000000" w:sz="4" w:space="0"/>
+              <w:bottom w:val="single" w:color="000000" w:sz="4" w:space="0"/>
+              <w:right w:val="single" w:color="000000" w:sz="4" w:space="0"/>
             </w:tcBorders>
             <w:shd w:val="clear" w:color="auto" w:fill="auto"/>
           </w:tcPr>
@@ -1501,6 +1545,14 @@
         </w:tc>
       </w:tr>
       <w:tr>
+        <w:tblPrEx>
+          <w:tblCellMar>
+            <w:top w:w="0" w:type="dxa"/>
+            <w:left w:w="70" w:type="dxa"/>
+            <w:bottom w:w="0" w:type="dxa"/>
+            <w:right w:w="70" w:type="dxa"/>
+          </w:tblCellMar>
+        </w:tblPrEx>
         <w:trPr>
           <w:cantSplit/>
         </w:trPr>
@@ -1509,23 +1561,23 @@
             <w:tcW w:w="10330" w:type="dxa"/>
             <w:gridSpan w:val="2"/>
             <w:tcBorders>
-              <w:top w:val="single" w:sz="4" w:space="0" w:color="000000"/>
-              <w:left w:val="single" w:sz="4" w:space="0" w:color="000000"/>
-              <w:bottom w:val="single" w:sz="4" w:space="0" w:color="000000"/>
-              <w:right w:val="single" w:sz="4" w:space="0" w:color="000000"/>
-            </w:tcBorders>
-            <w:shd w:val="clear" w:color="auto" w:fill="auto"/>
-          </w:tcPr>
-          <w:p>
-            <w:pPr>
-              <w:pStyle w:val="Ttulo2"/>
+              <w:top w:val="single" w:color="000000" w:sz="4" w:space="0"/>
+              <w:left w:val="single" w:color="000000" w:sz="4" w:space="0"/>
+              <w:bottom w:val="single" w:color="000000" w:sz="4" w:space="0"/>
+              <w:right w:val="single" w:color="000000" w:sz="4" w:space="0"/>
+            </w:tcBorders>
+            <w:shd w:val="clear" w:color="auto" w:fill="auto"/>
+          </w:tcPr>
+          <w:p>
+            <w:pPr>
+              <w:pStyle w:val="3"/>
               <w:numPr>
                 <w:ilvl w:val="1"/>
-                <w:numId w:val="3"/>
+                <w:numId w:val="5"/>
               </w:numPr>
             </w:pPr>
-            <w:bookmarkStart w:id="6" w:name="_heading=h.xa6sv4v5so21" w:colFirst="0" w:colLast="0"/>
-            <w:bookmarkEnd w:id="6"/>
+            <w:bookmarkStart w:id="4" w:name="_heading=h.xa6sv4v5so21" w:colFirst="0" w:colLast="0"/>
+            <w:bookmarkEnd w:id="4"/>
             <w:r>
               <w:rPr>
                 <w:b/>
@@ -1536,18 +1588,26 @@
         </w:tc>
       </w:tr>
       <w:tr>
+        <w:tblPrEx>
+          <w:tblCellMar>
+            <w:top w:w="0" w:type="dxa"/>
+            <w:left w:w="70" w:type="dxa"/>
+            <w:bottom w:w="0" w:type="dxa"/>
+            <w:right w:w="70" w:type="dxa"/>
+          </w:tblCellMar>
+        </w:tblPrEx>
         <w:trPr>
-          <w:trHeight w:val="555"/>
+          <w:trHeight w:val="555" w:hRule="atLeast"/>
         </w:trPr>
         <w:tc>
           <w:tcPr>
             <w:tcW w:w="10330" w:type="dxa"/>
             <w:gridSpan w:val="2"/>
             <w:tcBorders>
-              <w:top w:val="single" w:sz="4" w:space="0" w:color="000000"/>
-              <w:left w:val="single" w:sz="4" w:space="0" w:color="000000"/>
-              <w:bottom w:val="single" w:sz="4" w:space="0" w:color="000000"/>
-              <w:right w:val="single" w:sz="4" w:space="0" w:color="000000"/>
+              <w:top w:val="single" w:color="000000" w:sz="4" w:space="0"/>
+              <w:left w:val="single" w:color="000000" w:sz="4" w:space="0"/>
+              <w:bottom w:val="single" w:color="000000" w:sz="4" w:space="0"/>
+              <w:right w:val="single" w:color="000000" w:sz="4" w:space="0"/>
             </w:tcBorders>
             <w:shd w:val="clear" w:color="auto" w:fill="auto"/>
           </w:tcPr>
@@ -1567,7 +1627,23 @@
                 <w:sz w:val="28"/>
                 <w:szCs w:val="28"/>
               </w:rPr>
-              <w:t>1. Ator seleciona a opção “Recusar”.</w:t>
+              <w:t>1. Ator seleciona a opção “</w:t>
+            </w:r>
+            <w:r>
+              <w:rPr>
+                <w:rFonts w:hint="default"/>
+                <w:sz w:val="28"/>
+                <w:szCs w:val="28"/>
+                <w:lang w:val="pt-BR"/>
+              </w:rPr>
+              <w:t>Negar</w:t>
+            </w:r>
+            <w:r>
+              <w:rPr>
+                <w:sz w:val="28"/>
+                <w:szCs w:val="28"/>
+              </w:rPr>
+              <w:t>”.</w:t>
             </w:r>
           </w:p>
           <w:p>
@@ -1594,15 +1670,7 @@
                 <w:sz w:val="28"/>
                 <w:szCs w:val="28"/>
               </w:rPr>
-              <w:t>Tela_</w:t>
-            </w:r>
-            <w:r>
-              <w:rPr>
-                <w:color w:val="FF0000"/>
-                <w:sz w:val="28"/>
-                <w:szCs w:val="28"/>
-              </w:rPr>
-              <w:t>W14</w:t>
+              <w:t>Tela_W14</w:t>
             </w:r>
             <w:r>
               <w:rPr>
@@ -1654,10 +1722,7 @@
                 <w:tag w:val="goog_rdk_1"/>
                 <w:id w:val="1988312332"/>
               </w:sdtPr>
-              <w:sdtEndPr/>
-              <w:sdtContent>
-                <w:commentRangeStart w:id="7"/>
-              </w:sdtContent>
+              <w:sdtContent/>
             </w:sdt>
             <w:r>
               <w:rPr>
@@ -1665,27 +1730,31 @@
                 <w:szCs w:val="28"/>
               </w:rPr>
               <w:t>Sistema não adiciona o restaurante ao aplicativo em meio persistente.</w:t>
-            </w:r>
-            <w:commentRangeEnd w:id="7"/>
-            <w:r>
-              <w:commentReference w:id="7"/>
             </w:r>
           </w:p>
         </w:tc>
       </w:tr>
       <w:tr>
+        <w:tblPrEx>
+          <w:tblCellMar>
+            <w:top w:w="0" w:type="dxa"/>
+            <w:left w:w="70" w:type="dxa"/>
+            <w:bottom w:w="0" w:type="dxa"/>
+            <w:right w:w="70" w:type="dxa"/>
+          </w:tblCellMar>
+        </w:tblPrEx>
         <w:trPr>
-          <w:trHeight w:val="390"/>
+          <w:trHeight w:val="390" w:hRule="atLeast"/>
         </w:trPr>
         <w:tc>
           <w:tcPr>
             <w:tcW w:w="10330" w:type="dxa"/>
             <w:gridSpan w:val="2"/>
             <w:tcBorders>
-              <w:top w:val="single" w:sz="4" w:space="0" w:color="000000"/>
-              <w:left w:val="single" w:sz="4" w:space="0" w:color="000000"/>
-              <w:bottom w:val="single" w:sz="4" w:space="0" w:color="000000"/>
-              <w:right w:val="single" w:sz="4" w:space="0" w:color="000000"/>
+              <w:top w:val="single" w:color="000000" w:sz="4" w:space="0"/>
+              <w:left w:val="single" w:color="000000" w:sz="4" w:space="0"/>
+              <w:bottom w:val="single" w:color="000000" w:sz="4" w:space="0"/>
+              <w:right w:val="single" w:color="000000" w:sz="4" w:space="0"/>
             </w:tcBorders>
             <w:shd w:val="clear" w:color="auto" w:fill="auto"/>
           </w:tcPr>
@@ -1712,18 +1781,26 @@
         </w:tc>
       </w:tr>
       <w:tr>
+        <w:tblPrEx>
+          <w:tblCellMar>
+            <w:top w:w="0" w:type="dxa"/>
+            <w:left w:w="70" w:type="dxa"/>
+            <w:bottom w:w="0" w:type="dxa"/>
+            <w:right w:w="70" w:type="dxa"/>
+          </w:tblCellMar>
+        </w:tblPrEx>
         <w:trPr>
-          <w:trHeight w:val="450"/>
+          <w:trHeight w:val="450" w:hRule="atLeast"/>
         </w:trPr>
         <w:tc>
           <w:tcPr>
             <w:tcW w:w="10330" w:type="dxa"/>
             <w:gridSpan w:val="2"/>
             <w:tcBorders>
-              <w:top w:val="single" w:sz="4" w:space="0" w:color="000000"/>
-              <w:left w:val="single" w:sz="4" w:space="0" w:color="000000"/>
-              <w:bottom w:val="single" w:sz="4" w:space="0" w:color="000000"/>
-              <w:right w:val="single" w:sz="4" w:space="0" w:color="000000"/>
+              <w:top w:val="single" w:color="000000" w:sz="4" w:space="0"/>
+              <w:left w:val="single" w:color="000000" w:sz="4" w:space="0"/>
+              <w:bottom w:val="single" w:color="000000" w:sz="4" w:space="0"/>
+              <w:right w:val="single" w:color="000000" w:sz="4" w:space="0"/>
             </w:tcBorders>
             <w:shd w:val="clear" w:color="auto" w:fill="auto"/>
           </w:tcPr>
@@ -1751,14 +1828,7 @@
                 <w:sz w:val="28"/>
                 <w:szCs w:val="28"/>
               </w:rPr>
-              <w:t xml:space="preserve">Ator pressiona botão “Voltar”. Sistema retorna à tela inicial do </w:t>
-            </w:r>
-            <w:r>
-              <w:rPr>
-                <w:sz w:val="28"/>
-                <w:szCs w:val="28"/>
-              </w:rPr>
-              <w:t>sistema. (</w:t>
+              <w:t>Ator pressiona botão “Voltar”. Sistema retorna à tela inicial do sistema. (</w:t>
             </w:r>
             <w:r>
               <w:rPr>
@@ -1766,15 +1836,7 @@
                 <w:sz w:val="28"/>
                 <w:szCs w:val="28"/>
               </w:rPr>
-              <w:t>Tela_</w:t>
-            </w:r>
-            <w:r>
-              <w:rPr>
-                <w:color w:val="FF0000"/>
-                <w:sz w:val="28"/>
-                <w:szCs w:val="28"/>
-              </w:rPr>
-              <w:t>W17</w:t>
+              <w:t>Tela_W17</w:t>
             </w:r>
             <w:r>
               <w:rPr>
@@ -1789,24 +1851,29 @@
     </w:tbl>
     <w:p>
       <w:pPr>
-        <w:pStyle w:val="Ttulo1"/>
+        <w:pStyle w:val="2"/>
         <w:numPr>
           <w:ilvl w:val="0"/>
           <w:numId w:val="1"/>
         </w:numPr>
       </w:pPr>
-      <w:bookmarkStart w:id="8" w:name="_heading=h.l8kylbflnjwg" w:colFirst="0" w:colLast="0"/>
-      <w:bookmarkEnd w:id="8"/>
+      <w:bookmarkStart w:id="5" w:name="_heading=h.l8kylbflnjwg" w:colFirst="0" w:colLast="0"/>
+      <w:bookmarkEnd w:id="5"/>
     </w:p>
     <w:p/>
     <w:p/>
     <w:tbl>
       <w:tblPr>
-        <w:tblStyle w:val="af1"/>
+        <w:tblStyle w:val="43"/>
         <w:tblW w:w="10548" w:type="dxa"/>
         <w:tblInd w:w="-108" w:type="dxa"/>
         <w:tblLayout w:type="fixed"/>
-        <w:tblLook w:val="0000" w:firstRow="0" w:lastRow="0" w:firstColumn="0" w:lastColumn="0" w:noHBand="0" w:noVBand="0"/>
+        <w:tblCellMar>
+          <w:top w:w="0" w:type="dxa"/>
+          <w:left w:w="108" w:type="dxa"/>
+          <w:bottom w:w="0" w:type="dxa"/>
+          <w:right w:w="108" w:type="dxa"/>
+        </w:tblCellMar>
       </w:tblPr>
       <w:tblGrid>
         <w:gridCol w:w="2628"/>
@@ -1814,15 +1881,23 @@
         <w:gridCol w:w="6120"/>
       </w:tblGrid>
       <w:tr>
+        <w:tblPrEx>
+          <w:tblCellMar>
+            <w:top w:w="0" w:type="dxa"/>
+            <w:left w:w="108" w:type="dxa"/>
+            <w:bottom w:w="0" w:type="dxa"/>
+            <w:right w:w="108" w:type="dxa"/>
+          </w:tblCellMar>
+        </w:tblPrEx>
         <w:tc>
           <w:tcPr>
             <w:tcW w:w="10548" w:type="dxa"/>
             <w:gridSpan w:val="3"/>
             <w:tcBorders>
-              <w:top w:val="single" w:sz="4" w:space="0" w:color="000000"/>
-              <w:left w:val="single" w:sz="4" w:space="0" w:color="000000"/>
-              <w:bottom w:val="single" w:sz="4" w:space="0" w:color="000000"/>
-              <w:right w:val="single" w:sz="4" w:space="0" w:color="000000"/>
+              <w:top w:val="single" w:color="000000" w:sz="4" w:space="0"/>
+              <w:left w:val="single" w:color="000000" w:sz="4" w:space="0"/>
+              <w:bottom w:val="single" w:color="000000" w:sz="4" w:space="0"/>
+              <w:right w:val="single" w:color="000000" w:sz="4" w:space="0"/>
             </w:tcBorders>
             <w:shd w:val="clear" w:color="auto" w:fill="auto"/>
           </w:tcPr>
@@ -1842,14 +1917,22 @@
         </w:tc>
       </w:tr>
       <w:tr>
+        <w:tblPrEx>
+          <w:tblCellMar>
+            <w:top w:w="0" w:type="dxa"/>
+            <w:left w:w="108" w:type="dxa"/>
+            <w:bottom w:w="0" w:type="dxa"/>
+            <w:right w:w="108" w:type="dxa"/>
+          </w:tblCellMar>
+        </w:tblPrEx>
         <w:tc>
           <w:tcPr>
             <w:tcW w:w="2628" w:type="dxa"/>
             <w:tcBorders>
-              <w:top w:val="single" w:sz="4" w:space="0" w:color="000000"/>
-              <w:left w:val="single" w:sz="4" w:space="0" w:color="000000"/>
-              <w:bottom w:val="single" w:sz="4" w:space="0" w:color="000000"/>
-              <w:right w:val="single" w:sz="4" w:space="0" w:color="000000"/>
+              <w:top w:val="single" w:color="000000" w:sz="4" w:space="0"/>
+              <w:left w:val="single" w:color="000000" w:sz="4" w:space="0"/>
+              <w:bottom w:val="single" w:color="000000" w:sz="4" w:space="0"/>
+              <w:right w:val="single" w:color="000000" w:sz="4" w:space="0"/>
             </w:tcBorders>
             <w:shd w:val="clear" w:color="auto" w:fill="auto"/>
           </w:tcPr>
@@ -1866,10 +1949,10 @@
           <w:tcPr>
             <w:tcW w:w="1800" w:type="dxa"/>
             <w:tcBorders>
-              <w:top w:val="single" w:sz="4" w:space="0" w:color="000000"/>
-              <w:left w:val="single" w:sz="4" w:space="0" w:color="000000"/>
-              <w:bottom w:val="single" w:sz="4" w:space="0" w:color="000000"/>
-              <w:right w:val="single" w:sz="4" w:space="0" w:color="000000"/>
+              <w:top w:val="single" w:color="000000" w:sz="4" w:space="0"/>
+              <w:left w:val="single" w:color="000000" w:sz="4" w:space="0"/>
+              <w:bottom w:val="single" w:color="000000" w:sz="4" w:space="0"/>
+              <w:right w:val="single" w:color="000000" w:sz="4" w:space="0"/>
             </w:tcBorders>
             <w:shd w:val="clear" w:color="auto" w:fill="auto"/>
           </w:tcPr>
@@ -1886,10 +1969,10 @@
           <w:tcPr>
             <w:tcW w:w="6120" w:type="dxa"/>
             <w:tcBorders>
-              <w:top w:val="single" w:sz="4" w:space="0" w:color="000000"/>
-              <w:left w:val="single" w:sz="4" w:space="0" w:color="000000"/>
-              <w:bottom w:val="single" w:sz="4" w:space="0" w:color="000000"/>
-              <w:right w:val="single" w:sz="4" w:space="0" w:color="000000"/>
+              <w:top w:val="single" w:color="000000" w:sz="4" w:space="0"/>
+              <w:left w:val="single" w:color="000000" w:sz="4" w:space="0"/>
+              <w:bottom w:val="single" w:color="000000" w:sz="4" w:space="0"/>
+              <w:right w:val="single" w:color="000000" w:sz="4" w:space="0"/>
             </w:tcBorders>
             <w:shd w:val="clear" w:color="auto" w:fill="auto"/>
           </w:tcPr>
@@ -1904,14 +1987,22 @@
         </w:tc>
       </w:tr>
       <w:tr>
+        <w:tblPrEx>
+          <w:tblCellMar>
+            <w:top w:w="0" w:type="dxa"/>
+            <w:left w:w="108" w:type="dxa"/>
+            <w:bottom w:w="0" w:type="dxa"/>
+            <w:right w:w="108" w:type="dxa"/>
+          </w:tblCellMar>
+        </w:tblPrEx>
         <w:tc>
           <w:tcPr>
             <w:tcW w:w="2628" w:type="dxa"/>
             <w:tcBorders>
-              <w:top w:val="single" w:sz="4" w:space="0" w:color="000000"/>
-              <w:left w:val="single" w:sz="4" w:space="0" w:color="000000"/>
-              <w:bottom w:val="single" w:sz="4" w:space="0" w:color="000000"/>
-              <w:right w:val="single" w:sz="4" w:space="0" w:color="000000"/>
+              <w:top w:val="single" w:color="000000" w:sz="4" w:space="0"/>
+              <w:left w:val="single" w:color="000000" w:sz="4" w:space="0"/>
+              <w:bottom w:val="single" w:color="000000" w:sz="4" w:space="0"/>
+              <w:right w:val="single" w:color="000000" w:sz="4" w:space="0"/>
             </w:tcBorders>
             <w:shd w:val="clear" w:color="auto" w:fill="auto"/>
           </w:tcPr>
@@ -1920,16 +2011,7 @@
               <w:jc w:val="center"/>
             </w:pPr>
             <w:r>
-              <w:t>01</w:t>
-            </w:r>
-            <w:r>
-              <w:t>/0</w:t>
-            </w:r>
-            <w:r>
-              <w:t>9</w:t>
-            </w:r>
-            <w:r>
-              <w:t>/2025</w:t>
+              <w:t>01/09/2025</w:t>
             </w:r>
           </w:p>
         </w:tc>
@@ -1937,10 +2019,10 @@
           <w:tcPr>
             <w:tcW w:w="1800" w:type="dxa"/>
             <w:tcBorders>
-              <w:top w:val="single" w:sz="4" w:space="0" w:color="000000"/>
-              <w:left w:val="single" w:sz="4" w:space="0" w:color="000000"/>
-              <w:bottom w:val="single" w:sz="4" w:space="0" w:color="000000"/>
-              <w:right w:val="single" w:sz="4" w:space="0" w:color="000000"/>
+              <w:top w:val="single" w:color="000000" w:sz="4" w:space="0"/>
+              <w:left w:val="single" w:color="000000" w:sz="4" w:space="0"/>
+              <w:bottom w:val="single" w:color="000000" w:sz="4" w:space="0"/>
+              <w:right w:val="single" w:color="000000" w:sz="4" w:space="0"/>
             </w:tcBorders>
             <w:shd w:val="clear" w:color="auto" w:fill="auto"/>
           </w:tcPr>
@@ -1948,13 +2030,8 @@
             <w:pPr>
               <w:jc w:val="center"/>
             </w:pPr>
-            <w:proofErr w:type="spellStart"/>
-            <w:r>
-              <w:t>Kauan</w:t>
-            </w:r>
-            <w:proofErr w:type="spellEnd"/>
-            <w:r>
-              <w:t xml:space="preserve"> Felipe</w:t>
+            <w:r>
+              <w:t>Kauan Felipe</w:t>
             </w:r>
           </w:p>
         </w:tc>
@@ -1962,10 +2039,10 @@
           <w:tcPr>
             <w:tcW w:w="6120" w:type="dxa"/>
             <w:tcBorders>
-              <w:top w:val="single" w:sz="4" w:space="0" w:color="000000"/>
-              <w:left w:val="single" w:sz="4" w:space="0" w:color="000000"/>
-              <w:bottom w:val="single" w:sz="4" w:space="0" w:color="000000"/>
-              <w:right w:val="single" w:sz="4" w:space="0" w:color="000000"/>
+              <w:top w:val="single" w:color="000000" w:sz="4" w:space="0"/>
+              <w:left w:val="single" w:color="000000" w:sz="4" w:space="0"/>
+              <w:bottom w:val="single" w:color="000000" w:sz="4" w:space="0"/>
+              <w:right w:val="single" w:color="000000" w:sz="4" w:space="0"/>
             </w:tcBorders>
             <w:shd w:val="clear" w:color="auto" w:fill="auto"/>
           </w:tcPr>
@@ -1985,14 +2062,22 @@
         </w:tc>
       </w:tr>
       <w:tr>
+        <w:tblPrEx>
+          <w:tblCellMar>
+            <w:top w:w="0" w:type="dxa"/>
+            <w:left w:w="108" w:type="dxa"/>
+            <w:bottom w:w="0" w:type="dxa"/>
+            <w:right w:w="108" w:type="dxa"/>
+          </w:tblCellMar>
+        </w:tblPrEx>
         <w:tc>
           <w:tcPr>
             <w:tcW w:w="2628" w:type="dxa"/>
             <w:tcBorders>
-              <w:top w:val="single" w:sz="4" w:space="0" w:color="000000"/>
-              <w:left w:val="single" w:sz="4" w:space="0" w:color="000000"/>
-              <w:bottom w:val="single" w:sz="4" w:space="0" w:color="000000"/>
-              <w:right w:val="single" w:sz="4" w:space="0" w:color="000000"/>
+              <w:top w:val="single" w:color="000000" w:sz="4" w:space="0"/>
+              <w:left w:val="single" w:color="000000" w:sz="4" w:space="0"/>
+              <w:bottom w:val="single" w:color="000000" w:sz="4" w:space="0"/>
+              <w:right w:val="single" w:color="000000" w:sz="4" w:space="0"/>
             </w:tcBorders>
             <w:shd w:val="clear" w:color="auto" w:fill="auto"/>
           </w:tcPr>
@@ -2009,10 +2094,10 @@
           <w:tcPr>
             <w:tcW w:w="1800" w:type="dxa"/>
             <w:tcBorders>
-              <w:top w:val="single" w:sz="4" w:space="0" w:color="000000"/>
-              <w:left w:val="single" w:sz="4" w:space="0" w:color="000000"/>
-              <w:bottom w:val="single" w:sz="4" w:space="0" w:color="000000"/>
-              <w:right w:val="single" w:sz="4" w:space="0" w:color="000000"/>
+              <w:top w:val="single" w:color="000000" w:sz="4" w:space="0"/>
+              <w:left w:val="single" w:color="000000" w:sz="4" w:space="0"/>
+              <w:bottom w:val="single" w:color="000000" w:sz="4" w:space="0"/>
+              <w:right w:val="single" w:color="000000" w:sz="4" w:space="0"/>
             </w:tcBorders>
             <w:shd w:val="clear" w:color="auto" w:fill="auto"/>
           </w:tcPr>
@@ -2029,10 +2114,10 @@
           <w:tcPr>
             <w:tcW w:w="6120" w:type="dxa"/>
             <w:tcBorders>
-              <w:top w:val="single" w:sz="4" w:space="0" w:color="000000"/>
-              <w:left w:val="single" w:sz="4" w:space="0" w:color="000000"/>
-              <w:bottom w:val="single" w:sz="4" w:space="0" w:color="000000"/>
-              <w:right w:val="single" w:sz="4" w:space="0" w:color="000000"/>
+              <w:top w:val="single" w:color="000000" w:sz="4" w:space="0"/>
+              <w:left w:val="single" w:color="000000" w:sz="4" w:space="0"/>
+              <w:bottom w:val="single" w:color="000000" w:sz="4" w:space="0"/>
+              <w:right w:val="single" w:color="000000" w:sz="4" w:space="0"/>
             </w:tcBorders>
             <w:shd w:val="clear" w:color="auto" w:fill="auto"/>
           </w:tcPr>
@@ -2041,169 +2126,166 @@
               <w:jc w:val="center"/>
             </w:pPr>
             <w:r>
-              <w:t>Correção do Caso de Uso e adição de Fluxos de Exceção.</w:t>
+              <w:rPr>
+                <w:rFonts w:hint="default"/>
+                <w:lang w:val="pt-BR"/>
+              </w:rPr>
+              <w:t>A</w:t>
+            </w:r>
+            <w:r>
+              <w:t>dição de Fluxos de Exceção.</w:t>
+            </w:r>
+          </w:p>
+        </w:tc>
+      </w:tr>
+      <w:tr>
+        <w:tblPrEx>
+          <w:tblCellMar>
+            <w:top w:w="0" w:type="dxa"/>
+            <w:left w:w="108" w:type="dxa"/>
+            <w:bottom w:w="0" w:type="dxa"/>
+            <w:right w:w="108" w:type="dxa"/>
+          </w:tblCellMar>
+        </w:tblPrEx>
+        <w:tc>
+          <w:tcPr>
+            <w:tcW w:w="2628" w:type="dxa"/>
+            <w:tcBorders>
+              <w:top w:val="single" w:color="000000" w:sz="4" w:space="0"/>
+              <w:left w:val="single" w:color="000000" w:sz="4" w:space="0"/>
+              <w:bottom w:val="single" w:color="000000" w:sz="4" w:space="0"/>
+              <w:right w:val="single" w:color="000000" w:sz="4" w:space="0"/>
+            </w:tcBorders>
+            <w:shd w:val="clear" w:color="auto" w:fill="auto"/>
+          </w:tcPr>
+          <w:p>
+            <w:pPr>
+              <w:jc w:val="center"/>
+              <w:rPr>
+                <w:rFonts w:hint="default"/>
+                <w:lang w:val="pt-BR"/>
+              </w:rPr>
+            </w:pPr>
+            <w:r>
+              <w:rPr>
+                <w:rFonts w:hint="default"/>
+                <w:lang w:val="pt-BR"/>
+              </w:rPr>
+              <w:t>07</w:t>
+            </w:r>
+            <w:r>
+              <w:rPr>
+                <w:vertAlign w:val="baseline"/>
+                <w:rtl w:val="0"/>
+              </w:rPr>
+              <w:t>/</w:t>
+            </w:r>
+            <w:r>
+              <w:rPr>
+                <w:rFonts w:hint="default"/>
+                <w:vertAlign w:val="baseline"/>
+                <w:rtl w:val="0"/>
+                <w:lang w:val="pt-BR"/>
+              </w:rPr>
+              <w:t>11</w:t>
+            </w:r>
+            <w:r>
+              <w:rPr>
+                <w:vertAlign w:val="baseline"/>
+                <w:rtl w:val="0"/>
+              </w:rPr>
+              <w:t>/</w:t>
+            </w:r>
+            <w:r>
+              <w:rPr>
+                <w:rFonts w:hint="default"/>
+                <w:vertAlign w:val="baseline"/>
+                <w:rtl w:val="0"/>
+                <w:lang w:val="pt-BR"/>
+              </w:rPr>
+              <w:t>2025</w:t>
+            </w:r>
+          </w:p>
+        </w:tc>
+        <w:tc>
+          <w:tcPr>
+            <w:tcW w:w="1800" w:type="dxa"/>
+            <w:tcBorders>
+              <w:top w:val="single" w:color="000000" w:sz="4" w:space="0"/>
+              <w:left w:val="single" w:color="000000" w:sz="4" w:space="0"/>
+              <w:bottom w:val="single" w:color="000000" w:sz="4" w:space="0"/>
+              <w:right w:val="single" w:color="000000" w:sz="4" w:space="0"/>
+            </w:tcBorders>
+            <w:shd w:val="clear" w:color="auto" w:fill="auto"/>
+          </w:tcPr>
+          <w:p>
+            <w:pPr>
+              <w:jc w:val="center"/>
+              <w:rPr>
+                <w:rFonts w:hint="default"/>
+                <w:lang w:val="pt-BR"/>
+              </w:rPr>
+            </w:pPr>
+            <w:r>
+              <w:rPr>
+                <w:rFonts w:hint="default"/>
+                <w:lang w:val="pt-BR"/>
+              </w:rPr>
+              <w:t>Kauan Felipe</w:t>
+            </w:r>
+          </w:p>
+        </w:tc>
+        <w:tc>
+          <w:tcPr>
+            <w:tcW w:w="6120" w:type="dxa"/>
+            <w:tcBorders>
+              <w:top w:val="single" w:color="000000" w:sz="4" w:space="0"/>
+              <w:left w:val="single" w:color="000000" w:sz="4" w:space="0"/>
+              <w:bottom w:val="single" w:color="000000" w:sz="4" w:space="0"/>
+              <w:right w:val="single" w:color="000000" w:sz="4" w:space="0"/>
+            </w:tcBorders>
+            <w:shd w:val="clear" w:color="auto" w:fill="auto"/>
+          </w:tcPr>
+          <w:p>
+            <w:pPr>
+              <w:jc w:val="center"/>
+              <w:rPr>
+                <w:rFonts w:hint="default"/>
+                <w:lang w:val="pt-BR"/>
+              </w:rPr>
+            </w:pPr>
+            <w:r>
+              <w:rPr>
+                <w:rFonts w:hint="default"/>
+                <w:lang w:val="pt-BR"/>
+              </w:rPr>
+              <w:t>Correção no numero das telas</w:t>
             </w:r>
           </w:p>
         </w:tc>
       </w:tr>
     </w:tbl>
-    <w:p/>
+    <w:p>
+      <w:bookmarkStart w:id="6" w:name="_GoBack"/>
+      <w:bookmarkEnd w:id="6"/>
+    </w:p>
     <w:sectPr>
       <w:pgSz w:w="11906" w:h="16838"/>
       <w:pgMar w:top="1418" w:right="851" w:bottom="1418" w:left="851" w:header="720" w:footer="720" w:gutter="0"/>
       <w:pgNumType w:start="1"/>
-      <w:cols w:space="720"/>
+      <w:cols w:space="720" w:num="1"/>
     </w:sectPr>
   </w:body>
 </w:document>
 </file>
 
-<file path=word/comments.xml><?xml version="1.0" encoding="utf-8"?>
-<w:comments xmlns:wpc="http://schemas.microsoft.com/office/word/2010/wordprocessingCanvas" xmlns:cx="http://schemas.microsoft.com/office/drawing/2014/chartex" xmlns:cx1="http://schemas.microsoft.com/office/drawing/2015/9/8/chartex" xmlns:cx2="http://schemas.microsoft.com/office/drawing/2015/10/21/chartex" xmlns:cx3="http://schemas.microsoft.com/office/drawing/2016/5/9/chartex" xmlns:cx4="http://schemas.microsoft.com/office/drawing/2016/5/10/chartex" xmlns:cx5="http://schemas.microsoft.com/office/drawing/2016/5/11/chartex" xmlns:cx6="http://schemas.microsoft.com/office/drawing/2016/5/12/chartex" xmlns:cx7="http://schemas.microsoft.com/office/drawing/2016/5/13/chartex" xmlns:cx8="http://schemas.microsoft.com/office/drawing/2016/5/14/chartex" xmlns:mc="http://schemas.openxmlformats.org/markup-compatibility/2006" xmlns:aink="http://schemas.microsoft.com/office/drawing/2016/ink" xmlns:am3d="http://schemas.microsoft.com/office/drawing/2017/model3d" xmlns:o="urn:schemas-microsoft-com:office:office" xmlns:r="http://schemas.openxmlformats.org/officeDocument/2006/relationships" xmlns:m="http://schemas.openxmlformats.org/officeDocument/2006/math" xmlns:v="urn:schemas-microsoft-com:vml" xmlns:wp14="http://schemas.microsoft.com/office/word/2010/wordprocessingDrawing" xmlns:wp="http://schemas.openxmlformats.org/drawingml/2006/wordprocessingDrawing" xmlns:w10="urn:schemas-microsoft-com:office:word" xmlns:w="http://schemas.openxmlformats.org/wordprocessingml/2006/main" xmlns:w14="http://schemas.microsoft.com/office/word/2010/wordml" xmlns:w15="http://schemas.microsoft.com/office/word/2012/wordml" xmlns:w16cex="http://schemas.microsoft.com/office/word/2018/wordml/cex" xmlns:w16cid="http://schemas.microsoft.com/office/word/2016/wordml/cid" xmlns:w16="http://schemas.microsoft.com/office/word/2018/wordml" xmlns:w16se="http://schemas.microsoft.com/office/word/2015/wordml/symex" xmlns:wpg="http://schemas.microsoft.com/office/word/2010/wordprocessingGroup" xmlns:wpi="http://schemas.microsoft.com/office/word/2010/wordprocessingInk" xmlns:wne="http://schemas.microsoft.com/office/word/2006/wordml" xmlns:wps="http://schemas.microsoft.com/office/word/2010/wordprocessingShape" mc:Ignorable="w14 w15 w16se w16cid w16 w16cex wp14">
-  <w:comment w:id="4" w:author="KAUAN FELIPE BRILHANTE RESENDE" w:date="2025-09-02T16:10:00Z" w:initials="">
-    <w:p>
-      <w:pPr>
-        <w:widowControl w:val="0"/>
-        <w:pBdr>
-          <w:top w:val="nil"/>
-          <w:left w:val="nil"/>
-          <w:bottom w:val="nil"/>
-          <w:right w:val="nil"/>
-          <w:between w:val="nil"/>
-        </w:pBdr>
-        <w:rPr>
-          <w:rFonts w:ascii="Arial" w:eastAsia="Arial" w:hAnsi="Arial" w:cs="Arial"/>
-          <w:color w:val="000000"/>
-          <w:sz w:val="22"/>
-          <w:szCs w:val="22"/>
-        </w:rPr>
-      </w:pPr>
-      <w:proofErr w:type="spellStart"/>
-      <w:r>
-        <w:rPr>
-          <w:rFonts w:ascii="Arial" w:eastAsia="Arial" w:hAnsi="Arial" w:cs="Arial"/>
-          <w:color w:val="000000"/>
-          <w:sz w:val="22"/>
-          <w:szCs w:val="22"/>
-        </w:rPr>
-        <w:t>oq</w:t>
-      </w:r>
-      <w:proofErr w:type="spellEnd"/>
-      <w:r>
-        <w:rPr>
-          <w:rFonts w:ascii="Arial" w:eastAsia="Arial" w:hAnsi="Arial" w:cs="Arial"/>
-          <w:color w:val="000000"/>
-          <w:sz w:val="22"/>
-          <w:szCs w:val="22"/>
-        </w:rPr>
-        <w:t xml:space="preserve"> colocar </w:t>
-      </w:r>
-      <w:proofErr w:type="spellStart"/>
-      <w:r>
-        <w:rPr>
-          <w:rFonts w:ascii="Arial" w:eastAsia="Arial" w:hAnsi="Arial" w:cs="Arial"/>
-          <w:color w:val="000000"/>
-          <w:sz w:val="22"/>
-          <w:szCs w:val="22"/>
-        </w:rPr>
-        <w:t>aq</w:t>
-      </w:r>
-      <w:proofErr w:type="spellEnd"/>
-      <w:r>
-        <w:rPr>
-          <w:rFonts w:ascii="Arial" w:eastAsia="Arial" w:hAnsi="Arial" w:cs="Arial"/>
-          <w:color w:val="000000"/>
-          <w:sz w:val="22"/>
-          <w:szCs w:val="22"/>
-        </w:rPr>
-        <w:t>?</w:t>
-      </w:r>
-    </w:p>
-  </w:comment>
-  <w:comment w:id="7" w:author="KAUAN FELIPE BRILHANTE RESENDE" w:date="2025-09-02T16:10:00Z" w:initials="">
-    <w:p>
-      <w:pPr>
-        <w:widowControl w:val="0"/>
-        <w:pBdr>
-          <w:top w:val="nil"/>
-          <w:left w:val="nil"/>
-          <w:bottom w:val="nil"/>
-          <w:right w:val="nil"/>
-          <w:between w:val="nil"/>
-        </w:pBdr>
-        <w:rPr>
-          <w:rFonts w:ascii="Arial" w:eastAsia="Arial" w:hAnsi="Arial" w:cs="Arial"/>
-          <w:color w:val="000000"/>
-          <w:sz w:val="22"/>
-          <w:szCs w:val="22"/>
-        </w:rPr>
-      </w:pPr>
-      <w:proofErr w:type="spellStart"/>
-      <w:r>
-        <w:rPr>
-          <w:rFonts w:ascii="Arial" w:eastAsia="Arial" w:hAnsi="Arial" w:cs="Arial"/>
-          <w:color w:val="000000"/>
-          <w:sz w:val="22"/>
-          <w:szCs w:val="22"/>
-        </w:rPr>
-        <w:t>oq</w:t>
-      </w:r>
-      <w:proofErr w:type="spellEnd"/>
-      <w:r>
-        <w:rPr>
-          <w:rFonts w:ascii="Arial" w:eastAsia="Arial" w:hAnsi="Arial" w:cs="Arial"/>
-          <w:color w:val="000000"/>
-          <w:sz w:val="22"/>
-          <w:szCs w:val="22"/>
-        </w:rPr>
-        <w:t xml:space="preserve"> colocar </w:t>
-      </w:r>
-      <w:proofErr w:type="spellStart"/>
-      <w:r>
-        <w:rPr>
-          <w:rFonts w:ascii="Arial" w:eastAsia="Arial" w:hAnsi="Arial" w:cs="Arial"/>
-          <w:color w:val="000000"/>
-          <w:sz w:val="22"/>
-          <w:szCs w:val="22"/>
-        </w:rPr>
-        <w:t>aq</w:t>
-      </w:r>
-      <w:proofErr w:type="spellEnd"/>
-      <w:r>
-        <w:rPr>
-          <w:rFonts w:ascii="Arial" w:eastAsia="Arial" w:hAnsi="Arial" w:cs="Arial"/>
-          <w:color w:val="000000"/>
-          <w:sz w:val="22"/>
-          <w:szCs w:val="22"/>
-        </w:rPr>
-        <w:t>?</w:t>
-      </w:r>
-    </w:p>
-  </w:comment>
-</w:comments>
-</file>
-
-<file path=word/commentsExtended.xml><?xml version="1.0" encoding="utf-8"?>
-<w15:commentsEx xmlns:wpc="http://schemas.microsoft.com/office/word/2010/wordprocessingCanvas" xmlns:cx="http://schemas.microsoft.com/office/drawing/2014/chartex" xmlns:cx1="http://schemas.microsoft.com/office/drawing/2015/9/8/chartex" xmlns:cx2="http://schemas.microsoft.com/office/drawing/2015/10/21/chartex" xmlns:cx3="http://schemas.microsoft.com/office/drawing/2016/5/9/chartex" xmlns:cx4="http://schemas.microsoft.com/office/drawing/2016/5/10/chartex" xmlns:cx5="http://schemas.microsoft.com/office/drawing/2016/5/11/chartex" xmlns:cx6="http://schemas.microsoft.com/office/drawing/2016/5/12/chartex" xmlns:cx7="http://schemas.microsoft.com/office/drawing/2016/5/13/chartex" xmlns:cx8="http://schemas.microsoft.com/office/drawing/2016/5/14/chartex" xmlns:mc="http://schemas.openxmlformats.org/markup-compatibility/2006" xmlns:aink="http://schemas.microsoft.com/office/drawing/2016/ink" xmlns:am3d="http://schemas.microsoft.com/office/drawing/2017/model3d" xmlns:o="urn:schemas-microsoft-com:office:office" xmlns:r="http://schemas.openxmlformats.org/officeDocument/2006/relationships" xmlns:m="http://schemas.openxmlformats.org/officeDocument/2006/math" xmlns:v="urn:schemas-microsoft-com:vml" xmlns:wp14="http://schemas.microsoft.com/office/word/2010/wordprocessingDrawing" xmlns:wp="http://schemas.openxmlformats.org/drawingml/2006/wordprocessingDrawing" xmlns:w10="urn:schemas-microsoft-com:office:word" xmlns:w="http://schemas.openxmlformats.org/wordprocessingml/2006/main" xmlns:w14="http://schemas.microsoft.com/office/word/2010/wordml" xmlns:w15="http://schemas.microsoft.com/office/word/2012/wordml" xmlns:w16cex="http://schemas.microsoft.com/office/word/2018/wordml/cex" xmlns:w16cid="http://schemas.microsoft.com/office/word/2016/wordml/cid" xmlns:w16="http://schemas.microsoft.com/office/word/2018/wordml" xmlns:w16se="http://schemas.microsoft.com/office/word/2015/wordml/symex" xmlns:wpg="http://schemas.microsoft.com/office/word/2010/wordprocessingGroup" xmlns:wpi="http://schemas.microsoft.com/office/word/2010/wordprocessingInk" xmlns:wne="http://schemas.microsoft.com/office/word/2006/wordml" xmlns:wps="http://schemas.microsoft.com/office/word/2010/wordprocessingShape" mc:Ignorable="w14 w15 w16se w16cid w16 w16cex wp14">
-  <w15:commentEx w15:paraId="00000066" w15:done="0"/>
-  <w15:commentEx w15:paraId="00000064" w15:done="0"/>
-</w15:commentsEx>
-</file>
-
-<file path=word/commentsIds.xml><?xml version="1.0" encoding="utf-8"?>
-<w16cid:commentsIds xmlns:wpc="http://schemas.microsoft.com/office/word/2010/wordprocessingCanvas" xmlns:cx="http://schemas.microsoft.com/office/drawing/2014/chartex" xmlns:cx1="http://schemas.microsoft.com/office/drawing/2015/9/8/chartex" xmlns:cx2="http://schemas.microsoft.com/office/drawing/2015/10/21/chartex" xmlns:cx3="http://schemas.microsoft.com/office/drawing/2016/5/9/chartex" xmlns:cx4="http://schemas.microsoft.com/office/drawing/2016/5/10/chartex" xmlns:cx5="http://schemas.microsoft.com/office/drawing/2016/5/11/chartex" xmlns:cx6="http://schemas.microsoft.com/office/drawing/2016/5/12/chartex" xmlns:cx7="http://schemas.microsoft.com/office/drawing/2016/5/13/chartex" xmlns:cx8="http://schemas.microsoft.com/office/drawing/2016/5/14/chartex" xmlns:mc="http://schemas.openxmlformats.org/markup-compatibility/2006" xmlns:aink="http://schemas.microsoft.com/office/drawing/2016/ink" xmlns:am3d="http://schemas.microsoft.com/office/drawing/2017/model3d" xmlns:o="urn:schemas-microsoft-com:office:office" xmlns:r="http://schemas.openxmlformats.org/officeDocument/2006/relationships" xmlns:m="http://schemas.openxmlformats.org/officeDocument/2006/math" xmlns:v="urn:schemas-microsoft-com:vml" xmlns:wp14="http://schemas.microsoft.com/office/word/2010/wordprocessingDrawing" xmlns:wp="http://schemas.openxmlformats.org/drawingml/2006/wordprocessingDrawing" xmlns:w10="urn:schemas-microsoft-com:office:word" xmlns:w="http://schemas.openxmlformats.org/wordprocessingml/2006/main" xmlns:w14="http://schemas.microsoft.com/office/word/2010/wordml" xmlns:w15="http://schemas.microsoft.com/office/word/2012/wordml" xmlns:w16cex="http://schemas.microsoft.com/office/word/2018/wordml/cex" xmlns:w16cid="http://schemas.microsoft.com/office/word/2016/wordml/cid" xmlns:w16="http://schemas.microsoft.com/office/word/2018/wordml" xmlns:w16se="http://schemas.microsoft.com/office/word/2015/wordml/symex" xmlns:wpg="http://schemas.microsoft.com/office/word/2010/wordprocessingGroup" xmlns:wpi="http://schemas.microsoft.com/office/word/2010/wordprocessingInk" xmlns:wne="http://schemas.microsoft.com/office/word/2006/wordml" xmlns:wps="http://schemas.microsoft.com/office/word/2010/wordprocessingShape" mc:Ignorable="w14 w15 w16se w16cid w16 w16cex wp14">
-  <w16cid:commentId w16cid:paraId="00000066" w16cid:durableId="2CB397E4"/>
-  <w16cid:commentId w16cid:paraId="00000064" w16cid:durableId="2CB397E3"/>
-</w16cid:commentsIds>
-</file>
-
 <file path=word/numbering.xml><?xml version="1.0" encoding="utf-8"?>
-<w:numbering xmlns:wpc="http://schemas.microsoft.com/office/word/2010/wordprocessingCanvas" xmlns:cx="http://schemas.microsoft.com/office/drawing/2014/chartex" xmlns:cx1="http://schemas.microsoft.com/office/drawing/2015/9/8/chartex" xmlns:cx2="http://schemas.microsoft.com/office/drawing/2015/10/21/chartex" xmlns:cx3="http://schemas.microsoft.com/office/drawing/2016/5/9/chartex" xmlns:cx4="http://schemas.microsoft.com/office/drawing/2016/5/10/chartex" xmlns:cx5="http://schemas.microsoft.com/office/drawing/2016/5/11/chartex" xmlns:cx6="http://schemas.microsoft.com/office/drawing/2016/5/12/chartex" xmlns:cx7="http://schemas.microsoft.com/office/drawing/2016/5/13/chartex" xmlns:cx8="http://schemas.microsoft.com/office/drawing/2016/5/14/chartex" xmlns:mc="http://schemas.openxmlformats.org/markup-compatibility/2006" xmlns:aink="http://schemas.microsoft.com/office/drawing/2016/ink" xmlns:am3d="http://schemas.microsoft.com/office/drawing/2017/model3d" xmlns:o="urn:schemas-microsoft-com:office:office" xmlns:r="http://schemas.openxmlformats.org/officeDocument/2006/relationships" xmlns:m="http://schemas.openxmlformats.org/officeDocument/2006/math" xmlns:v="urn:schemas-microsoft-com:vml" xmlns:wp14="http://schemas.microsoft.com/office/word/2010/wordprocessingDrawing" xmlns:wp="http://schemas.openxmlformats.org/drawingml/2006/wordprocessingDrawing" xmlns:w10="urn:schemas-microsoft-com:office:word" xmlns:w="http://schemas.openxmlformats.org/wordprocessingml/2006/main" xmlns:w14="http://schemas.microsoft.com/office/word/2010/wordml" xmlns:w15="http://schemas.microsoft.com/office/word/2012/wordml" xmlns:w16cex="http://schemas.microsoft.com/office/word/2018/wordml/cex" xmlns:w16cid="http://schemas.microsoft.com/office/word/2016/wordml/cid" xmlns:w16="http://schemas.microsoft.com/office/word/2018/wordml" xmlns:w16se="http://schemas.microsoft.com/office/word/2015/wordml/symex" xmlns:wpg="http://schemas.microsoft.com/office/word/2010/wordprocessingGroup" xmlns:wpi="http://schemas.microsoft.com/office/word/2010/wordprocessingInk" xmlns:wne="http://schemas.microsoft.com/office/word/2006/wordml" xmlns:wps="http://schemas.microsoft.com/office/word/2010/wordprocessingShape" mc:Ignorable="w14 w15 w16se w16cid w16 w16cex wp14">
-  <w:abstractNum w:abstractNumId="0" w15:restartNumberingAfterBreak="0">
+<w:numbering xmlns:wpc="http://schemas.microsoft.com/office/word/2010/wordprocessingCanvas" xmlns:mc="http://schemas.openxmlformats.org/markup-compatibility/2006" xmlns:o="urn:schemas-microsoft-com:office:office" xmlns:r="http://schemas.openxmlformats.org/officeDocument/2006/relationships" xmlns:m="http://schemas.openxmlformats.org/officeDocument/2006/math" xmlns:v="urn:schemas-microsoft-com:vml" xmlns:wp14="http://schemas.microsoft.com/office/word/2010/wordprocessingDrawing" xmlns:wp="http://schemas.openxmlformats.org/drawingml/2006/wordprocessingDrawing" xmlns:w10="urn:schemas-microsoft-com:office:word" xmlns:w="http://schemas.openxmlformats.org/wordprocessingml/2006/main" xmlns:w14="http://schemas.microsoft.com/office/word/2010/wordml" xmlns:wpg="http://schemas.microsoft.com/office/word/2010/wordprocessingGroup" xmlns:wpi="http://schemas.microsoft.com/office/word/2010/wordprocessingInk" xmlns:wne="http://schemas.microsoft.com/office/word/2006/wordml" xmlns:wps="http://schemas.microsoft.com/office/word/2010/wordprocessingShape" xmlns:wpsCustomData="http://www.wps.cn/officeDocument/2013/wpsCustomData" mc:Ignorable="w14 wp14">
+  <w:abstractNum w:abstractNumId="0">
     <w:nsid w:val="19243C87"/>
     <w:multiLevelType w:val="multilevel"/>
-    <w:tmpl w:val="98A2EA9A"/>
-    <w:lvl w:ilvl="0">
+    <w:tmpl w:val="19243C87"/>
+    <w:lvl w:ilvl="0" w:tentative="0">
       <w:start w:val="1"/>
       <w:numFmt w:val="decimal"/>
       <w:lvlText w:val="%1."/>
@@ -2215,7 +2297,7 @@
         <w:u w:val="none"/>
       </w:rPr>
     </w:lvl>
-    <w:lvl w:ilvl="1">
+    <w:lvl w:ilvl="1" w:tentative="0">
       <w:start w:val="1"/>
       <w:numFmt w:val="lowerLetter"/>
       <w:lvlText w:val="%2."/>
@@ -2227,7 +2309,7 @@
         <w:u w:val="none"/>
       </w:rPr>
     </w:lvl>
-    <w:lvl w:ilvl="2">
+    <w:lvl w:ilvl="2" w:tentative="0">
       <w:start w:val="1"/>
       <w:numFmt w:val="lowerRoman"/>
       <w:lvlText w:val="%3."/>
@@ -2239,7 +2321,7 @@
         <w:u w:val="none"/>
       </w:rPr>
     </w:lvl>
-    <w:lvl w:ilvl="3">
+    <w:lvl w:ilvl="3" w:tentative="0">
       <w:start w:val="1"/>
       <w:numFmt w:val="decimal"/>
       <w:lvlText w:val="%4."/>
@@ -2251,7 +2333,7 @@
         <w:u w:val="none"/>
       </w:rPr>
     </w:lvl>
-    <w:lvl w:ilvl="4">
+    <w:lvl w:ilvl="4" w:tentative="0">
       <w:start w:val="1"/>
       <w:numFmt w:val="lowerLetter"/>
       <w:lvlText w:val="%5."/>
@@ -2263,7 +2345,7 @@
         <w:u w:val="none"/>
       </w:rPr>
     </w:lvl>
-    <w:lvl w:ilvl="5">
+    <w:lvl w:ilvl="5" w:tentative="0">
       <w:start w:val="1"/>
       <w:numFmt w:val="lowerRoman"/>
       <w:lvlText w:val="%6."/>
@@ -2275,7 +2357,7 @@
         <w:u w:val="none"/>
       </w:rPr>
     </w:lvl>
-    <w:lvl w:ilvl="6">
+    <w:lvl w:ilvl="6" w:tentative="0">
       <w:start w:val="1"/>
       <w:numFmt w:val="decimal"/>
       <w:lvlText w:val="%7."/>
@@ -2287,7 +2369,7 @@
         <w:u w:val="none"/>
       </w:rPr>
     </w:lvl>
-    <w:lvl w:ilvl="7">
+    <w:lvl w:ilvl="7" w:tentative="0">
       <w:start w:val="1"/>
       <w:numFmt w:val="lowerLetter"/>
       <w:lvlText w:val="%8."/>
@@ -2299,7 +2381,7 @@
         <w:u w:val="none"/>
       </w:rPr>
     </w:lvl>
-    <w:lvl w:ilvl="8">
+    <w:lvl w:ilvl="8" w:tentative="0">
       <w:start w:val="1"/>
       <w:numFmt w:val="lowerRoman"/>
       <w:lvlText w:val="%9."/>
@@ -2312,11 +2394,11 @@
       </w:rPr>
     </w:lvl>
   </w:abstractNum>
-  <w:abstractNum w:abstractNumId="1" w15:restartNumberingAfterBreak="0">
+  <w:abstractNum w:abstractNumId="1">
     <w:nsid w:val="3FAA16C5"/>
     <w:multiLevelType w:val="multilevel"/>
-    <w:tmpl w:val="6BC4B3C2"/>
-    <w:lvl w:ilvl="0">
+    <w:tmpl w:val="3FAA16C5"/>
+    <w:lvl w:ilvl="0" w:tentative="0">
       <w:start w:val="1"/>
       <w:numFmt w:val="decimal"/>
       <w:lvlText w:val=""/>
@@ -2328,7 +2410,7 @@
         <w:vertAlign w:val="baseline"/>
       </w:rPr>
     </w:lvl>
-    <w:lvl w:ilvl="1">
+    <w:lvl w:ilvl="1" w:tentative="0">
       <w:start w:val="1"/>
       <w:numFmt w:val="decimal"/>
       <w:lvlText w:val=""/>
@@ -2340,7 +2422,7 @@
         <w:vertAlign w:val="baseline"/>
       </w:rPr>
     </w:lvl>
-    <w:lvl w:ilvl="2">
+    <w:lvl w:ilvl="2" w:tentative="0">
       <w:start w:val="1"/>
       <w:numFmt w:val="decimal"/>
       <w:lvlText w:val=""/>
@@ -2352,7 +2434,7 @@
         <w:vertAlign w:val="baseline"/>
       </w:rPr>
     </w:lvl>
-    <w:lvl w:ilvl="3">
+    <w:lvl w:ilvl="3" w:tentative="0">
       <w:start w:val="1"/>
       <w:numFmt w:val="decimal"/>
       <w:lvlText w:val=""/>
@@ -2364,7 +2446,7 @@
         <w:vertAlign w:val="baseline"/>
       </w:rPr>
     </w:lvl>
-    <w:lvl w:ilvl="4">
+    <w:lvl w:ilvl="4" w:tentative="0">
       <w:start w:val="1"/>
       <w:numFmt w:val="decimal"/>
       <w:lvlText w:val=""/>
@@ -2376,7 +2458,7 @@
         <w:vertAlign w:val="baseline"/>
       </w:rPr>
     </w:lvl>
-    <w:lvl w:ilvl="5">
+    <w:lvl w:ilvl="5" w:tentative="0">
       <w:start w:val="1"/>
       <w:numFmt w:val="decimal"/>
       <w:lvlText w:val=""/>
@@ -2388,7 +2470,7 @@
         <w:vertAlign w:val="baseline"/>
       </w:rPr>
     </w:lvl>
-    <w:lvl w:ilvl="6">
+    <w:lvl w:ilvl="6" w:tentative="0">
       <w:start w:val="1"/>
       <w:numFmt w:val="decimal"/>
       <w:lvlText w:val=""/>
@@ -2400,7 +2482,7 @@
         <w:vertAlign w:val="baseline"/>
       </w:rPr>
     </w:lvl>
-    <w:lvl w:ilvl="7">
+    <w:lvl w:ilvl="7" w:tentative="0">
       <w:start w:val="1"/>
       <w:numFmt w:val="decimal"/>
       <w:lvlText w:val=""/>
@@ -2412,7 +2494,7 @@
         <w:vertAlign w:val="baseline"/>
       </w:rPr>
     </w:lvl>
-    <w:lvl w:ilvl="8">
+    <w:lvl w:ilvl="8" w:tentative="0">
       <w:start w:val="1"/>
       <w:numFmt w:val="decimal"/>
       <w:lvlText w:val=""/>
@@ -2425,11 +2507,11 @@
       </w:rPr>
     </w:lvl>
   </w:abstractNum>
-  <w:abstractNum w:abstractNumId="2" w15:restartNumberingAfterBreak="0">
+  <w:abstractNum w:abstractNumId="2">
     <w:nsid w:val="461F5695"/>
-    <w:multiLevelType w:val="hybridMultilevel"/>
-    <w:tmpl w:val="0CFC6A28"/>
-    <w:lvl w:ilvl="0" w:tplc="152488D2">
+    <w:multiLevelType w:val="multilevel"/>
+    <w:tmpl w:val="461F5695"/>
+    <w:lvl w:ilvl="0" w:tentative="0">
       <w:start w:val="1"/>
       <w:numFmt w:val="lowerLetter"/>
       <w:lvlText w:val="%1)"/>
@@ -2441,7 +2523,7 @@
         <w:color w:val="auto"/>
       </w:rPr>
     </w:lvl>
-    <w:lvl w:ilvl="1" w:tplc="04160019" w:tentative="1">
+    <w:lvl w:ilvl="1" w:tentative="0">
       <w:start w:val="1"/>
       <w:numFmt w:val="lowerLetter"/>
       <w:lvlText w:val="%2."/>
@@ -2450,7 +2532,7 @@
         <w:ind w:left="1440" w:hanging="360"/>
       </w:pPr>
     </w:lvl>
-    <w:lvl w:ilvl="2" w:tplc="0416001B" w:tentative="1">
+    <w:lvl w:ilvl="2" w:tentative="0">
       <w:start w:val="1"/>
       <w:numFmt w:val="lowerRoman"/>
       <w:lvlText w:val="%3."/>
@@ -2459,7 +2541,7 @@
         <w:ind w:left="2160" w:hanging="180"/>
       </w:pPr>
     </w:lvl>
-    <w:lvl w:ilvl="3" w:tplc="0416000F" w:tentative="1">
+    <w:lvl w:ilvl="3" w:tentative="0">
       <w:start w:val="1"/>
       <w:numFmt w:val="decimal"/>
       <w:lvlText w:val="%4."/>
@@ -2468,7 +2550,7 @@
         <w:ind w:left="2880" w:hanging="360"/>
       </w:pPr>
     </w:lvl>
-    <w:lvl w:ilvl="4" w:tplc="04160019" w:tentative="1">
+    <w:lvl w:ilvl="4" w:tentative="0">
       <w:start w:val="1"/>
       <w:numFmt w:val="lowerLetter"/>
       <w:lvlText w:val="%5."/>
@@ -2477,7 +2559,7 @@
         <w:ind w:left="3600" w:hanging="360"/>
       </w:pPr>
     </w:lvl>
-    <w:lvl w:ilvl="5" w:tplc="0416001B" w:tentative="1">
+    <w:lvl w:ilvl="5" w:tentative="0">
       <w:start w:val="1"/>
       <w:numFmt w:val="lowerRoman"/>
       <w:lvlText w:val="%6."/>
@@ -2486,7 +2568,7 @@
         <w:ind w:left="4320" w:hanging="180"/>
       </w:pPr>
     </w:lvl>
-    <w:lvl w:ilvl="6" w:tplc="0416000F" w:tentative="1">
+    <w:lvl w:ilvl="6" w:tentative="0">
       <w:start w:val="1"/>
       <w:numFmt w:val="decimal"/>
       <w:lvlText w:val="%7."/>
@@ -2495,7 +2577,7 @@
         <w:ind w:left="5040" w:hanging="360"/>
       </w:pPr>
     </w:lvl>
-    <w:lvl w:ilvl="7" w:tplc="04160019" w:tentative="1">
+    <w:lvl w:ilvl="7" w:tentative="0">
       <w:start w:val="1"/>
       <w:numFmt w:val="lowerLetter"/>
       <w:lvlText w:val="%8."/>
@@ -2504,7 +2586,7 @@
         <w:ind w:left="5760" w:hanging="360"/>
       </w:pPr>
     </w:lvl>
-    <w:lvl w:ilvl="8" w:tplc="0416001B" w:tentative="1">
+    <w:lvl w:ilvl="8" w:tentative="0">
       <w:start w:val="1"/>
       <w:numFmt w:val="lowerRoman"/>
       <w:lvlText w:val="%9."/>
@@ -2514,11 +2596,11 @@
       </w:pPr>
     </w:lvl>
   </w:abstractNum>
-  <w:abstractNum w:abstractNumId="3" w15:restartNumberingAfterBreak="0">
+  <w:abstractNum w:abstractNumId="3">
     <w:nsid w:val="4A196081"/>
     <w:multiLevelType w:val="multilevel"/>
-    <w:tmpl w:val="F64098C4"/>
-    <w:lvl w:ilvl="0">
+    <w:tmpl w:val="4A196081"/>
+    <w:lvl w:ilvl="0" w:tentative="0">
       <w:start w:val="1"/>
       <w:numFmt w:val="decimal"/>
       <w:lvlText w:val=""/>
@@ -2530,7 +2612,7 @@
         <w:u w:val="none"/>
       </w:rPr>
     </w:lvl>
-    <w:lvl w:ilvl="1">
+    <w:lvl w:ilvl="1" w:tentative="0">
       <w:start w:val="1"/>
       <w:numFmt w:val="decimal"/>
       <w:lvlText w:val=""/>
@@ -2542,7 +2624,7 @@
         <w:u w:val="none"/>
       </w:rPr>
     </w:lvl>
-    <w:lvl w:ilvl="2">
+    <w:lvl w:ilvl="2" w:tentative="0">
       <w:start w:val="1"/>
       <w:numFmt w:val="decimal"/>
       <w:lvlText w:val=""/>
@@ -2554,7 +2636,7 @@
         <w:u w:val="none"/>
       </w:rPr>
     </w:lvl>
-    <w:lvl w:ilvl="3">
+    <w:lvl w:ilvl="3" w:tentative="0">
       <w:start w:val="1"/>
       <w:numFmt w:val="decimal"/>
       <w:lvlText w:val=""/>
@@ -2566,7 +2648,7 @@
         <w:u w:val="none"/>
       </w:rPr>
     </w:lvl>
-    <w:lvl w:ilvl="4">
+    <w:lvl w:ilvl="4" w:tentative="0">
       <w:start w:val="1"/>
       <w:numFmt w:val="decimal"/>
       <w:lvlText w:val=""/>
@@ -2578,7 +2660,7 @@
         <w:u w:val="none"/>
       </w:rPr>
     </w:lvl>
-    <w:lvl w:ilvl="5">
+    <w:lvl w:ilvl="5" w:tentative="0">
       <w:start w:val="1"/>
       <w:numFmt w:val="decimal"/>
       <w:lvlText w:val=""/>
@@ -2590,7 +2672,7 @@
         <w:u w:val="none"/>
       </w:rPr>
     </w:lvl>
-    <w:lvl w:ilvl="6">
+    <w:lvl w:ilvl="6" w:tentative="0">
       <w:start w:val="1"/>
       <w:numFmt w:val="decimal"/>
       <w:lvlText w:val=""/>
@@ -2602,7 +2684,7 @@
         <w:u w:val="none"/>
       </w:rPr>
     </w:lvl>
-    <w:lvl w:ilvl="7">
+    <w:lvl w:ilvl="7" w:tentative="0">
       <w:start w:val="1"/>
       <w:numFmt w:val="decimal"/>
       <w:lvlText w:val=""/>
@@ -2614,7 +2696,7 @@
         <w:u w:val="none"/>
       </w:rPr>
     </w:lvl>
-    <w:lvl w:ilvl="8">
+    <w:lvl w:ilvl="8" w:tentative="0">
       <w:start w:val="1"/>
       <w:numFmt w:val="decimal"/>
       <w:lvlText w:val=""/>
@@ -2627,11 +2709,11 @@
       </w:rPr>
     </w:lvl>
   </w:abstractNum>
-  <w:abstractNum w:abstractNumId="4" w15:restartNumberingAfterBreak="0">
-    <w:nsid w:val="58F90E51"/>
+  <w:abstractNum w:abstractNumId="4">
+    <w:nsid w:val="64420DA3"/>
     <w:multiLevelType w:val="multilevel"/>
-    <w:tmpl w:val="D382C950"/>
-    <w:lvl w:ilvl="0">
+    <w:tmpl w:val="64420DA3"/>
+    <w:lvl w:ilvl="0" w:tentative="0">
       <w:start w:val="1"/>
       <w:numFmt w:val="decimal"/>
       <w:lvlText w:val=""/>
@@ -2643,7 +2725,7 @@
         <w:u w:val="none"/>
       </w:rPr>
     </w:lvl>
-    <w:lvl w:ilvl="1">
+    <w:lvl w:ilvl="1" w:tentative="0">
       <w:start w:val="1"/>
       <w:numFmt w:val="decimal"/>
       <w:lvlText w:val=""/>
@@ -2655,7 +2737,7 @@
         <w:u w:val="none"/>
       </w:rPr>
     </w:lvl>
-    <w:lvl w:ilvl="2">
+    <w:lvl w:ilvl="2" w:tentative="0">
       <w:start w:val="1"/>
       <w:numFmt w:val="decimal"/>
       <w:lvlText w:val=""/>
@@ -2667,7 +2749,7 @@
         <w:u w:val="none"/>
       </w:rPr>
     </w:lvl>
-    <w:lvl w:ilvl="3">
+    <w:lvl w:ilvl="3" w:tentative="0">
       <w:start w:val="1"/>
       <w:numFmt w:val="decimal"/>
       <w:lvlText w:val=""/>
@@ -2679,7 +2761,7 @@
         <w:u w:val="none"/>
       </w:rPr>
     </w:lvl>
-    <w:lvl w:ilvl="4">
+    <w:lvl w:ilvl="4" w:tentative="0">
       <w:start w:val="1"/>
       <w:numFmt w:val="decimal"/>
       <w:lvlText w:val=""/>
@@ -2691,7 +2773,7 @@
         <w:u w:val="none"/>
       </w:rPr>
     </w:lvl>
-    <w:lvl w:ilvl="5">
+    <w:lvl w:ilvl="5" w:tentative="0">
       <w:start w:val="1"/>
       <w:numFmt w:val="decimal"/>
       <w:lvlText w:val=""/>
@@ -2703,7 +2785,7 @@
         <w:u w:val="none"/>
       </w:rPr>
     </w:lvl>
-    <w:lvl w:ilvl="6">
+    <w:lvl w:ilvl="6" w:tentative="0">
       <w:start w:val="1"/>
       <w:numFmt w:val="decimal"/>
       <w:lvlText w:val=""/>
@@ -2715,7 +2797,7 @@
         <w:u w:val="none"/>
       </w:rPr>
     </w:lvl>
-    <w:lvl w:ilvl="7">
+    <w:lvl w:ilvl="7" w:tentative="0">
       <w:start w:val="1"/>
       <w:numFmt w:val="decimal"/>
       <w:lvlText w:val=""/>
@@ -2727,120 +2809,7 @@
         <w:u w:val="none"/>
       </w:rPr>
     </w:lvl>
-    <w:lvl w:ilvl="8">
-      <w:start w:val="1"/>
-      <w:numFmt w:val="decimal"/>
-      <w:lvlText w:val=""/>
-      <w:lvlJc w:val="left"/>
-      <w:pPr>
-        <w:ind w:left="0" w:firstLine="0"/>
-      </w:pPr>
-      <w:rPr>
-        <w:u w:val="none"/>
-      </w:rPr>
-    </w:lvl>
-  </w:abstractNum>
-  <w:abstractNum w:abstractNumId="5" w15:restartNumberingAfterBreak="0">
-    <w:nsid w:val="64420DA3"/>
-    <w:multiLevelType w:val="multilevel"/>
-    <w:tmpl w:val="B5D67252"/>
-    <w:lvl w:ilvl="0">
-      <w:start w:val="1"/>
-      <w:numFmt w:val="decimal"/>
-      <w:lvlText w:val=""/>
-      <w:lvlJc w:val="left"/>
-      <w:pPr>
-        <w:ind w:left="0" w:firstLine="0"/>
-      </w:pPr>
-      <w:rPr>
-        <w:u w:val="none"/>
-      </w:rPr>
-    </w:lvl>
-    <w:lvl w:ilvl="1">
-      <w:start w:val="1"/>
-      <w:numFmt w:val="decimal"/>
-      <w:lvlText w:val=""/>
-      <w:lvlJc w:val="left"/>
-      <w:pPr>
-        <w:ind w:left="0" w:firstLine="0"/>
-      </w:pPr>
-      <w:rPr>
-        <w:u w:val="none"/>
-      </w:rPr>
-    </w:lvl>
-    <w:lvl w:ilvl="2">
-      <w:start w:val="1"/>
-      <w:numFmt w:val="decimal"/>
-      <w:lvlText w:val=""/>
-      <w:lvlJc w:val="left"/>
-      <w:pPr>
-        <w:ind w:left="0" w:firstLine="0"/>
-      </w:pPr>
-      <w:rPr>
-        <w:u w:val="none"/>
-      </w:rPr>
-    </w:lvl>
-    <w:lvl w:ilvl="3">
-      <w:start w:val="1"/>
-      <w:numFmt w:val="decimal"/>
-      <w:lvlText w:val=""/>
-      <w:lvlJc w:val="left"/>
-      <w:pPr>
-        <w:ind w:left="0" w:firstLine="0"/>
-      </w:pPr>
-      <w:rPr>
-        <w:u w:val="none"/>
-      </w:rPr>
-    </w:lvl>
-    <w:lvl w:ilvl="4">
-      <w:start w:val="1"/>
-      <w:numFmt w:val="decimal"/>
-      <w:lvlText w:val=""/>
-      <w:lvlJc w:val="left"/>
-      <w:pPr>
-        <w:ind w:left="0" w:firstLine="0"/>
-      </w:pPr>
-      <w:rPr>
-        <w:u w:val="none"/>
-      </w:rPr>
-    </w:lvl>
-    <w:lvl w:ilvl="5">
-      <w:start w:val="1"/>
-      <w:numFmt w:val="decimal"/>
-      <w:lvlText w:val=""/>
-      <w:lvlJc w:val="left"/>
-      <w:pPr>
-        <w:ind w:left="0" w:firstLine="0"/>
-      </w:pPr>
-      <w:rPr>
-        <w:u w:val="none"/>
-      </w:rPr>
-    </w:lvl>
-    <w:lvl w:ilvl="6">
-      <w:start w:val="1"/>
-      <w:numFmt w:val="decimal"/>
-      <w:lvlText w:val=""/>
-      <w:lvlJc w:val="left"/>
-      <w:pPr>
-        <w:ind w:left="0" w:firstLine="0"/>
-      </w:pPr>
-      <w:rPr>
-        <w:u w:val="none"/>
-      </w:rPr>
-    </w:lvl>
-    <w:lvl w:ilvl="7">
-      <w:start w:val="1"/>
-      <w:numFmt w:val="decimal"/>
-      <w:lvlText w:val=""/>
-      <w:lvlJc w:val="left"/>
-      <w:pPr>
-        <w:ind w:left="0" w:firstLine="0"/>
-      </w:pPr>
-      <w:rPr>
-        <w:u w:val="none"/>
-      </w:rPr>
-    </w:lvl>
-    <w:lvl w:ilvl="8">
+    <w:lvl w:ilvl="8" w:tentative="0">
       <w:start w:val="1"/>
       <w:numFmt w:val="decimal"/>
       <w:lvlText w:val=""/>
@@ -2857,424 +2826,200 @@
     <w:abstractNumId w:val="1"/>
   </w:num>
   <w:num w:numId="2">
-    <w:abstractNumId w:val="4"/>
+    <w:abstractNumId w:val="2"/>
   </w:num>
   <w:num w:numId="3">
-    <w:abstractNumId w:val="3"/>
+    <w:abstractNumId w:val="4"/>
   </w:num>
   <w:num w:numId="4">
     <w:abstractNumId w:val="0"/>
   </w:num>
   <w:num w:numId="5">
-    <w:abstractNumId w:val="5"/>
-  </w:num>
-  <w:num w:numId="6">
-    <w:abstractNumId w:val="2"/>
+    <w:abstractNumId w:val="3"/>
   </w:num>
 </w:numbering>
 </file>
 
 <file path=word/styles.xml><?xml version="1.0" encoding="utf-8"?>
-<w:styles xmlns:mc="http://schemas.openxmlformats.org/markup-compatibility/2006" xmlns:r="http://schemas.openxmlformats.org/officeDocument/2006/relationships" xmlns:w="http://schemas.openxmlformats.org/wordprocessingml/2006/main" xmlns:w14="http://schemas.microsoft.com/office/word/2010/wordml" xmlns:w15="http://schemas.microsoft.com/office/word/2012/wordml" xmlns:w16cex="http://schemas.microsoft.com/office/word/2018/wordml/cex" xmlns:w16cid="http://schemas.microsoft.com/office/word/2016/wordml/cid" xmlns:w16="http://schemas.microsoft.com/office/word/2018/wordml" xmlns:w16se="http://schemas.microsoft.com/office/word/2015/wordml/symex" mc:Ignorable="w14 w15 w16se w16cid w16 w16cex">
+<w:styles xmlns:mc="http://schemas.openxmlformats.org/markup-compatibility/2006" xmlns:o="urn:schemas-microsoft-com:office:office" xmlns:r="http://schemas.openxmlformats.org/officeDocument/2006/relationships" xmlns:m="http://schemas.openxmlformats.org/officeDocument/2006/math" xmlns:v="urn:schemas-microsoft-com:vml" xmlns:w="http://schemas.openxmlformats.org/wordprocessingml/2006/main" xmlns:w14="http://schemas.microsoft.com/office/word/2010/wordml" xmlns:w10="urn:schemas-microsoft-com:office:word" xmlns:sl="http://schemas.openxmlformats.org/schemaLibrary/2006/main" xmlns:wpsCustomData="http://www.wps.cn/officeDocument/2013/wpsCustomData" mc:Ignorable="w14">
   <w:docDefaults>
     <w:rPrDefault>
       <w:rPr>
-        <w:rFonts w:ascii="Times New Roman" w:eastAsia="Times New Roman" w:hAnsi="Times New Roman" w:cs="Times New Roman"/>
-        <w:sz w:val="24"/>
-        <w:szCs w:val="24"/>
-        <w:lang w:val="pt-BR" w:eastAsia="pt-BR" w:bidi="ar-SA"/>
+        <w:rFonts w:ascii="Times New Roman" w:hAnsi="Times New Roman" w:eastAsia="Times New Roman" w:cs="Times New Roman"/>
       </w:rPr>
     </w:rPrDefault>
     <w:pPrDefault/>
   </w:docDefaults>
-  <w:latentStyles w:defLockedState="0" w:defUIPriority="99" w:defSemiHidden="0" w:defUnhideWhenUsed="0" w:defQFormat="0" w:count="376">
-    <w:lsdException w:name="Normal" w:uiPriority="0" w:qFormat="1"/>
-    <w:lsdException w:name="heading 1" w:uiPriority="9" w:qFormat="1"/>
-    <w:lsdException w:name="heading 2" w:semiHidden="1" w:uiPriority="9" w:unhideWhenUsed="1" w:qFormat="1"/>
-    <w:lsdException w:name="heading 3" w:semiHidden="1" w:uiPriority="9" w:unhideWhenUsed="1" w:qFormat="1"/>
-    <w:lsdException w:name="heading 4" w:semiHidden="1" w:uiPriority="9" w:unhideWhenUsed="1" w:qFormat="1"/>
-    <w:lsdException w:name="heading 5" w:semiHidden="1" w:uiPriority="9" w:unhideWhenUsed="1" w:qFormat="1"/>
-    <w:lsdException w:name="heading 6" w:semiHidden="1" w:uiPriority="9" w:unhideWhenUsed="1" w:qFormat="1"/>
-    <w:lsdException w:name="heading 7" w:semiHidden="1" w:uiPriority="9" w:unhideWhenUsed="1" w:qFormat="1"/>
-    <w:lsdException w:name="heading 8" w:semiHidden="1" w:uiPriority="9" w:unhideWhenUsed="1" w:qFormat="1"/>
-    <w:lsdException w:name="heading 9" w:semiHidden="1" w:uiPriority="9" w:unhideWhenUsed="1" w:qFormat="1"/>
-    <w:lsdException w:name="index 1" w:semiHidden="1" w:unhideWhenUsed="1"/>
-    <w:lsdException w:name="index 2" w:semiHidden="1" w:unhideWhenUsed="1"/>
-    <w:lsdException w:name="index 3" w:semiHidden="1" w:unhideWhenUsed="1"/>
-    <w:lsdException w:name="index 4" w:semiHidden="1" w:unhideWhenUsed="1"/>
-    <w:lsdException w:name="index 5" w:semiHidden="1" w:unhideWhenUsed="1"/>
-    <w:lsdException w:name="index 6" w:semiHidden="1" w:unhideWhenUsed="1"/>
-    <w:lsdException w:name="index 7" w:semiHidden="1" w:unhideWhenUsed="1"/>
-    <w:lsdException w:name="index 8" w:semiHidden="1" w:unhideWhenUsed="1"/>
-    <w:lsdException w:name="index 9" w:semiHidden="1" w:unhideWhenUsed="1"/>
-    <w:lsdException w:name="toc 1" w:semiHidden="1" w:uiPriority="39" w:unhideWhenUsed="1"/>
-    <w:lsdException w:name="toc 2" w:semiHidden="1" w:uiPriority="39" w:unhideWhenUsed="1"/>
-    <w:lsdException w:name="toc 3" w:semiHidden="1" w:uiPriority="39" w:unhideWhenUsed="1"/>
-    <w:lsdException w:name="toc 4" w:semiHidden="1" w:uiPriority="39" w:unhideWhenUsed="1"/>
-    <w:lsdException w:name="toc 5" w:semiHidden="1" w:uiPriority="39" w:unhideWhenUsed="1"/>
-    <w:lsdException w:name="toc 6" w:semiHidden="1" w:uiPriority="39" w:unhideWhenUsed="1"/>
-    <w:lsdException w:name="toc 7" w:semiHidden="1" w:uiPriority="39" w:unhideWhenUsed="1"/>
-    <w:lsdException w:name="toc 8" w:semiHidden="1" w:uiPriority="39" w:unhideWhenUsed="1"/>
-    <w:lsdException w:name="toc 9" w:semiHidden="1" w:uiPriority="39" w:unhideWhenUsed="1"/>
-    <w:lsdException w:name="Normal Indent" w:semiHidden="1" w:unhideWhenUsed="1"/>
-    <w:lsdException w:name="footnote text" w:semiHidden="1" w:unhideWhenUsed="1"/>
-    <w:lsdException w:name="annotation text" w:semiHidden="1" w:unhideWhenUsed="1"/>
-    <w:lsdException w:name="header" w:semiHidden="1" w:unhideWhenUsed="1"/>
-    <w:lsdException w:name="footer" w:semiHidden="1" w:unhideWhenUsed="1"/>
-    <w:lsdException w:name="index heading" w:semiHidden="1" w:unhideWhenUsed="1"/>
-    <w:lsdException w:name="caption" w:semiHidden="1" w:uiPriority="35" w:unhideWhenUsed="1" w:qFormat="1"/>
-    <w:lsdException w:name="table of figures" w:semiHidden="1" w:unhideWhenUsed="1"/>
-    <w:lsdException w:name="envelope address" w:semiHidden="1" w:unhideWhenUsed="1"/>
-    <w:lsdException w:name="envelope return" w:semiHidden="1" w:unhideWhenUsed="1"/>
-    <w:lsdException w:name="footnote reference" w:semiHidden="1" w:unhideWhenUsed="1"/>
-    <w:lsdException w:name="annotation reference" w:semiHidden="1" w:unhideWhenUsed="1"/>
-    <w:lsdException w:name="line number" w:semiHidden="1" w:unhideWhenUsed="1"/>
-    <w:lsdException w:name="page number" w:semiHidden="1" w:unhideWhenUsed="1"/>
-    <w:lsdException w:name="endnote reference" w:semiHidden="1" w:unhideWhenUsed="1"/>
-    <w:lsdException w:name="endnote text" w:semiHidden="1" w:unhideWhenUsed="1"/>
-    <w:lsdException w:name="table of authorities" w:semiHidden="1" w:unhideWhenUsed="1"/>
-    <w:lsdException w:name="macro" w:semiHidden="1" w:unhideWhenUsed="1"/>
-    <w:lsdException w:name="toa heading" w:semiHidden="1" w:unhideWhenUsed="1"/>
-    <w:lsdException w:name="List" w:semiHidden="1" w:unhideWhenUsed="1"/>
-    <w:lsdException w:name="List Bullet" w:semiHidden="1" w:unhideWhenUsed="1"/>
-    <w:lsdException w:name="List Number" w:semiHidden="1" w:unhideWhenUsed="1"/>
-    <w:lsdException w:name="List 2" w:semiHidden="1" w:unhideWhenUsed="1"/>
-    <w:lsdException w:name="List 3" w:semiHidden="1" w:unhideWhenUsed="1"/>
-    <w:lsdException w:name="List 4" w:semiHidden="1" w:unhideWhenUsed="1"/>
-    <w:lsdException w:name="List 5" w:semiHidden="1" w:unhideWhenUsed="1"/>
-    <w:lsdException w:name="List Bullet 2" w:semiHidden="1" w:unhideWhenUsed="1"/>
-    <w:lsdException w:name="List Bullet 3" w:semiHidden="1" w:unhideWhenUsed="1"/>
-    <w:lsdException w:name="List Bullet 4" w:semiHidden="1" w:unhideWhenUsed="1"/>
-    <w:lsdException w:name="List Bullet 5" w:semiHidden="1" w:unhideWhenUsed="1"/>
-    <w:lsdException w:name="List Number 2" w:semiHidden="1" w:unhideWhenUsed="1"/>
-    <w:lsdException w:name="List Number 3" w:semiHidden="1" w:unhideWhenUsed="1"/>
-    <w:lsdException w:name="List Number 4" w:semiHidden="1" w:unhideWhenUsed="1"/>
-    <w:lsdException w:name="List Number 5" w:semiHidden="1" w:unhideWhenUsed="1"/>
-    <w:lsdException w:name="Title" w:uiPriority="10" w:qFormat="1"/>
-    <w:lsdException w:name="Closing" w:semiHidden="1" w:unhideWhenUsed="1"/>
-    <w:lsdException w:name="Signature" w:semiHidden="1" w:unhideWhenUsed="1"/>
-    <w:lsdException w:name="Default Paragraph Font" w:semiHidden="1" w:uiPriority="1" w:unhideWhenUsed="1"/>
-    <w:lsdException w:name="Body Text" w:semiHidden="1" w:unhideWhenUsed="1"/>
-    <w:lsdException w:name="Body Text Indent" w:semiHidden="1" w:unhideWhenUsed="1"/>
-    <w:lsdException w:name="List Continue" w:semiHidden="1" w:unhideWhenUsed="1"/>
-    <w:lsdException w:name="List Continue 2" w:semiHidden="1" w:unhideWhenUsed="1"/>
-    <w:lsdException w:name="List Continue 3" w:semiHidden="1" w:unhideWhenUsed="1"/>
-    <w:lsdException w:name="List Continue 4" w:semiHidden="1" w:unhideWhenUsed="1"/>
-    <w:lsdException w:name="List Continue 5" w:semiHidden="1" w:unhideWhenUsed="1"/>
-    <w:lsdException w:name="Message Header" w:semiHidden="1" w:unhideWhenUsed="1"/>
-    <w:lsdException w:name="Subtitle" w:uiPriority="11" w:qFormat="1"/>
-    <w:lsdException w:name="Salutation" w:semiHidden="1" w:unhideWhenUsed="1"/>
-    <w:lsdException w:name="Date" w:semiHidden="1" w:unhideWhenUsed="1"/>
-    <w:lsdException w:name="Body Text First Indent" w:semiHidden="1" w:unhideWhenUsed="1"/>
-    <w:lsdException w:name="Body Text First Indent 2" w:semiHidden="1" w:unhideWhenUsed="1"/>
-    <w:lsdException w:name="Note Heading" w:semiHidden="1" w:unhideWhenUsed="1"/>
-    <w:lsdException w:name="Body Text 2" w:semiHidden="1" w:unhideWhenUsed="1"/>
-    <w:lsdException w:name="Body Text 3" w:semiHidden="1" w:unhideWhenUsed="1"/>
-    <w:lsdException w:name="Body Text Indent 2" w:semiHidden="1" w:unhideWhenUsed="1"/>
-    <w:lsdException w:name="Body Text Indent 3" w:semiHidden="1" w:unhideWhenUsed="1"/>
-    <w:lsdException w:name="Block Text" w:semiHidden="1" w:unhideWhenUsed="1"/>
-    <w:lsdException w:name="Hyperlink" w:semiHidden="1" w:unhideWhenUsed="1"/>
-    <w:lsdException w:name="FollowedHyperlink" w:semiHidden="1" w:unhideWhenUsed="1"/>
-    <w:lsdException w:name="Strong" w:uiPriority="22" w:qFormat="1"/>
-    <w:lsdException w:name="Emphasis" w:uiPriority="20" w:qFormat="1"/>
-    <w:lsdException w:name="Document Map" w:semiHidden="1" w:unhideWhenUsed="1"/>
-    <w:lsdException w:name="Plain Text" w:semiHidden="1" w:unhideWhenUsed="1"/>
-    <w:lsdException w:name="E-mail Signature" w:semiHidden="1" w:unhideWhenUsed="1"/>
-    <w:lsdException w:name="HTML Top of Form" w:semiHidden="1" w:unhideWhenUsed="1"/>
-    <w:lsdException w:name="HTML Bottom of Form" w:semiHidden="1" w:unhideWhenUsed="1"/>
-    <w:lsdException w:name="Normal (Web)" w:semiHidden="1" w:unhideWhenUsed="1"/>
-    <w:lsdException w:name="HTML Acronym" w:semiHidden="1" w:unhideWhenUsed="1"/>
-    <w:lsdException w:name="HTML Address" w:semiHidden="1" w:unhideWhenUsed="1"/>
-    <w:lsdException w:name="HTML Cite" w:semiHidden="1" w:unhideWhenUsed="1"/>
-    <w:lsdException w:name="HTML Code" w:semiHidden="1" w:unhideWhenUsed="1"/>
-    <w:lsdException w:name="HTML Definition" w:semiHidden="1" w:unhideWhenUsed="1"/>
-    <w:lsdException w:name="HTML Keyboard" w:semiHidden="1" w:unhideWhenUsed="1"/>
-    <w:lsdException w:name="HTML Preformatted" w:semiHidden="1" w:unhideWhenUsed="1"/>
-    <w:lsdException w:name="HTML Sample" w:semiHidden="1" w:unhideWhenUsed="1"/>
-    <w:lsdException w:name="HTML Typewriter" w:semiHidden="1" w:unhideWhenUsed="1"/>
-    <w:lsdException w:name="HTML Variable" w:semiHidden="1" w:unhideWhenUsed="1"/>
-    <w:lsdException w:name="Normal Table" w:semiHidden="1" w:unhideWhenUsed="1"/>
-    <w:lsdException w:name="annotation subject" w:semiHidden="1" w:unhideWhenUsed="1"/>
-    <w:lsdException w:name="No List" w:semiHidden="1" w:unhideWhenUsed="1"/>
-    <w:lsdException w:name="Outline List 1" w:semiHidden="1" w:unhideWhenUsed="1"/>
-    <w:lsdException w:name="Outline List 2" w:semiHidden="1" w:unhideWhenUsed="1"/>
-    <w:lsdException w:name="Outline List 3" w:semiHidden="1" w:unhideWhenUsed="1"/>
-    <w:lsdException w:name="Table Simple 1" w:semiHidden="1" w:unhideWhenUsed="1"/>
-    <w:lsdException w:name="Table Simple 2" w:semiHidden="1" w:unhideWhenUsed="1"/>
-    <w:lsdException w:name="Table Simple 3" w:semiHidden="1" w:unhideWhenUsed="1"/>
-    <w:lsdException w:name="Table Classic 1" w:semiHidden="1" w:unhideWhenUsed="1"/>
-    <w:lsdException w:name="Table Classic 2" w:semiHidden="1" w:unhideWhenUsed="1"/>
-    <w:lsdException w:name="Table Classic 3" w:semiHidden="1" w:unhideWhenUsed="1"/>
-    <w:lsdException w:name="Table Classic 4" w:semiHidden="1" w:unhideWhenUsed="1"/>
-    <w:lsdException w:name="Table Colorful 1" w:semiHidden="1" w:unhideWhenUsed="1"/>
-    <w:lsdException w:name="Table Colorful 2" w:semiHidden="1" w:unhideWhenUsed="1"/>
-    <w:lsdException w:name="Table Colorful 3" w:semiHidden="1" w:unhideWhenUsed="1"/>
-    <w:lsdException w:name="Table Columns 1" w:semiHidden="1" w:unhideWhenUsed="1"/>
-    <w:lsdException w:name="Table Columns 2" w:semiHidden="1" w:unhideWhenUsed="1"/>
-    <w:lsdException w:name="Table Columns 3" w:semiHidden="1" w:unhideWhenUsed="1"/>
-    <w:lsdException w:name="Table Columns 4" w:semiHidden="1" w:unhideWhenUsed="1"/>
-    <w:lsdException w:name="Table Columns 5" w:semiHidden="1" w:unhideWhenUsed="1"/>
-    <w:lsdException w:name="Table Grid 1" w:semiHidden="1" w:unhideWhenUsed="1"/>
-    <w:lsdException w:name="Table Grid 2" w:semiHidden="1" w:unhideWhenUsed="1"/>
-    <w:lsdException w:name="Table Grid 3" w:semiHidden="1" w:unhideWhenUsed="1"/>
-    <w:lsdException w:name="Table Grid 4" w:semiHidden="1" w:unhideWhenUsed="1"/>
-    <w:lsdException w:name="Table Grid 5" w:semiHidden="1" w:unhideWhenUsed="1"/>
-    <w:lsdException w:name="Table Grid 6" w:semiHidden="1" w:unhideWhenUsed="1"/>
-    <w:lsdException w:name="Table Grid 7" w:semiHidden="1" w:unhideWhenUsed="1"/>
-    <w:lsdException w:name="Table Grid 8" w:semiHidden="1" w:unhideWhenUsed="1"/>
-    <w:lsdException w:name="Table List 1" w:semiHidden="1" w:unhideWhenUsed="1"/>
-    <w:lsdException w:name="Table List 2" w:semiHidden="1" w:unhideWhenUsed="1"/>
-    <w:lsdException w:name="Table List 3" w:semiHidden="1" w:unhideWhenUsed="1"/>
-    <w:lsdException w:name="Table List 4" w:semiHidden="1" w:unhideWhenUsed="1"/>
-    <w:lsdException w:name="Table List 5" w:semiHidden="1" w:unhideWhenUsed="1"/>
-    <w:lsdException w:name="Table List 6" w:semiHidden="1" w:unhideWhenUsed="1"/>
-    <w:lsdException w:name="Table List 7" w:semiHidden="1" w:unhideWhenUsed="1"/>
-    <w:lsdException w:name="Table List 8" w:semiHidden="1" w:unhideWhenUsed="1"/>
-    <w:lsdException w:name="Table 3D effects 1" w:semiHidden="1" w:unhideWhenUsed="1"/>
-    <w:lsdException w:name="Table 3D effects 2" w:semiHidden="1" w:unhideWhenUsed="1"/>
-    <w:lsdException w:name="Table 3D effects 3" w:semiHidden="1" w:unhideWhenUsed="1"/>
-    <w:lsdException w:name="Table Contemporary" w:semiHidden="1" w:unhideWhenUsed="1"/>
-    <w:lsdException w:name="Table Elegant" w:semiHidden="1" w:unhideWhenUsed="1"/>
-    <w:lsdException w:name="Table Professional" w:semiHidden="1" w:unhideWhenUsed="1"/>
-    <w:lsdException w:name="Table Subtle 1" w:semiHidden="1" w:unhideWhenUsed="1"/>
-    <w:lsdException w:name="Table Subtle 2" w:semiHidden="1" w:unhideWhenUsed="1"/>
-    <w:lsdException w:name="Table Web 1" w:semiHidden="1" w:unhideWhenUsed="1"/>
-    <w:lsdException w:name="Table Web 2" w:semiHidden="1" w:unhideWhenUsed="1"/>
-    <w:lsdException w:name="Table Web 3" w:semiHidden="1" w:unhideWhenUsed="1"/>
-    <w:lsdException w:name="Balloon Text" w:semiHidden="1" w:unhideWhenUsed="1"/>
-    <w:lsdException w:name="Table Grid" w:uiPriority="39"/>
-    <w:lsdException w:name="Table Theme" w:semiHidden="1" w:unhideWhenUsed="1"/>
-    <w:lsdException w:name="Placeholder Text" w:semiHidden="1"/>
-    <w:lsdException w:name="No Spacing" w:uiPriority="1" w:qFormat="1"/>
-    <w:lsdException w:name="Light Shading" w:uiPriority="60"/>
-    <w:lsdException w:name="Light List" w:uiPriority="61"/>
-    <w:lsdException w:name="Light Grid" w:uiPriority="62"/>
-    <w:lsdException w:name="Medium Shading 1" w:uiPriority="63"/>
-    <w:lsdException w:name="Medium Shading 2" w:uiPriority="64"/>
-    <w:lsdException w:name="Medium List 1" w:uiPriority="65"/>
-    <w:lsdException w:name="Medium List 2" w:uiPriority="66"/>
-    <w:lsdException w:name="Medium Grid 1" w:uiPriority="67"/>
-    <w:lsdException w:name="Medium Grid 2" w:uiPriority="68"/>
-    <w:lsdException w:name="Medium Grid 3" w:uiPriority="69"/>
-    <w:lsdException w:name="Dark List" w:uiPriority="70"/>
-    <w:lsdException w:name="Colorful Shading" w:uiPriority="71"/>
-    <w:lsdException w:name="Colorful List" w:uiPriority="72"/>
-    <w:lsdException w:name="Colorful Grid" w:uiPriority="73"/>
-    <w:lsdException w:name="Light Shading Accent 1" w:uiPriority="60"/>
-    <w:lsdException w:name="Light List Accent 1" w:uiPriority="61"/>
-    <w:lsdException w:name="Light Grid Accent 1" w:uiPriority="62"/>
-    <w:lsdException w:name="Medium Shading 1 Accent 1" w:uiPriority="63"/>
-    <w:lsdException w:name="Medium Shading 2 Accent 1" w:uiPriority="64"/>
-    <w:lsdException w:name="Medium List 1 Accent 1" w:uiPriority="65"/>
-    <w:lsdException w:name="Revision" w:semiHidden="1"/>
-    <w:lsdException w:name="List Paragraph" w:uiPriority="34" w:qFormat="1"/>
-    <w:lsdException w:name="Quote" w:uiPriority="29" w:qFormat="1"/>
-    <w:lsdException w:name="Intense Quote" w:uiPriority="30" w:qFormat="1"/>
-    <w:lsdException w:name="Medium List 2 Accent 1" w:uiPriority="66"/>
-    <w:lsdException w:name="Medium Grid 1 Accent 1" w:uiPriority="67"/>
-    <w:lsdException w:name="Medium Grid 2 Accent 1" w:uiPriority="68"/>
-    <w:lsdException w:name="Medium Grid 3 Accent 1" w:uiPriority="69"/>
-    <w:lsdException w:name="Dark List Accent 1" w:uiPriority="70"/>
-    <w:lsdException w:name="Colorful Shading Accent 1" w:uiPriority="71"/>
-    <w:lsdException w:name="Colorful List Accent 1" w:uiPriority="72"/>
-    <w:lsdException w:name="Colorful Grid Accent 1" w:uiPriority="73"/>
-    <w:lsdException w:name="Light Shading Accent 2" w:uiPriority="60"/>
-    <w:lsdException w:name="Light List Accent 2" w:uiPriority="61"/>
-    <w:lsdException w:name="Light Grid Accent 2" w:uiPriority="62"/>
-    <w:lsdException w:name="Medium Shading 1 Accent 2" w:uiPriority="63"/>
-    <w:lsdException w:name="Medium Shading 2 Accent 2" w:uiPriority="64"/>
-    <w:lsdException w:name="Medium List 1 Accent 2" w:uiPriority="65"/>
-    <w:lsdException w:name="Medium List 2 Accent 2" w:uiPriority="66"/>
-    <w:lsdException w:name="Medium Grid 1 Accent 2" w:uiPriority="67"/>
-    <w:lsdException w:name="Medium Grid 2 Accent 2" w:uiPriority="68"/>
-    <w:lsdException w:name="Medium Grid 3 Accent 2" w:uiPriority="69"/>
-    <w:lsdException w:name="Dark List Accent 2" w:uiPriority="70"/>
-    <w:lsdException w:name="Colorful Shading Accent 2" w:uiPriority="71"/>
-    <w:lsdException w:name="Colorful List Accent 2" w:uiPriority="72"/>
-    <w:lsdException w:name="Colorful Grid Accent 2" w:uiPriority="73"/>
-    <w:lsdException w:name="Light Shading Accent 3" w:uiPriority="60"/>
-    <w:lsdException w:name="Light List Accent 3" w:uiPriority="61"/>
-    <w:lsdException w:name="Light Grid Accent 3" w:uiPriority="62"/>
-    <w:lsdException w:name="Medium Shading 1 Accent 3" w:uiPriority="63"/>
-    <w:lsdException w:name="Medium Shading 2 Accent 3" w:uiPriority="64"/>
-    <w:lsdException w:name="Medium List 1 Accent 3" w:uiPriority="65"/>
-    <w:lsdException w:name="Medium List 2 Accent 3" w:uiPriority="66"/>
-    <w:lsdException w:name="Medium Grid 1 Accent 3" w:uiPriority="67"/>
-    <w:lsdException w:name="Medium Grid 2 Accent 3" w:uiPriority="68"/>
-    <w:lsdException w:name="Medium Grid 3 Accent 3" w:uiPriority="69"/>
-    <w:lsdException w:name="Dark List Accent 3" w:uiPriority="70"/>
-    <w:lsdException w:name="Colorful Shading Accent 3" w:uiPriority="71"/>
-    <w:lsdException w:name="Colorful List Accent 3" w:uiPriority="72"/>
-    <w:lsdException w:name="Colorful Grid Accent 3" w:uiPriority="73"/>
-    <w:lsdException w:name="Light Shading Accent 4" w:uiPriority="60"/>
-    <w:lsdException w:name="Light List Accent 4" w:uiPriority="61"/>
-    <w:lsdException w:name="Light Grid Accent 4" w:uiPriority="62"/>
-    <w:lsdException w:name="Medium Shading 1 Accent 4" w:uiPriority="63"/>
-    <w:lsdException w:name="Medium Shading 2 Accent 4" w:uiPriority="64"/>
-    <w:lsdException w:name="Medium List 1 Accent 4" w:uiPriority="65"/>
-    <w:lsdException w:name="Medium List 2 Accent 4" w:uiPriority="66"/>
-    <w:lsdException w:name="Medium Grid 1 Accent 4" w:uiPriority="67"/>
-    <w:lsdException w:name="Medium Grid 2 Accent 4" w:uiPriority="68"/>
-    <w:lsdException w:name="Medium Grid 3 Accent 4" w:uiPriority="69"/>
-    <w:lsdException w:name="Dark List Accent 4" w:uiPriority="70"/>
-    <w:lsdException w:name="Colorful Shading Accent 4" w:uiPriority="71"/>
-    <w:lsdException w:name="Colorful List Accent 4" w:uiPriority="72"/>
-    <w:lsdException w:name="Colorful Grid Accent 4" w:uiPriority="73"/>
-    <w:lsdException w:name="Light Shading Accent 5" w:uiPriority="60"/>
-    <w:lsdException w:name="Light List Accent 5" w:uiPriority="61"/>
-    <w:lsdException w:name="Light Grid Accent 5" w:uiPriority="62"/>
-    <w:lsdException w:name="Medium Shading 1 Accent 5" w:uiPriority="63"/>
-    <w:lsdException w:name="Medium Shading 2 Accent 5" w:uiPriority="64"/>
-    <w:lsdException w:name="Medium List 1 Accent 5" w:uiPriority="65"/>
-    <w:lsdException w:name="Medium List 2 Accent 5" w:uiPriority="66"/>
-    <w:lsdException w:name="Medium Grid 1 Accent 5" w:uiPriority="67"/>
-    <w:lsdException w:name="Medium Grid 2 Accent 5" w:uiPriority="68"/>
-    <w:lsdException w:name="Medium Grid 3 Accent 5" w:uiPriority="69"/>
-    <w:lsdException w:name="Dark List Accent 5" w:uiPriority="70"/>
-    <w:lsdException w:name="Colorful Shading Accent 5" w:uiPriority="71"/>
-    <w:lsdException w:name="Colorful List Accent 5" w:uiPriority="72"/>
-    <w:lsdException w:name="Colorful Grid Accent 5" w:uiPriority="73"/>
-    <w:lsdException w:name="Light Shading Accent 6" w:uiPriority="60"/>
-    <w:lsdException w:name="Light List Accent 6" w:uiPriority="61"/>
-    <w:lsdException w:name="Light Grid Accent 6" w:uiPriority="62"/>
-    <w:lsdException w:name="Medium Shading 1 Accent 6" w:uiPriority="63"/>
-    <w:lsdException w:name="Medium Shading 2 Accent 6" w:uiPriority="64"/>
-    <w:lsdException w:name="Medium List 1 Accent 6" w:uiPriority="65"/>
-    <w:lsdException w:name="Medium List 2 Accent 6" w:uiPriority="66"/>
-    <w:lsdException w:name="Medium Grid 1 Accent 6" w:uiPriority="67"/>
-    <w:lsdException w:name="Medium Grid 2 Accent 6" w:uiPriority="68"/>
-    <w:lsdException w:name="Medium Grid 3 Accent 6" w:uiPriority="69"/>
-    <w:lsdException w:name="Dark List Accent 6" w:uiPriority="70"/>
-    <w:lsdException w:name="Colorful Shading Accent 6" w:uiPriority="71"/>
-    <w:lsdException w:name="Colorful List Accent 6" w:uiPriority="72"/>
-    <w:lsdException w:name="Colorful Grid Accent 6" w:uiPriority="73"/>
-    <w:lsdException w:name="Subtle Emphasis" w:uiPriority="19" w:qFormat="1"/>
-    <w:lsdException w:name="Intense Emphasis" w:uiPriority="21" w:qFormat="1"/>
-    <w:lsdException w:name="Subtle Reference" w:uiPriority="31" w:qFormat="1"/>
-    <w:lsdException w:name="Intense Reference" w:uiPriority="32" w:qFormat="1"/>
-    <w:lsdException w:name="Book Title" w:uiPriority="33" w:qFormat="1"/>
-    <w:lsdException w:name="Bibliography" w:semiHidden="1" w:uiPriority="37" w:unhideWhenUsed="1"/>
-    <w:lsdException w:name="TOC Heading" w:semiHidden="1" w:uiPriority="39" w:unhideWhenUsed="1" w:qFormat="1"/>
-    <w:lsdException w:name="Plain Table 1" w:uiPriority="41"/>
-    <w:lsdException w:name="Plain Table 2" w:uiPriority="42"/>
-    <w:lsdException w:name="Plain Table 3" w:uiPriority="43"/>
-    <w:lsdException w:name="Plain Table 4" w:uiPriority="44"/>
-    <w:lsdException w:name="Plain Table 5" w:uiPriority="45"/>
-    <w:lsdException w:name="Grid Table Light" w:uiPriority="40"/>
-    <w:lsdException w:name="Grid Table 1 Light" w:uiPriority="46"/>
-    <w:lsdException w:name="Grid Table 2" w:uiPriority="47"/>
-    <w:lsdException w:name="Grid Table 3" w:uiPriority="48"/>
-    <w:lsdException w:name="Grid Table 4" w:uiPriority="49"/>
-    <w:lsdException w:name="Grid Table 5 Dark" w:uiPriority="50"/>
-    <w:lsdException w:name="Grid Table 6 Colorful" w:uiPriority="51"/>
-    <w:lsdException w:name="Grid Table 7 Colorful" w:uiPriority="52"/>
-    <w:lsdException w:name="Grid Table 1 Light Accent 1" w:uiPriority="46"/>
-    <w:lsdException w:name="Grid Table 2 Accent 1" w:uiPriority="47"/>
-    <w:lsdException w:name="Grid Table 3 Accent 1" w:uiPriority="48"/>
-    <w:lsdException w:name="Grid Table 4 Accent 1" w:uiPriority="49"/>
-    <w:lsdException w:name="Grid Table 5 Dark Accent 1" w:uiPriority="50"/>
-    <w:lsdException w:name="Grid Table 6 Colorful Accent 1" w:uiPriority="51"/>
-    <w:lsdException w:name="Grid Table 7 Colorful Accent 1" w:uiPriority="52"/>
-    <w:lsdException w:name="Grid Table 1 Light Accent 2" w:uiPriority="46"/>
-    <w:lsdException w:name="Grid Table 2 Accent 2" w:uiPriority="47"/>
-    <w:lsdException w:name="Grid Table 3 Accent 2" w:uiPriority="48"/>
-    <w:lsdException w:name="Grid Table 4 Accent 2" w:uiPriority="49"/>
-    <w:lsdException w:name="Grid Table 5 Dark Accent 2" w:uiPriority="50"/>
-    <w:lsdException w:name="Grid Table 6 Colorful Accent 2" w:uiPriority="51"/>
-    <w:lsdException w:name="Grid Table 7 Colorful Accent 2" w:uiPriority="52"/>
-    <w:lsdException w:name="Grid Table 1 Light Accent 3" w:uiPriority="46"/>
-    <w:lsdException w:name="Grid Table 2 Accent 3" w:uiPriority="47"/>
-    <w:lsdException w:name="Grid Table 3 Accent 3" w:uiPriority="48"/>
-    <w:lsdException w:name="Grid Table 4 Accent 3" w:uiPriority="49"/>
-    <w:lsdException w:name="Grid Table 5 Dark Accent 3" w:uiPriority="50"/>
-    <w:lsdException w:name="Grid Table 6 Colorful Accent 3" w:uiPriority="51"/>
-    <w:lsdException w:name="Grid Table 7 Colorful Accent 3" w:uiPriority="52"/>
-    <w:lsdException w:name="Grid Table 1 Light Accent 4" w:uiPriority="46"/>
-    <w:lsdException w:name="Grid Table 2 Accent 4" w:uiPriority="47"/>
-    <w:lsdException w:name="Grid Table 3 Accent 4" w:uiPriority="48"/>
-    <w:lsdException w:name="Grid Table 4 Accent 4" w:uiPriority="49"/>
-    <w:lsdException w:name="Grid Table 5 Dark Accent 4" w:uiPriority="50"/>
-    <w:lsdException w:name="Grid Table 6 Colorful Accent 4" w:uiPriority="51"/>
-    <w:lsdException w:name="Grid Table 7 Colorful Accent 4" w:uiPriority="52"/>
-    <w:lsdException w:name="Grid Table 1 Light Accent 5" w:uiPriority="46"/>
-    <w:lsdException w:name="Grid Table 2 Accent 5" w:uiPriority="47"/>
-    <w:lsdException w:name="Grid Table 3 Accent 5" w:uiPriority="48"/>
-    <w:lsdException w:name="Grid Table 4 Accent 5" w:uiPriority="49"/>
-    <w:lsdException w:name="Grid Table 5 Dark Accent 5" w:uiPriority="50"/>
-    <w:lsdException w:name="Grid Table 6 Colorful Accent 5" w:uiPriority="51"/>
-    <w:lsdException w:name="Grid Table 7 Colorful Accent 5" w:uiPriority="52"/>
-    <w:lsdException w:name="Grid Table 1 Light Accent 6" w:uiPriority="46"/>
-    <w:lsdException w:name="Grid Table 2 Accent 6" w:uiPriority="47"/>
-    <w:lsdException w:name="Grid Table 3 Accent 6" w:uiPriority="48"/>
-    <w:lsdException w:name="Grid Table 4 Accent 6" w:uiPriority="49"/>
-    <w:lsdException w:name="Grid Table 5 Dark Accent 6" w:uiPriority="50"/>
-    <w:lsdException w:name="Grid Table 6 Colorful Accent 6" w:uiPriority="51"/>
-    <w:lsdException w:name="Grid Table 7 Colorful Accent 6" w:uiPriority="52"/>
-    <w:lsdException w:name="List Table 1 Light" w:uiPriority="46"/>
-    <w:lsdException w:name="List Table 2" w:uiPriority="47"/>
-    <w:lsdException w:name="List Table 3" w:uiPriority="48"/>
-    <w:lsdException w:name="List Table 4" w:uiPriority="49"/>
-    <w:lsdException w:name="List Table 5 Dark" w:uiPriority="50"/>
-    <w:lsdException w:name="List Table 6 Colorful" w:uiPriority="51"/>
-    <w:lsdException w:name="List Table 7 Colorful" w:uiPriority="52"/>
-    <w:lsdException w:name="List Table 1 Light Accent 1" w:uiPriority="46"/>
-    <w:lsdException w:name="List Table 2 Accent 1" w:uiPriority="47"/>
-    <w:lsdException w:name="List Table 3 Accent 1" w:uiPriority="48"/>
-    <w:lsdException w:name="List Table 4 Accent 1" w:uiPriority="49"/>
-    <w:lsdException w:name="List Table 5 Dark Accent 1" w:uiPriority="50"/>
-    <w:lsdException w:name="List Table 6 Colorful Accent 1" w:uiPriority="51"/>
-    <w:lsdException w:name="List Table 7 Colorful Accent 1" w:uiPriority="52"/>
-    <w:lsdException w:name="List Table 1 Light Accent 2" w:uiPriority="46"/>
-    <w:lsdException w:name="List Table 2 Accent 2" w:uiPriority="47"/>
-    <w:lsdException w:name="List Table 3 Accent 2" w:uiPriority="48"/>
-    <w:lsdException w:name="List Table 4 Accent 2" w:uiPriority="49"/>
-    <w:lsdException w:name="List Table 5 Dark Accent 2" w:uiPriority="50"/>
-    <w:lsdException w:name="List Table 6 Colorful Accent 2" w:uiPriority="51"/>
-    <w:lsdException w:name="List Table 7 Colorful Accent 2" w:uiPriority="52"/>
-    <w:lsdException w:name="List Table 1 Light Accent 3" w:uiPriority="46"/>
-    <w:lsdException w:name="List Table 2 Accent 3" w:uiPriority="47"/>
-    <w:lsdException w:name="List Table 3 Accent 3" w:uiPriority="48"/>
-    <w:lsdException w:name="List Table 4 Accent 3" w:uiPriority="49"/>
-    <w:lsdException w:name="List Table 5 Dark Accent 3" w:uiPriority="50"/>
-    <w:lsdException w:name="List Table 6 Colorful Accent 3" w:uiPriority="51"/>
-    <w:lsdException w:name="List Table 7 Colorful Accent 3" w:uiPriority="52"/>
-    <w:lsdException w:name="List Table 1 Light Accent 4" w:uiPriority="46"/>
-    <w:lsdException w:name="List Table 2 Accent 4" w:uiPriority="47"/>
-    <w:lsdException w:name="List Table 3 Accent 4" w:uiPriority="48"/>
-    <w:lsdException w:name="List Table 4 Accent 4" w:uiPriority="49"/>
-    <w:lsdException w:name="List Table 5 Dark Accent 4" w:uiPriority="50"/>
-    <w:lsdException w:name="List Table 6 Colorful Accent 4" w:uiPriority="51"/>
-    <w:lsdException w:name="List Table 7 Colorful Accent 4" w:uiPriority="52"/>
-    <w:lsdException w:name="List Table 1 Light Accent 5" w:uiPriority="46"/>
-    <w:lsdException w:name="List Table 2 Accent 5" w:uiPriority="47"/>
-    <w:lsdException w:name="List Table 3 Accent 5" w:uiPriority="48"/>
-    <w:lsdException w:name="List Table 4 Accent 5" w:uiPriority="49"/>
-    <w:lsdException w:name="List Table 5 Dark Accent 5" w:uiPriority="50"/>
-    <w:lsdException w:name="List Table 6 Colorful Accent 5" w:uiPriority="51"/>
-    <w:lsdException w:name="List Table 7 Colorful Accent 5" w:uiPriority="52"/>
-    <w:lsdException w:name="List Table 1 Light Accent 6" w:uiPriority="46"/>
-    <w:lsdException w:name="List Table 2 Accent 6" w:uiPriority="47"/>
-    <w:lsdException w:name="List Table 3 Accent 6" w:uiPriority="48"/>
-    <w:lsdException w:name="List Table 4 Accent 6" w:uiPriority="49"/>
-    <w:lsdException w:name="List Table 5 Dark Accent 6" w:uiPriority="50"/>
-    <w:lsdException w:name="List Table 6 Colorful Accent 6" w:uiPriority="51"/>
-    <w:lsdException w:name="List Table 7 Colorful Accent 6" w:uiPriority="52"/>
-    <w:lsdException w:name="Mention" w:semiHidden="1" w:unhideWhenUsed="1"/>
-    <w:lsdException w:name="Smart Hyperlink" w:semiHidden="1" w:unhideWhenUsed="1"/>
-    <w:lsdException w:name="Hashtag" w:semiHidden="1" w:unhideWhenUsed="1"/>
-    <w:lsdException w:name="Unresolved Mention" w:semiHidden="1" w:unhideWhenUsed="1"/>
-    <w:lsdException w:name="Smart Link" w:semiHidden="1" w:unhideWhenUsed="1"/>
+  <w:latentStyles w:count="260" w:defQFormat="0" w:defUnhideWhenUsed="1" w:defSemiHidden="1" w:defUIPriority="99" w:defLockedState="0">
+    <w:lsdException w:qFormat="1" w:unhideWhenUsed="0" w:uiPriority="0" w:semiHidden="0" w:name="Normal"/>
+    <w:lsdException w:qFormat="1" w:unhideWhenUsed="0" w:uiPriority="9" w:semiHidden="0" w:name="heading 1"/>
+    <w:lsdException w:qFormat="1" w:uiPriority="9" w:semiHidden="0" w:name="heading 2"/>
+    <w:lsdException w:qFormat="1" w:uiPriority="9" w:name="heading 3"/>
+    <w:lsdException w:qFormat="1" w:uiPriority="9" w:name="heading 4"/>
+    <w:lsdException w:qFormat="1" w:uiPriority="9" w:name="heading 5"/>
+    <w:lsdException w:qFormat="1" w:uiPriority="9" w:name="heading 6"/>
+    <w:lsdException w:qFormat="1" w:uiPriority="9" w:name="heading 7"/>
+    <w:lsdException w:qFormat="1" w:uiPriority="9" w:name="heading 8"/>
+    <w:lsdException w:qFormat="1" w:uiPriority="9" w:name="heading 9"/>
+    <w:lsdException w:uiPriority="99" w:name="index 1"/>
+    <w:lsdException w:uiPriority="99" w:name="index 2"/>
+    <w:lsdException w:uiPriority="99" w:name="index 3"/>
+    <w:lsdException w:uiPriority="99" w:name="index 4"/>
+    <w:lsdException w:uiPriority="99" w:name="index 5"/>
+    <w:lsdException w:uiPriority="99" w:name="index 6"/>
+    <w:lsdException w:uiPriority="99" w:name="index 7"/>
+    <w:lsdException w:uiPriority="99" w:name="index 8"/>
+    <w:lsdException w:uiPriority="99" w:name="index 9"/>
+    <w:lsdException w:uiPriority="39" w:name="toc 1"/>
+    <w:lsdException w:uiPriority="39" w:name="toc 2"/>
+    <w:lsdException w:uiPriority="39" w:name="toc 3"/>
+    <w:lsdException w:uiPriority="39" w:name="toc 4"/>
+    <w:lsdException w:uiPriority="39" w:name="toc 5"/>
+    <w:lsdException w:uiPriority="39" w:name="toc 6"/>
+    <w:lsdException w:uiPriority="39" w:name="toc 7"/>
+    <w:lsdException w:uiPriority="39" w:name="toc 8"/>
+    <w:lsdException w:uiPriority="39" w:name="toc 9"/>
+    <w:lsdException w:uiPriority="99" w:name="Normal Indent"/>
+    <w:lsdException w:uiPriority="99" w:name="footnote text"/>
+    <w:lsdException w:uiPriority="99" w:name="annotation text"/>
+    <w:lsdException w:uiPriority="99" w:name="header"/>
+    <w:lsdException w:uiPriority="99" w:name="footer"/>
+    <w:lsdException w:uiPriority="99" w:name="index heading"/>
+    <w:lsdException w:unhideWhenUsed="0" w:uiPriority="0" w:semiHidden="0" w:name="caption"/>
+    <w:lsdException w:uiPriority="99" w:name="table of figures"/>
+    <w:lsdException w:uiPriority="99" w:name="envelope address"/>
+    <w:lsdException w:uiPriority="99" w:name="envelope return"/>
+    <w:lsdException w:uiPriority="99" w:name="footnote reference"/>
+    <w:lsdException w:uiPriority="99" w:name="annotation reference"/>
+    <w:lsdException w:uiPriority="99" w:name="line number"/>
+    <w:lsdException w:uiPriority="99" w:name="page number"/>
+    <w:lsdException w:uiPriority="99" w:name="endnote reference"/>
+    <w:lsdException w:uiPriority="99" w:name="endnote text"/>
+    <w:lsdException w:uiPriority="99" w:name="table of authorities"/>
+    <w:lsdException w:uiPriority="99" w:name="macro"/>
+    <w:lsdException w:uiPriority="99" w:name="toa heading"/>
+    <w:lsdException w:qFormat="1" w:unhideWhenUsed="0" w:uiPriority="0" w:semiHidden="0" w:name="List"/>
+    <w:lsdException w:uiPriority="99" w:name="List Bullet"/>
+    <w:lsdException w:uiPriority="99" w:name="List Number"/>
+    <w:lsdException w:uiPriority="99" w:name="List 2"/>
+    <w:lsdException w:uiPriority="99" w:name="List 3"/>
+    <w:lsdException w:uiPriority="99" w:name="List 4"/>
+    <w:lsdException w:uiPriority="99" w:name="List 5"/>
+    <w:lsdException w:uiPriority="99" w:name="List Bullet 2"/>
+    <w:lsdException w:uiPriority="99" w:name="List Bullet 3"/>
+    <w:lsdException w:uiPriority="99" w:name="List Bullet 4"/>
+    <w:lsdException w:uiPriority="99" w:name="List Bullet 5"/>
+    <w:lsdException w:uiPriority="99" w:name="List Number 2"/>
+    <w:lsdException w:uiPriority="99" w:name="List Number 3"/>
+    <w:lsdException w:uiPriority="99" w:name="List Number 4"/>
+    <w:lsdException w:uiPriority="99" w:name="List Number 5"/>
+    <w:lsdException w:qFormat="1" w:unhideWhenUsed="0" w:uiPriority="10" w:semiHidden="0" w:name="Title"/>
+    <w:lsdException w:uiPriority="99" w:name="Closing"/>
+    <w:lsdException w:uiPriority="99" w:name="Signature"/>
+    <w:lsdException w:uiPriority="1" w:name="Default Paragraph Font"/>
+    <w:lsdException w:qFormat="1" w:unhideWhenUsed="0" w:uiPriority="0" w:semiHidden="0" w:name="Body Text"/>
+    <w:lsdException w:unhideWhenUsed="0" w:uiPriority="0" w:semiHidden="0" w:name="Body Text Indent"/>
+    <w:lsdException w:uiPriority="99" w:name="List Continue"/>
+    <w:lsdException w:uiPriority="99" w:name="List Continue 2"/>
+    <w:lsdException w:uiPriority="99" w:name="List Continue 3"/>
+    <w:lsdException w:uiPriority="99" w:name="List Continue 4"/>
+    <w:lsdException w:uiPriority="99" w:name="List Continue 5"/>
+    <w:lsdException w:uiPriority="99" w:name="Message Header"/>
+    <w:lsdException w:qFormat="1" w:unhideWhenUsed="0" w:uiPriority="11" w:semiHidden="0" w:name="Subtitle"/>
+    <w:lsdException w:uiPriority="99" w:name="Salutation"/>
+    <w:lsdException w:uiPriority="99" w:name="Date"/>
+    <w:lsdException w:uiPriority="99" w:name="Body Text First Indent"/>
+    <w:lsdException w:uiPriority="99" w:name="Body Text First Indent 2"/>
+    <w:lsdException w:uiPriority="99" w:name="Note Heading"/>
+    <w:lsdException w:uiPriority="99" w:name="Body Text 2"/>
+    <w:lsdException w:uiPriority="99" w:name="Body Text 3"/>
+    <w:lsdException w:uiPriority="99" w:name="Body Text Indent 2"/>
+    <w:lsdException w:uiPriority="99" w:name="Body Text Indent 3"/>
+    <w:lsdException w:uiPriority="99" w:name="Block Text"/>
+    <w:lsdException w:uiPriority="99" w:name="Hyperlink"/>
+    <w:lsdException w:uiPriority="99" w:name="FollowedHyperlink"/>
+    <w:lsdException w:qFormat="1" w:unhideWhenUsed="0" w:uiPriority="22" w:semiHidden="0" w:name="Strong"/>
+    <w:lsdException w:qFormat="1" w:unhideWhenUsed="0" w:uiPriority="20" w:semiHidden="0" w:name="Emphasis"/>
+    <w:lsdException w:uiPriority="99" w:name="Document Map"/>
+    <w:lsdException w:uiPriority="99" w:name="Plain Text"/>
+    <w:lsdException w:uiPriority="99" w:name="E-mail Signature"/>
+    <w:lsdException w:uiPriority="99" w:name="Normal (Web)"/>
+    <w:lsdException w:uiPriority="99" w:name="HTML Acronym"/>
+    <w:lsdException w:uiPriority="99" w:name="HTML Address"/>
+    <w:lsdException w:uiPriority="99" w:name="HTML Cite"/>
+    <w:lsdException w:uiPriority="99" w:name="HTML Code"/>
+    <w:lsdException w:uiPriority="99" w:name="HTML Definition"/>
+    <w:lsdException w:uiPriority="99" w:name="HTML Keyboard"/>
+    <w:lsdException w:uiPriority="99" w:name="HTML Preformatted"/>
+    <w:lsdException w:uiPriority="99" w:name="HTML Sample"/>
+    <w:lsdException w:uiPriority="99" w:name="HTML Typewriter"/>
+    <w:lsdException w:uiPriority="99" w:name="HTML Variable"/>
+    <w:lsdException w:uiPriority="99" w:name="Normal Table"/>
+    <w:lsdException w:uiPriority="99" w:name="annotation subject"/>
+    <w:lsdException w:uiPriority="99" w:name="Table Simple 1"/>
+    <w:lsdException w:uiPriority="99" w:name="Table Simple 2"/>
+    <w:lsdException w:uiPriority="99" w:name="Table Simple 3"/>
+    <w:lsdException w:uiPriority="99" w:name="Table Classic 1"/>
+    <w:lsdException w:uiPriority="99" w:name="Table Classic 2"/>
+    <w:lsdException w:uiPriority="99" w:name="Table Classic 3"/>
+    <w:lsdException w:uiPriority="99" w:name="Table Classic 4"/>
+    <w:lsdException w:uiPriority="99" w:name="Table Colorful 1"/>
+    <w:lsdException w:uiPriority="99" w:name="Table Colorful 2"/>
+    <w:lsdException w:uiPriority="99" w:name="Table Colorful 3"/>
+    <w:lsdException w:uiPriority="99" w:name="Table Columns 1"/>
+    <w:lsdException w:uiPriority="99" w:name="Table Columns 2"/>
+    <w:lsdException w:uiPriority="99" w:name="Table Columns 3"/>
+    <w:lsdException w:uiPriority="99" w:name="Table Columns 4"/>
+    <w:lsdException w:uiPriority="99" w:name="Table Columns 5"/>
+    <w:lsdException w:uiPriority="99" w:name="Table Grid 1"/>
+    <w:lsdException w:uiPriority="99" w:name="Table Grid 2"/>
+    <w:lsdException w:uiPriority="99" w:name="Table Grid 3"/>
+    <w:lsdException w:uiPriority="99" w:name="Table Grid 4"/>
+    <w:lsdException w:uiPriority="99" w:name="Table Grid 5"/>
+    <w:lsdException w:uiPriority="99" w:name="Table Grid 6"/>
+    <w:lsdException w:uiPriority="99" w:name="Table Grid 7"/>
+    <w:lsdException w:uiPriority="99" w:name="Table Grid 8"/>
+    <w:lsdException w:uiPriority="99" w:name="Table List 1"/>
+    <w:lsdException w:uiPriority="99" w:name="Table List 2"/>
+    <w:lsdException w:uiPriority="99" w:name="Table List 3"/>
+    <w:lsdException w:uiPriority="99" w:name="Table List 4"/>
+    <w:lsdException w:uiPriority="99" w:name="Table List 5"/>
+    <w:lsdException w:uiPriority="99" w:name="Table List 6"/>
+    <w:lsdException w:uiPriority="99" w:name="Table List 7"/>
+    <w:lsdException w:uiPriority="99" w:name="Table List 8"/>
+    <w:lsdException w:uiPriority="99" w:name="Table 3D effects 1"/>
+    <w:lsdException w:uiPriority="99" w:name="Table 3D effects 2"/>
+    <w:lsdException w:uiPriority="99" w:name="Table 3D effects 3"/>
+    <w:lsdException w:uiPriority="99" w:name="Table Contemporary"/>
+    <w:lsdException w:uiPriority="99" w:name="Table Elegant"/>
+    <w:lsdException w:uiPriority="99" w:name="Table Professional"/>
+    <w:lsdException w:uiPriority="99" w:name="Table Subtle 1"/>
+    <w:lsdException w:uiPriority="99" w:name="Table Subtle 2"/>
+    <w:lsdException w:uiPriority="99" w:name="Table Web 1"/>
+    <w:lsdException w:uiPriority="99" w:name="Table Web 2"/>
+    <w:lsdException w:uiPriority="99" w:name="Table Web 3"/>
+    <w:lsdException w:uiPriority="99" w:name="Balloon Text"/>
+    <w:lsdException w:unhideWhenUsed="0" w:uiPriority="39" w:semiHidden="0" w:name="Table Grid"/>
+    <w:lsdException w:uiPriority="99" w:name="Table Theme"/>
+    <w:lsdException w:qFormat="1" w:unhideWhenUsed="0" w:uiPriority="34" w:semiHidden="0" w:name="List Paragraph"/>
   </w:latentStyles>
-  <w:style w:type="paragraph" w:default="1" w:styleId="Normal">
+  <w:style w:type="paragraph" w:default="1" w:styleId="1">
     <w:name w:val="Normal"/>
     <w:qFormat/>
-  </w:style>
-  <w:style w:type="paragraph" w:styleId="Ttulo1">
+    <w:uiPriority w:val="0"/>
+    <w:rPr>
+      <w:rFonts w:ascii="Times New Roman" w:hAnsi="Times New Roman" w:eastAsia="Times New Roman" w:cs="Times New Roman"/>
+      <w:sz w:val="24"/>
+      <w:szCs w:val="24"/>
+      <w:lang w:val="pt-BR" w:eastAsia="pt-BR" w:bidi="ar-SA"/>
+    </w:rPr>
+  </w:style>
+  <w:style w:type="paragraph" w:styleId="2">
     <w:name w:val="heading 1"/>
-    <w:basedOn w:val="Normal"/>
-    <w:next w:val="Normal"/>
+    <w:basedOn w:val="1"/>
+    <w:next w:val="1"/>
+    <w:qFormat/>
     <w:uiPriority w:val="9"/>
-    <w:qFormat/>
     <w:pPr>
       <w:keepNext/>
       <w:outlineLvl w:val="0"/>
@@ -3285,13 +3030,13 @@
       <w:szCs w:val="28"/>
     </w:rPr>
   </w:style>
-  <w:style w:type="paragraph" w:styleId="Ttulo2">
+  <w:style w:type="paragraph" w:styleId="3">
     <w:name w:val="heading 2"/>
-    <w:basedOn w:val="Normal"/>
-    <w:next w:val="Normal"/>
-    <w:uiPriority w:val="9"/>
+    <w:basedOn w:val="1"/>
+    <w:next w:val="1"/>
     <w:unhideWhenUsed/>
     <w:qFormat/>
+    <w:uiPriority w:val="9"/>
     <w:pPr>
       <w:keepNext/>
       <w:jc w:val="center"/>
@@ -3302,14 +3047,14 @@
       <w:szCs w:val="28"/>
     </w:rPr>
   </w:style>
-  <w:style w:type="paragraph" w:styleId="Ttulo3">
+  <w:style w:type="paragraph" w:styleId="4">
     <w:name w:val="heading 3"/>
-    <w:basedOn w:val="Normal"/>
-    <w:next w:val="Normal"/>
-    <w:uiPriority w:val="9"/>
+    <w:basedOn w:val="1"/>
+    <w:next w:val="1"/>
     <w:semiHidden/>
     <w:unhideWhenUsed/>
     <w:qFormat/>
+    <w:uiPriority w:val="9"/>
     <w:pPr>
       <w:keepNext/>
       <w:keepLines/>
@@ -3322,14 +3067,14 @@
       <w:szCs w:val="28"/>
     </w:rPr>
   </w:style>
-  <w:style w:type="paragraph" w:styleId="Ttulo4">
+  <w:style w:type="paragraph" w:styleId="5">
     <w:name w:val="heading 4"/>
-    <w:basedOn w:val="Normal"/>
-    <w:next w:val="Normal"/>
-    <w:uiPriority w:val="9"/>
+    <w:basedOn w:val="1"/>
+    <w:next w:val="1"/>
     <w:semiHidden/>
     <w:unhideWhenUsed/>
     <w:qFormat/>
+    <w:uiPriority w:val="9"/>
     <w:pPr>
       <w:keepNext/>
       <w:keepLines/>
@@ -3340,14 +3085,14 @@
       <w:b/>
     </w:rPr>
   </w:style>
-  <w:style w:type="paragraph" w:styleId="Ttulo5">
+  <w:style w:type="paragraph" w:styleId="6">
     <w:name w:val="heading 5"/>
-    <w:basedOn w:val="Normal"/>
-    <w:next w:val="Normal"/>
-    <w:uiPriority w:val="9"/>
+    <w:basedOn w:val="1"/>
+    <w:next w:val="1"/>
     <w:semiHidden/>
     <w:unhideWhenUsed/>
     <w:qFormat/>
+    <w:uiPriority w:val="9"/>
     <w:pPr>
       <w:keepNext/>
       <w:keepLines/>
@@ -3360,14 +3105,14 @@
       <w:szCs w:val="22"/>
     </w:rPr>
   </w:style>
-  <w:style w:type="paragraph" w:styleId="Ttulo6">
+  <w:style w:type="paragraph" w:styleId="7">
     <w:name w:val="heading 6"/>
-    <w:basedOn w:val="Normal"/>
-    <w:next w:val="Normal"/>
-    <w:uiPriority w:val="9"/>
+    <w:basedOn w:val="1"/>
+    <w:next w:val="1"/>
     <w:semiHidden/>
     <w:unhideWhenUsed/>
     <w:qFormat/>
+    <w:uiPriority w:val="9"/>
     <w:pPr>
       <w:keepNext/>
       <w:keepLines/>
@@ -3380,19 +3125,18 @@
       <w:szCs w:val="20"/>
     </w:rPr>
   </w:style>
-  <w:style w:type="character" w:default="1" w:styleId="Fontepargpadro">
+  <w:style w:type="character" w:default="1" w:styleId="8">
     <w:name w:val="Default Paragraph Font"/>
-    <w:uiPriority w:val="1"/>
     <w:semiHidden/>
     <w:unhideWhenUsed/>
-  </w:style>
-  <w:style w:type="table" w:default="1" w:styleId="Tabelanormal">
+    <w:uiPriority w:val="1"/>
+  </w:style>
+  <w:style w:type="table" w:default="1" w:styleId="9">
     <w:name w:val="Normal Table"/>
-    <w:uiPriority w:val="99"/>
     <w:semiHidden/>
     <w:unhideWhenUsed/>
+    <w:uiPriority w:val="99"/>
     <w:tblPr>
-      <w:tblInd w:w="0" w:type="dxa"/>
       <w:tblCellMar>
         <w:top w:w="0" w:type="dxa"/>
         <w:left w:w="108" w:type="dxa"/>
@@ -3401,34 +3145,64 @@
       </w:tblCellMar>
     </w:tblPr>
   </w:style>
-  <w:style w:type="numbering" w:default="1" w:styleId="Semlista">
-    <w:name w:val="No List"/>
-    <w:uiPriority w:val="99"/>
+  <w:style w:type="character" w:styleId="10">
+    <w:name w:val="annotation reference"/>
+    <w:basedOn w:val="8"/>
     <w:semiHidden/>
     <w:unhideWhenUsed/>
-  </w:style>
-  <w:style w:type="table" w:customStyle="1" w:styleId="TableNormal">
-    <w:name w:val="TableNormal"/>
-    <w:tblPr>
-      <w:tblCellMar>
-        <w:top w:w="100" w:type="dxa"/>
-        <w:left w:w="100" w:type="dxa"/>
-        <w:bottom w:w="100" w:type="dxa"/>
-        <w:right w:w="100" w:type="dxa"/>
-      </w:tblCellMar>
-    </w:tblPr>
-  </w:style>
-  <w:style w:type="paragraph" w:styleId="Ttulo">
+    <w:uiPriority w:val="99"/>
+    <w:rPr>
+      <w:sz w:val="16"/>
+      <w:szCs w:val="16"/>
+    </w:rPr>
+  </w:style>
+  <w:style w:type="paragraph" w:styleId="11">
+    <w:name w:val="List"/>
+    <w:basedOn w:val="12"/>
+    <w:qFormat/>
+    <w:uiPriority w:val="0"/>
+    <w:rPr>
+      <w:rFonts w:cs="Noto Sans Devanagari"/>
+    </w:rPr>
+  </w:style>
+  <w:style w:type="paragraph" w:styleId="12">
+    <w:name w:val="Body Text"/>
+    <w:basedOn w:val="1"/>
+    <w:qFormat/>
+    <w:uiPriority w:val="0"/>
+    <w:pPr>
+      <w:spacing w:after="140" w:line="276" w:lineRule="auto"/>
+      <w:ind w:left="-1" w:leftChars="-1" w:hanging="1" w:hangingChars="1"/>
+      <w:textAlignment w:val="top"/>
+      <w:outlineLvl w:val="0"/>
+    </w:pPr>
+    <w:rPr>
+      <w:position w:val="-1"/>
+      <w:lang w:eastAsia="zh-CN"/>
+    </w:rPr>
+  </w:style>
+  <w:style w:type="paragraph" w:styleId="13">
+    <w:name w:val="annotation text"/>
+    <w:basedOn w:val="1"/>
+    <w:link w:val="44"/>
+    <w:semiHidden/>
+    <w:unhideWhenUsed/>
+    <w:uiPriority w:val="99"/>
+    <w:rPr>
+      <w:sz w:val="20"/>
+      <w:szCs w:val="20"/>
+    </w:rPr>
+  </w:style>
+  <w:style w:type="paragraph" w:styleId="14">
     <w:name w:val="Title"/>
-    <w:basedOn w:val="Normal"/>
-    <w:next w:val="Corpodetexto"/>
+    <w:basedOn w:val="1"/>
+    <w:next w:val="12"/>
+    <w:qFormat/>
     <w:uiPriority w:val="10"/>
-    <w:qFormat/>
     <w:pPr>
       <w:spacing w:line="1" w:lineRule="atLeast"/>
-      <w:ind w:leftChars="-1" w:left="-1" w:hangingChars="1" w:hanging="1"/>
+      <w:ind w:left="-1" w:leftChars="-1" w:hanging="1" w:hangingChars="1"/>
       <w:jc w:val="center"/>
-      <w:textDirection w:val="btLr"/>
       <w:textAlignment w:val="top"/>
       <w:outlineLvl w:val="0"/>
     </w:pPr>
@@ -3440,81 +3214,14 @@
       <w:lang w:eastAsia="zh-CN"/>
     </w:rPr>
   </w:style>
-  <w:style w:type="table" w:customStyle="1" w:styleId="TableNormal0">
-    <w:name w:val="TableNormal"/>
-    <w:tblPr>
-      <w:tblCellMar>
-        <w:top w:w="0" w:type="dxa"/>
-        <w:left w:w="0" w:type="dxa"/>
-        <w:bottom w:w="0" w:type="dxa"/>
-        <w:right w:w="0" w:type="dxa"/>
-      </w:tblCellMar>
-    </w:tblPr>
-  </w:style>
-  <w:style w:type="table" w:customStyle="1" w:styleId="TableNormal1">
-    <w:name w:val="TableNormal"/>
-    <w:tblPr>
-      <w:tblCellMar>
-        <w:top w:w="0" w:type="dxa"/>
-        <w:left w:w="0" w:type="dxa"/>
-        <w:bottom w:w="0" w:type="dxa"/>
-        <w:right w:w="0" w:type="dxa"/>
-      </w:tblCellMar>
-    </w:tblPr>
-  </w:style>
-  <w:style w:type="table" w:customStyle="1" w:styleId="TableNormal2">
-    <w:name w:val="TableNormal"/>
-    <w:tblPr>
-      <w:tblCellMar>
-        <w:top w:w="0" w:type="dxa"/>
-        <w:left w:w="0" w:type="dxa"/>
-        <w:bottom w:w="0" w:type="dxa"/>
-        <w:right w:w="0" w:type="dxa"/>
-      </w:tblCellMar>
-    </w:tblPr>
-  </w:style>
-  <w:style w:type="character" w:customStyle="1" w:styleId="WW8Num1z0">
-    <w:name w:val="WW8Num1z0"/>
-    <w:rPr>
-      <w:rFonts w:ascii="Symbol" w:hAnsi="Symbol" w:cs="Symbol" w:hint="default"/>
-      <w:w w:val="100"/>
-      <w:position w:val="-1"/>
-      <w:effect w:val="none"/>
-      <w:vertAlign w:val="baseline"/>
-      <w:cs w:val="0"/>
-      <w:em w:val="none"/>
-    </w:rPr>
-  </w:style>
-  <w:style w:type="paragraph" w:styleId="Corpodetexto">
-    <w:name w:val="Body Text"/>
-    <w:basedOn w:val="Normal"/>
-    <w:pPr>
-      <w:spacing w:after="140" w:line="276" w:lineRule="auto"/>
-      <w:ind w:leftChars="-1" w:left="-1" w:hangingChars="1" w:hanging="1"/>
-      <w:textDirection w:val="btLr"/>
-      <w:textAlignment w:val="top"/>
-      <w:outlineLvl w:val="0"/>
-    </w:pPr>
-    <w:rPr>
-      <w:position w:val="-1"/>
-      <w:lang w:eastAsia="zh-CN"/>
-    </w:rPr>
-  </w:style>
-  <w:style w:type="paragraph" w:styleId="Lista">
-    <w:name w:val="List"/>
-    <w:basedOn w:val="Corpodetexto"/>
-    <w:rPr>
-      <w:rFonts w:cs="Noto Sans Devanagari"/>
-    </w:rPr>
-  </w:style>
-  <w:style w:type="paragraph" w:styleId="Legenda">
+  <w:style w:type="paragraph" w:styleId="15">
     <w:name w:val="caption"/>
-    <w:basedOn w:val="Normal"/>
+    <w:basedOn w:val="1"/>
+    <w:uiPriority w:val="0"/>
     <w:pPr>
       <w:suppressLineNumbers/>
       <w:spacing w:before="120" w:after="120" w:line="1" w:lineRule="atLeast"/>
-      <w:ind w:leftChars="-1" w:left="-1" w:hangingChars="1" w:hanging="1"/>
-      <w:textDirection w:val="btLr"/>
+      <w:ind w:left="-1" w:leftChars="-1" w:hanging="1" w:hangingChars="1"/>
       <w:textAlignment w:val="top"/>
       <w:outlineLvl w:val="0"/>
     </w:pPr>
@@ -3526,14 +3233,87 @@
       <w:lang w:eastAsia="zh-CN"/>
     </w:rPr>
   </w:style>
-  <w:style w:type="paragraph" w:customStyle="1" w:styleId="ndice">
+  <w:style w:type="paragraph" w:styleId="16">
+    <w:name w:val="Balloon Text"/>
+    <w:basedOn w:val="1"/>
+    <w:link w:val="45"/>
+    <w:semiHidden/>
+    <w:unhideWhenUsed/>
+    <w:uiPriority w:val="99"/>
+    <w:rPr>
+      <w:rFonts w:ascii="Segoe UI" w:hAnsi="Segoe UI" w:cs="Segoe UI"/>
+      <w:sz w:val="18"/>
+      <w:szCs w:val="18"/>
+    </w:rPr>
+  </w:style>
+  <w:style w:type="paragraph" w:styleId="17">
+    <w:name w:val="Subtitle"/>
+    <w:basedOn w:val="1"/>
+    <w:next w:val="1"/>
+    <w:qFormat/>
+    <w:uiPriority w:val="11"/>
+    <w:pPr>
+      <w:keepNext/>
+      <w:keepLines/>
+      <w:spacing w:before="360" w:after="80"/>
+    </w:pPr>
+    <w:rPr>
+      <w:rFonts w:ascii="Georgia" w:hAnsi="Georgia" w:eastAsia="Georgia" w:cs="Georgia"/>
+      <w:i/>
+      <w:color w:val="666666"/>
+      <w:sz w:val="48"/>
+      <w:szCs w:val="48"/>
+    </w:rPr>
+  </w:style>
+  <w:style w:type="paragraph" w:styleId="18">
+    <w:name w:val="Body Text Indent"/>
+    <w:basedOn w:val="1"/>
+    <w:uiPriority w:val="0"/>
+    <w:pPr>
+      <w:spacing w:line="1" w:lineRule="atLeast"/>
+      <w:ind w:left="284" w:leftChars="-1" w:hangingChars="1"/>
+      <w:textAlignment w:val="top"/>
+      <w:outlineLvl w:val="0"/>
+    </w:pPr>
+    <w:rPr>
+      <w:position w:val="-1"/>
+      <w:sz w:val="28"/>
+      <w:szCs w:val="20"/>
+      <w:lang w:eastAsia="zh-CN"/>
+    </w:rPr>
+  </w:style>
+  <w:style w:type="table" w:customStyle="1" w:styleId="19">
+    <w:name w:val="TableNormal"/>
+    <w:uiPriority w:val="0"/>
+    <w:tblPr>
+      <w:tblCellMar>
+        <w:top w:w="0" w:type="dxa"/>
+        <w:left w:w="0" w:type="dxa"/>
+        <w:bottom w:w="0" w:type="dxa"/>
+        <w:right w:w="0" w:type="dxa"/>
+      </w:tblCellMar>
+    </w:tblPr>
+  </w:style>
+  <w:style w:type="character" w:customStyle="1" w:styleId="20">
+    <w:name w:val="WW8Num1z0"/>
+    <w:uiPriority w:val="0"/>
+    <w:rPr>
+      <w:rFonts w:hint="default" w:ascii="Symbol" w:hAnsi="Symbol" w:cs="Symbol"/>
+      <w:w w:val="100"/>
+      <w:position w:val="-1"/>
+      <w:vertAlign w:val="baseline"/>
+      <w:cs w:val="0"/>
+    </w:rPr>
+  </w:style>
+  <w:style w:type="paragraph" w:customStyle="1" w:styleId="21">
     <w:name w:val="Índice"/>
-    <w:basedOn w:val="Normal"/>
+    <w:basedOn w:val="1"/>
+    <w:qFormat/>
+    <w:uiPriority w:val="0"/>
     <w:pPr>
       <w:suppressLineNumbers/>
       <w:spacing w:line="1" w:lineRule="atLeast"/>
-      <w:ind w:leftChars="-1" w:left="-1" w:hangingChars="1" w:hanging="1"/>
-      <w:textDirection w:val="btLr"/>
+      <w:ind w:left="-1" w:leftChars="-1" w:hanging="1" w:hangingChars="1"/>
       <w:textAlignment w:val="top"/>
       <w:outlineLvl w:val="0"/>
     </w:pPr>
@@ -3543,14 +3323,15 @@
       <w:lang w:eastAsia="zh-CN"/>
     </w:rPr>
   </w:style>
-  <w:style w:type="paragraph" w:customStyle="1" w:styleId="Caption1">
+  <w:style w:type="paragraph" w:customStyle="1" w:styleId="22">
     <w:name w:val="Caption1"/>
-    <w:basedOn w:val="Normal"/>
+    <w:basedOn w:val="1"/>
+    <w:qFormat/>
+    <w:uiPriority w:val="0"/>
     <w:pPr>
       <w:suppressLineNumbers/>
       <w:spacing w:before="120" w:after="120" w:line="1" w:lineRule="atLeast"/>
-      <w:ind w:leftChars="-1" w:left="-1" w:hangingChars="1" w:hanging="1"/>
-      <w:textDirection w:val="btLr"/>
+      <w:ind w:left="-1" w:leftChars="-1" w:hanging="1" w:hangingChars="1"/>
       <w:textAlignment w:val="top"/>
       <w:outlineLvl w:val="0"/>
     </w:pPr>
@@ -3562,32 +3343,15 @@
       <w:lang w:eastAsia="zh-CN"/>
     </w:rPr>
   </w:style>
-  <w:style w:type="paragraph" w:styleId="Recuodecorpodetexto">
-    <w:name w:val="Body Text Indent"/>
-    <w:basedOn w:val="Normal"/>
-    <w:pPr>
-      <w:spacing w:line="1" w:lineRule="atLeast"/>
-      <w:ind w:leftChars="-1" w:left="284" w:hangingChars="1"/>
-      <w:textDirection w:val="btLr"/>
-      <w:textAlignment w:val="top"/>
-      <w:outlineLvl w:val="0"/>
-    </w:pPr>
-    <w:rPr>
-      <w:position w:val="-1"/>
-      <w:sz w:val="28"/>
-      <w:szCs w:val="20"/>
-      <w:lang w:eastAsia="zh-CN"/>
-    </w:rPr>
-  </w:style>
-  <w:style w:type="paragraph" w:customStyle="1" w:styleId="Contedodatabela">
+  <w:style w:type="paragraph" w:customStyle="1" w:styleId="23">
     <w:name w:val="Conteúdo da tabela"/>
-    <w:basedOn w:val="Normal"/>
+    <w:basedOn w:val="1"/>
+    <w:uiPriority w:val="0"/>
     <w:pPr>
       <w:widowControl w:val="0"/>
       <w:suppressLineNumbers/>
       <w:spacing w:line="1" w:lineRule="atLeast"/>
-      <w:ind w:leftChars="-1" w:left="-1" w:hangingChars="1" w:hanging="1"/>
-      <w:textDirection w:val="btLr"/>
+      <w:ind w:left="-1" w:leftChars="-1" w:hanging="1" w:hangingChars="1"/>
       <w:textAlignment w:val="top"/>
       <w:outlineLvl w:val="0"/>
     </w:pPr>
@@ -3596,9 +3360,11 @@
       <w:lang w:eastAsia="zh-CN"/>
     </w:rPr>
   </w:style>
-  <w:style w:type="paragraph" w:customStyle="1" w:styleId="Ttulodetabela">
+  <w:style w:type="paragraph" w:customStyle="1" w:styleId="24">
     <w:name w:val="Título de tabela"/>
-    <w:basedOn w:val="Contedodatabela"/>
+    <w:basedOn w:val="23"/>
+    <w:qFormat/>
+    <w:uiPriority w:val="0"/>
     <w:pPr>
       <w:jc w:val="center"/>
     </w:pPr>
@@ -3607,11 +3373,12 @@
       <w:bCs/>
     </w:rPr>
   </w:style>
-  <w:style w:type="table" w:customStyle="1" w:styleId="a">
-    <w:basedOn w:val="TableNormal2"/>
+  <w:style w:type="table" w:customStyle="1" w:styleId="25">
+    <w:name w:val="_Style 23"/>
+    <w:basedOn w:val="19"/>
+    <w:qFormat/>
+    <w:uiPriority w:val="0"/>
     <w:tblPr>
-      <w:tblStyleRowBandSize w:val="1"/>
-      <w:tblStyleColBandSize w:val="1"/>
       <w:tblCellMar>
         <w:top w:w="0" w:type="dxa"/>
         <w:left w:w="70" w:type="dxa"/>
@@ -3620,11 +3387,11 @@
       </w:tblCellMar>
     </w:tblPr>
   </w:style>
-  <w:style w:type="table" w:customStyle="1" w:styleId="a0">
-    <w:basedOn w:val="TableNormal2"/>
+  <w:style w:type="table" w:customStyle="1" w:styleId="26">
+    <w:name w:val="_Style 24"/>
+    <w:basedOn w:val="19"/>
+    <w:uiPriority w:val="0"/>
     <w:tblPr>
-      <w:tblStyleRowBandSize w:val="1"/>
-      <w:tblStyleColBandSize w:val="1"/>
       <w:tblCellMar>
         <w:top w:w="0" w:type="dxa"/>
         <w:left w:w="70" w:type="dxa"/>
@@ -3633,11 +3400,12 @@
       </w:tblCellMar>
     </w:tblPr>
   </w:style>
-  <w:style w:type="table" w:customStyle="1" w:styleId="a1">
-    <w:basedOn w:val="TableNormal2"/>
+  <w:style w:type="table" w:customStyle="1" w:styleId="27">
+    <w:name w:val="_Style 25"/>
+    <w:basedOn w:val="19"/>
+    <w:qFormat/>
+    <w:uiPriority w:val="0"/>
     <w:tblPr>
-      <w:tblStyleRowBandSize w:val="1"/>
-      <w:tblStyleColBandSize w:val="1"/>
       <w:tblCellMar>
         <w:top w:w="0" w:type="dxa"/>
         <w:left w:w="70" w:type="dxa"/>
@@ -3646,11 +3414,12 @@
       </w:tblCellMar>
     </w:tblPr>
   </w:style>
-  <w:style w:type="table" w:customStyle="1" w:styleId="a2">
-    <w:basedOn w:val="TableNormal2"/>
+  <w:style w:type="table" w:customStyle="1" w:styleId="28">
+    <w:name w:val="_Style 26"/>
+    <w:basedOn w:val="19"/>
+    <w:qFormat/>
+    <w:uiPriority w:val="0"/>
     <w:tblPr>
-      <w:tblStyleRowBandSize w:val="1"/>
-      <w:tblStyleColBandSize w:val="1"/>
       <w:tblCellMar>
         <w:top w:w="0" w:type="dxa"/>
         <w:left w:w="70" w:type="dxa"/>
@@ -3659,11 +3428,12 @@
       </w:tblCellMar>
     </w:tblPr>
   </w:style>
-  <w:style w:type="table" w:customStyle="1" w:styleId="a3">
-    <w:basedOn w:val="TableNormal2"/>
+  <w:style w:type="table" w:customStyle="1" w:styleId="29">
+    <w:name w:val="_Style 27"/>
+    <w:basedOn w:val="19"/>
+    <w:qFormat/>
+    <w:uiPriority w:val="0"/>
     <w:tblPr>
-      <w:tblStyleRowBandSize w:val="1"/>
-      <w:tblStyleColBandSize w:val="1"/>
       <w:tblCellMar>
         <w:top w:w="0" w:type="dxa"/>
         <w:left w:w="70" w:type="dxa"/>
@@ -3672,11 +3442,11 @@
       </w:tblCellMar>
     </w:tblPr>
   </w:style>
-  <w:style w:type="table" w:customStyle="1" w:styleId="a4">
-    <w:basedOn w:val="TableNormal2"/>
+  <w:style w:type="table" w:customStyle="1" w:styleId="30">
+    <w:name w:val="_Style 28"/>
+    <w:basedOn w:val="19"/>
+    <w:uiPriority w:val="0"/>
     <w:tblPr>
-      <w:tblStyleRowBandSize w:val="1"/>
-      <w:tblStyleColBandSize w:val="1"/>
       <w:tblCellMar>
         <w:top w:w="0" w:type="dxa"/>
         <w:left w:w="108" w:type="dxa"/>
@@ -3685,11 +3455,11 @@
       </w:tblCellMar>
     </w:tblPr>
   </w:style>
-  <w:style w:type="table" w:customStyle="1" w:styleId="a5">
-    <w:basedOn w:val="TableNormal2"/>
+  <w:style w:type="table" w:customStyle="1" w:styleId="31">
+    <w:name w:val="_Style 29"/>
+    <w:basedOn w:val="19"/>
+    <w:uiPriority w:val="0"/>
     <w:tblPr>
-      <w:tblStyleRowBandSize w:val="1"/>
-      <w:tblStyleColBandSize w:val="1"/>
       <w:tblCellMar>
         <w:top w:w="0" w:type="dxa"/>
         <w:left w:w="70" w:type="dxa"/>
@@ -3698,11 +3468,11 @@
       </w:tblCellMar>
     </w:tblPr>
   </w:style>
-  <w:style w:type="table" w:customStyle="1" w:styleId="a6">
-    <w:basedOn w:val="TableNormal2"/>
+  <w:style w:type="table" w:customStyle="1" w:styleId="32">
+    <w:name w:val="_Style 30"/>
+    <w:basedOn w:val="19"/>
+    <w:uiPriority w:val="0"/>
     <w:tblPr>
-      <w:tblStyleRowBandSize w:val="1"/>
-      <w:tblStyleColBandSize w:val="1"/>
       <w:tblCellMar>
         <w:top w:w="0" w:type="dxa"/>
         <w:left w:w="70" w:type="dxa"/>
@@ -3711,11 +3481,11 @@
       </w:tblCellMar>
     </w:tblPr>
   </w:style>
-  <w:style w:type="table" w:customStyle="1" w:styleId="a7">
-    <w:basedOn w:val="TableNormal2"/>
+  <w:style w:type="table" w:customStyle="1" w:styleId="33">
+    <w:name w:val="_Style 31"/>
+    <w:basedOn w:val="19"/>
+    <w:uiPriority w:val="0"/>
     <w:tblPr>
-      <w:tblStyleRowBandSize w:val="1"/>
-      <w:tblStyleColBandSize w:val="1"/>
       <w:tblCellMar>
         <w:top w:w="0" w:type="dxa"/>
         <w:left w:w="70" w:type="dxa"/>
@@ -3724,11 +3494,11 @@
       </w:tblCellMar>
     </w:tblPr>
   </w:style>
-  <w:style w:type="table" w:customStyle="1" w:styleId="a8">
-    <w:basedOn w:val="TableNormal2"/>
+  <w:style w:type="table" w:customStyle="1" w:styleId="34">
+    <w:name w:val="_Style 32"/>
+    <w:basedOn w:val="19"/>
+    <w:uiPriority w:val="0"/>
     <w:tblPr>
-      <w:tblStyleRowBandSize w:val="1"/>
-      <w:tblStyleColBandSize w:val="1"/>
       <w:tblCellMar>
         <w:top w:w="0" w:type="dxa"/>
         <w:left w:w="108" w:type="dxa"/>
@@ -3737,11 +3507,11 @@
       </w:tblCellMar>
     </w:tblPr>
   </w:style>
-  <w:style w:type="table" w:customStyle="1" w:styleId="a9">
-    <w:basedOn w:val="TableNormal2"/>
+  <w:style w:type="table" w:customStyle="1" w:styleId="35">
+    <w:name w:val="_Style 33"/>
+    <w:basedOn w:val="19"/>
+    <w:uiPriority w:val="0"/>
     <w:tblPr>
-      <w:tblStyleRowBandSize w:val="1"/>
-      <w:tblStyleColBandSize w:val="1"/>
       <w:tblCellMar>
         <w:top w:w="0" w:type="dxa"/>
         <w:left w:w="70" w:type="dxa"/>
@@ -3750,11 +3520,11 @@
       </w:tblCellMar>
     </w:tblPr>
   </w:style>
-  <w:style w:type="table" w:customStyle="1" w:styleId="aa">
-    <w:basedOn w:val="TableNormal2"/>
+  <w:style w:type="table" w:customStyle="1" w:styleId="36">
+    <w:name w:val="_Style 34"/>
+    <w:basedOn w:val="19"/>
+    <w:uiPriority w:val="0"/>
     <w:tblPr>
-      <w:tblStyleRowBandSize w:val="1"/>
-      <w:tblStyleColBandSize w:val="1"/>
       <w:tblCellMar>
         <w:top w:w="0" w:type="dxa"/>
         <w:left w:w="70" w:type="dxa"/>
@@ -3763,11 +3533,11 @@
       </w:tblCellMar>
     </w:tblPr>
   </w:style>
-  <w:style w:type="table" w:customStyle="1" w:styleId="ab">
-    <w:basedOn w:val="TableNormal2"/>
+  <w:style w:type="table" w:customStyle="1" w:styleId="37">
+    <w:name w:val="_Style 35"/>
+    <w:basedOn w:val="19"/>
+    <w:uiPriority w:val="0"/>
     <w:tblPr>
-      <w:tblStyleRowBandSize w:val="1"/>
-      <w:tblStyleColBandSize w:val="1"/>
       <w:tblCellMar>
         <w:top w:w="0" w:type="dxa"/>
         <w:left w:w="70" w:type="dxa"/>
@@ -3776,11 +3546,11 @@
       </w:tblCellMar>
     </w:tblPr>
   </w:style>
-  <w:style w:type="table" w:customStyle="1" w:styleId="ac">
-    <w:basedOn w:val="TableNormal2"/>
+  <w:style w:type="table" w:customStyle="1" w:styleId="38">
+    <w:name w:val="_Style 36"/>
+    <w:basedOn w:val="19"/>
+    <w:uiPriority w:val="0"/>
     <w:tblPr>
-      <w:tblStyleRowBandSize w:val="1"/>
-      <w:tblStyleColBandSize w:val="1"/>
       <w:tblCellMar>
         <w:top w:w="0" w:type="dxa"/>
         <w:left w:w="108" w:type="dxa"/>
@@ -3789,30 +3559,11 @@
       </w:tblCellMar>
     </w:tblPr>
   </w:style>
-  <w:style w:type="paragraph" w:styleId="Subttulo">
-    <w:name w:val="Subtitle"/>
-    <w:basedOn w:val="Normal"/>
-    <w:next w:val="Normal"/>
-    <w:uiPriority w:val="11"/>
-    <w:qFormat/>
-    <w:pPr>
-      <w:keepNext/>
-      <w:keepLines/>
-      <w:spacing w:before="360" w:after="80"/>
-    </w:pPr>
-    <w:rPr>
-      <w:rFonts w:ascii="Georgia" w:eastAsia="Georgia" w:hAnsi="Georgia" w:cs="Georgia"/>
-      <w:i/>
-      <w:color w:val="666666"/>
-      <w:sz w:val="48"/>
-      <w:szCs w:val="48"/>
-    </w:rPr>
-  </w:style>
-  <w:style w:type="table" w:customStyle="1" w:styleId="ad">
-    <w:basedOn w:val="TableNormal2"/>
+  <w:style w:type="table" w:customStyle="1" w:styleId="39">
+    <w:name w:val="_Style 38"/>
+    <w:basedOn w:val="19"/>
+    <w:uiPriority w:val="0"/>
     <w:tblPr>
-      <w:tblStyleRowBandSize w:val="1"/>
-      <w:tblStyleColBandSize w:val="1"/>
       <w:tblCellMar>
         <w:top w:w="0" w:type="dxa"/>
         <w:left w:w="70" w:type="dxa"/>
@@ -3821,11 +3572,11 @@
       </w:tblCellMar>
     </w:tblPr>
   </w:style>
-  <w:style w:type="table" w:customStyle="1" w:styleId="ae">
-    <w:basedOn w:val="TableNormal2"/>
+  <w:style w:type="table" w:customStyle="1" w:styleId="40">
+    <w:name w:val="_Style 39"/>
+    <w:basedOn w:val="19"/>
+    <w:uiPriority w:val="0"/>
     <w:tblPr>
-      <w:tblStyleRowBandSize w:val="1"/>
-      <w:tblStyleColBandSize w:val="1"/>
       <w:tblCellMar>
         <w:top w:w="0" w:type="dxa"/>
         <w:left w:w="70" w:type="dxa"/>
@@ -3834,11 +3585,11 @@
       </w:tblCellMar>
     </w:tblPr>
   </w:style>
-  <w:style w:type="table" w:customStyle="1" w:styleId="af">
-    <w:basedOn w:val="TableNormal2"/>
+  <w:style w:type="table" w:customStyle="1" w:styleId="41">
+    <w:name w:val="_Style 40"/>
+    <w:basedOn w:val="19"/>
+    <w:uiPriority w:val="0"/>
     <w:tblPr>
-      <w:tblStyleRowBandSize w:val="1"/>
-      <w:tblStyleColBandSize w:val="1"/>
       <w:tblCellMar>
         <w:top w:w="0" w:type="dxa"/>
         <w:left w:w="70" w:type="dxa"/>
@@ -3847,11 +3598,11 @@
       </w:tblCellMar>
     </w:tblPr>
   </w:style>
-  <w:style w:type="table" w:customStyle="1" w:styleId="af0">
-    <w:basedOn w:val="TableNormal2"/>
+  <w:style w:type="table" w:customStyle="1" w:styleId="42">
+    <w:name w:val="_Style 41"/>
+    <w:basedOn w:val="19"/>
+    <w:uiPriority w:val="0"/>
     <w:tblPr>
-      <w:tblStyleRowBandSize w:val="1"/>
-      <w:tblStyleColBandSize w:val="1"/>
       <w:tblCellMar>
         <w:top w:w="0" w:type="dxa"/>
         <w:left w:w="70" w:type="dxa"/>
@@ -3860,11 +3611,11 @@
       </w:tblCellMar>
     </w:tblPr>
   </w:style>
-  <w:style w:type="table" w:customStyle="1" w:styleId="af1">
-    <w:basedOn w:val="TableNormal2"/>
+  <w:style w:type="table" w:customStyle="1" w:styleId="43">
+    <w:name w:val="_Style 42"/>
+    <w:basedOn w:val="19"/>
+    <w:uiPriority w:val="0"/>
     <w:tblPr>
-      <w:tblStyleRowBandSize w:val="1"/>
-      <w:tblStyleColBandSize w:val="1"/>
       <w:tblCellMar>
         <w:top w:w="0" w:type="dxa"/>
         <w:left w:w="108" w:type="dxa"/>
@@ -3873,73 +3624,34 @@
       </w:tblCellMar>
     </w:tblPr>
   </w:style>
-  <w:style w:type="paragraph" w:styleId="Textodecomentrio">
-    <w:name w:val="annotation text"/>
-    <w:basedOn w:val="Normal"/>
-    <w:link w:val="TextodecomentrioChar"/>
+  <w:style w:type="character" w:customStyle="1" w:styleId="44">
+    <w:name w:val="Texto de comentário Char"/>
+    <w:basedOn w:val="8"/>
+    <w:link w:val="13"/>
+    <w:semiHidden/>
     <w:uiPriority w:val="99"/>
-    <w:semiHidden/>
-    <w:unhideWhenUsed/>
     <w:rPr>
       <w:sz w:val="20"/>
       <w:szCs w:val="20"/>
     </w:rPr>
   </w:style>
-  <w:style w:type="character" w:customStyle="1" w:styleId="TextodecomentrioChar">
-    <w:name w:val="Texto de comentário Char"/>
-    <w:basedOn w:val="Fontepargpadro"/>
-    <w:link w:val="Textodecomentrio"/>
+  <w:style w:type="character" w:customStyle="1" w:styleId="45">
+    <w:name w:val="Texto de balão Char"/>
+    <w:basedOn w:val="8"/>
+    <w:link w:val="16"/>
+    <w:semiHidden/>
     <w:uiPriority w:val="99"/>
-    <w:semiHidden/>
-    <w:rPr>
-      <w:sz w:val="20"/>
-      <w:szCs w:val="20"/>
-    </w:rPr>
-  </w:style>
-  <w:style w:type="character" w:styleId="Refdecomentrio">
-    <w:name w:val="annotation reference"/>
-    <w:basedOn w:val="Fontepargpadro"/>
-    <w:uiPriority w:val="99"/>
-    <w:semiHidden/>
-    <w:unhideWhenUsed/>
-    <w:rPr>
-      <w:sz w:val="16"/>
-      <w:szCs w:val="16"/>
-    </w:rPr>
-  </w:style>
-  <w:style w:type="paragraph" w:styleId="Textodebalo">
-    <w:name w:val="Balloon Text"/>
-    <w:basedOn w:val="Normal"/>
-    <w:link w:val="TextodebaloChar"/>
-    <w:uiPriority w:val="99"/>
-    <w:semiHidden/>
-    <w:unhideWhenUsed/>
-    <w:rsid w:val="00BD69E0"/>
     <w:rPr>
       <w:rFonts w:ascii="Segoe UI" w:hAnsi="Segoe UI" w:cs="Segoe UI"/>
       <w:sz w:val="18"/>
       <w:szCs w:val="18"/>
     </w:rPr>
   </w:style>
-  <w:style w:type="character" w:customStyle="1" w:styleId="TextodebaloChar">
-    <w:name w:val="Texto de balão Char"/>
-    <w:basedOn w:val="Fontepargpadro"/>
-    <w:link w:val="Textodebalo"/>
-    <w:uiPriority w:val="99"/>
-    <w:semiHidden/>
-    <w:rsid w:val="00BD69E0"/>
-    <w:rPr>
-      <w:rFonts w:ascii="Segoe UI" w:hAnsi="Segoe UI" w:cs="Segoe UI"/>
-      <w:sz w:val="18"/>
-      <w:szCs w:val="18"/>
-    </w:rPr>
-  </w:style>
-  <w:style w:type="paragraph" w:styleId="PargrafodaLista">
+  <w:style w:type="paragraph" w:styleId="46">
     <w:name w:val="List Paragraph"/>
-    <w:basedOn w:val="Normal"/>
+    <w:basedOn w:val="1"/>
+    <w:qFormat/>
     <w:uiPriority w:val="34"/>
-    <w:qFormat/>
-    <w:rsid w:val="00B22856"/>
     <w:pPr>
       <w:ind w:left="720"/>
       <w:contextualSpacing/>
@@ -4264,7 +3976,6 @@
       </a:style>
     </a:lnDef>
   </a:objectDefaults>
-  <a:extraClrSchemeLst/>
 </a:theme>
 </file>
 
@@ -4276,9 +3987,6 @@
 
 <file path=customXml/itemProps1.xml><?xml version="1.0" encoding="utf-8"?>
 <ds:datastoreItem xmlns:ds="http://schemas.openxmlformats.org/officeDocument/2006/customXml" ds:itemID="{11111111-1234-1234-1234-123412341234}">
-  <ds:schemaRefs>
-    <ds:schemaRef ds:uri="http://customooxmlschemas.google.com/"/>
-    <ds:schemaRef ds:uri="http://schemas.openxmlformats.org/officeDocument/2006/relationships"/>
-  </ds:schemaRefs>
+  <ds:schemaRefs/>
 </ds:datastoreItem>
 </file>
</xml_diff>